<commit_message>
Regenerar plantilla preservando el XML original (corrige aviso de Word)
La plantilla anterior se reconstruyó con un parser que alteró la
cabecera XML (perdió standalone, reordenó namespaces) y el reempaque
añadió entradas de directorio, lo que hacía que Word mostrara
"contenido no legible". Ahora se modifica únicamente el texto de los
campos y se reempaqueta copiando el original tal cual, dejando el
documento idéntico salvo los marcadores {campo}.

Co-Authored-By: Claude Opus 4.8 <noreply@anthropic.com>
Claude-Session: https://claude.ai/code/session_01QLqsfCkWEe2r7zrv7hLiXy
</commit_message>
<xml_diff>
--- a/plantilla_contrato.docx
+++ b/plantilla_contrato.docx
@@ -1,6 +1,6 @@
 
 <file path=word/document.xml><?xml version="1.0" encoding="utf-8"?>
-<w:document xmlns:mc="http://schemas.openxmlformats.org/markup-compatibility/2006" xmlns:r="http://schemas.openxmlformats.org/officeDocument/2006/relationships" xmlns:w="http://schemas.openxmlformats.org/wordprocessingml/2006/main" xmlns:w14="http://schemas.microsoft.com/office/word/2010/wordml" mc:Ignorable="w14 w15 w16se w16cid w16 w16cex w16sdtdh w16sdtfl w16du wp14">
+<w:document xmlns:wpc="http://schemas.microsoft.com/office/word/2010/wordprocessingCanvas" xmlns:cx="http://schemas.microsoft.com/office/drawing/2014/chartex" xmlns:cx1="http://schemas.microsoft.com/office/drawing/2015/9/8/chartex" xmlns:cx2="http://schemas.microsoft.com/office/drawing/2015/10/21/chartex" xmlns:cx3="http://schemas.microsoft.com/office/drawing/2016/5/9/chartex" xmlns:cx4="http://schemas.microsoft.com/office/drawing/2016/5/10/chartex" xmlns:cx5="http://schemas.microsoft.com/office/drawing/2016/5/11/chartex" xmlns:cx6="http://schemas.microsoft.com/office/drawing/2016/5/12/chartex" xmlns:cx7="http://schemas.microsoft.com/office/drawing/2016/5/13/chartex" xmlns:cx8="http://schemas.microsoft.com/office/drawing/2016/5/14/chartex" xmlns:mc="http://schemas.openxmlformats.org/markup-compatibility/2006" xmlns:aink="http://schemas.microsoft.com/office/drawing/2016/ink" xmlns:am3d="http://schemas.microsoft.com/office/drawing/2017/model3d" xmlns:o="urn:schemas-microsoft-com:office:office" xmlns:oel="http://schemas.microsoft.com/office/2019/extlst" xmlns:r="http://schemas.openxmlformats.org/officeDocument/2006/relationships" xmlns:m="http://schemas.openxmlformats.org/officeDocument/2006/math" xmlns:v="urn:schemas-microsoft-com:vml" xmlns:wp14="http://schemas.microsoft.com/office/word/2010/wordprocessingDrawing" xmlns:wp="http://schemas.openxmlformats.org/drawingml/2006/wordprocessingDrawing" xmlns:w10="urn:schemas-microsoft-com:office:word" xmlns:w="http://schemas.openxmlformats.org/wordprocessingml/2006/main" xmlns:w14="http://schemas.microsoft.com/office/word/2010/wordml" xmlns:w15="http://schemas.microsoft.com/office/word/2012/wordml" xmlns:w16cex="http://schemas.microsoft.com/office/word/2018/wordml/cex" xmlns:w16cid="http://schemas.microsoft.com/office/word/2016/wordml/cid" xmlns:w16="http://schemas.microsoft.com/office/word/2018/wordml" xmlns:w16du="http://schemas.microsoft.com/office/word/2023/wordml/word16du" xmlns:w16sdtdh="http://schemas.microsoft.com/office/word/2020/wordml/sdtdatahash" xmlns:w16sdtfl="http://schemas.microsoft.com/office/word/2024/wordml/sdtformatlock" xmlns:w16se="http://schemas.microsoft.com/office/word/2015/wordml/symex" xmlns:wpg="http://schemas.microsoft.com/office/word/2010/wordprocessingGroup" xmlns:wpi="http://schemas.microsoft.com/office/word/2010/wordprocessingInk" xmlns:wne="http://schemas.microsoft.com/office/word/2006/wordml" xmlns:wps="http://schemas.microsoft.com/office/word/2010/wordprocessingShape" mc:Ignorable="w14 w15 w16se w16cid w16 w16cex w16sdtdh w16sdtfl w16du wp14">
   <w:body>
     <w:tbl>
       <w:tblPr>
@@ -62,7 +62,6 @@
               <w:rPr>
                 <w:rFonts w:ascii="Arial" w:eastAsia="Times New Roman" w:hAnsi="Arial" w:cs="Arial"/>
                 <w:color w:val="000000" w:themeColor="text1"/>
-                <w:highlight w:val="red"/>
               </w:rPr>
             </w:pPr>
             <w:r>
@@ -256,7 +255,6 @@
                 <w:color w:val="000000"/>
                 <w:sz w:val="22"/>
                 <w:szCs w:val="22"/>
-                <w:highlight w:val="red"/>
               </w:rPr>
             </w:pPr>
             <w:r>
@@ -335,7 +333,6 @@
                 <w:color w:val="000000"/>
                 <w:sz w:val="22"/>
                 <w:szCs w:val="22"/>
-                <w:highlight w:val="red"/>
               </w:rPr>
             </w:pPr>
             <w:r>
@@ -397,7 +394,6 @@
               <w:rPr>
                 <w:rFonts w:ascii="Arial" w:hAnsi="Arial" w:cs="Arial"/>
                 <w:color w:val="000000" w:themeColor="text1"/>
-                <w:highlight w:val="red"/>
               </w:rPr>
             </w:pPr>
             <w:r>
@@ -515,7 +511,6 @@
               <w:textAlignment w:val="baseline"/>
               <w:rPr>
                 <w:rFonts w:ascii="Arial" w:eastAsia="Arial" w:hAnsi="Arial" w:cs="Arial"/>
-                <w:highlight w:val="red"/>
               </w:rPr>
             </w:pPr>
             <w:r>
@@ -574,7 +569,6 @@
               <w:rPr>
                 <w:rFonts w:ascii="Arial" w:hAnsi="Arial" w:cs="Arial"/>
                 <w:color w:val="000000"/>
-                <w:highlight w:val="red"/>
               </w:rPr>
             </w:pPr>
             <w:r>
@@ -1337,7 +1331,6 @@
           <w:color w:val="0D0D0D" w:themeColor="text1" w:themeTint="F2"/>
           <w:sz w:val="22"/>
           <w:szCs w:val="22"/>
-          <w:highlight w:val="red"/>
         </w:rPr>
       </w:pPr>
       <w:r>

</xml_diff>

<commit_message>
Actualizar plantilla oficial: nuevos responsables y quitar campos de resolución
- Reemplaza plantilla_contrato.docx por la versión nueva e inserta en la
  tabla de firmas los marcadores {proyecto}, {revision_juridica},
  {revision_financiera} y {aprobo} (columna NOMBRE).
- Formulario: nueva sección "Responsables del documento" (Proyectó, Revisión
  jurídica, Revisión financiera, Aprobó) y se eliminan los campos Resolución
  N° y Fecha de la resolución (no usados en la plantilla). Se conservan CDP y
  CRP porque alimentan {presupuesto_texto} (cláusula SEXTA).
- datosPlantilla: mapea los 4 nuevos campos y, además, supervisor_nombre y
  supervisor_cargo, que tenían marcador en la plantilla pero no se rellenaban.
- Verificado con render real (docxtemplater): los 19 marcadores se completan
  y ninguno queda sin resolver.

Co-Authored-By: Claude Opus 4.8 <noreply@anthropic.com>
Claude-Session: https://claude.ai/code/session_01RbqmWfif1ErCa4oEtLm5Ho
</commit_message>
<xml_diff>
--- a/plantilla_contrato.docx
+++ b/plantilla_contrato.docx
@@ -69,35 +69,7 @@
                 <w:rFonts w:ascii="Arial" w:eastAsia="Times New Roman" w:hAnsi="Arial" w:cs="Arial"/>
                 <w:color w:val="000000" w:themeColor="text1"/>
               </w:rPr>
-              <w:t xml:space="preserve">{numero_contrato}</w:t>
-            </w:r>
-            <w:r>
-              <w:rPr>
-                <w:rFonts w:ascii="Arial" w:eastAsia="Times New Roman" w:hAnsi="Arial" w:cs="Arial"/>
-                <w:color w:val="000000" w:themeColor="text1"/>
-              </w:rPr>
-              <w:t/>
-            </w:r>
-            <w:r>
-              <w:rPr>
-                <w:rFonts w:ascii="Arial" w:eastAsia="Times New Roman" w:hAnsi="Arial" w:cs="Arial"/>
-                <w:color w:val="000000" w:themeColor="text1"/>
-              </w:rPr>
-              <w:t/>
-            </w:r>
-            <w:r>
-              <w:rPr>
-                <w:rFonts w:ascii="Arial" w:eastAsia="Times New Roman" w:hAnsi="Arial" w:cs="Arial"/>
-                <w:color w:val="000000" w:themeColor="text1"/>
-              </w:rPr>
-              <w:t/>
-            </w:r>
-            <w:r>
-              <w:rPr>
-                <w:rFonts w:ascii="Arial" w:eastAsia="Times New Roman" w:hAnsi="Arial" w:cs="Arial"/>
-                <w:color w:val="000000" w:themeColor="text1"/>
-              </w:rPr>
-              <w:t/>
+              <w:t>{numero_contrato}</w:t>
             </w:r>
           </w:p>
         </w:tc>
@@ -266,18 +238,7 @@
                 <w:sz w:val="22"/>
                 <w:szCs w:val="22"/>
               </w:rPr>
-              <w:t xml:space="preserve">{nombre_contratista}</w:t>
-            </w:r>
-            <w:r>
-              <w:rPr>
-                <w:rFonts w:cs="Arial"/>
-                <w:b/>
-                <w:bCs/>
-                <w:color w:val="000000" w:themeColor="text1"/>
-                <w:sz w:val="22"/>
-                <w:szCs w:val="22"/>
-              </w:rPr>
-              <w:t xml:space="preserve"/>
+              <w:t>{nombre_contratista}</w:t>
             </w:r>
           </w:p>
         </w:tc>
@@ -342,7 +303,7 @@
                 <w:sz w:val="22"/>
                 <w:szCs w:val="22"/>
               </w:rPr>
-              <w:t xml:space="preserve">{cedula_contratista}</w:t>
+              <w:t>{cedula_contratista}</w:t>
             </w:r>
           </w:p>
         </w:tc>
@@ -401,7 +362,7 @@
                 <w:rFonts w:ascii="Arial" w:hAnsi="Arial" w:cs="Arial"/>
                 <w:color w:val="000000" w:themeColor="text1"/>
               </w:rPr>
-              <w:t xml:space="preserve">{objeto_contrato}</w:t>
+              <w:t>{objeto_contrato}</w:t>
             </w:r>
           </w:p>
         </w:tc>
@@ -519,7 +480,7 @@
                 <w:color w:val="000000" w:themeColor="text1"/>
                 <w:lang w:val="es-CO"/>
               </w:rPr>
-              <w:t xml:space="preserve">{valor_total_texto}</w:t>
+              <w:t>{valor_total_texto}</w:t>
             </w:r>
           </w:p>
         </w:tc>
@@ -578,52 +539,7 @@
                 <w:color w:val="000000"/>
                 <w:shd w:val="clear" w:color="auto" w:fill="FFFFFF"/>
               </w:rPr>
-              <w:t xml:space="preserve">{plazo_texto}</w:t>
-            </w:r>
-            <w:r>
-              <w:rPr>
-                <w:rStyle w:val="normaltextrun"/>
-                <w:rFonts w:ascii="Arial" w:hAnsi="Arial" w:cs="Arial"/>
-                <w:color w:val="000000"/>
-                <w:shd w:val="clear" w:color="auto" w:fill="FFFFFF"/>
-              </w:rPr>
-              <w:t/>
-            </w:r>
-            <w:r>
-              <w:rPr>
-                <w:rStyle w:val="normaltextrun"/>
-                <w:rFonts w:ascii="Arial" w:hAnsi="Arial" w:cs="Arial"/>
-                <w:color w:val="000000"/>
-                <w:shd w:val="clear" w:color="auto" w:fill="FFFFFF"/>
-              </w:rPr>
-              <w:t xml:space="preserve"/>
-            </w:r>
-            <w:r>
-              <w:rPr>
-                <w:rStyle w:val="normaltextrun"/>
-                <w:rFonts w:ascii="Arial" w:hAnsi="Arial" w:cs="Arial"/>
-                <w:color w:val="000000"/>
-                <w:shd w:val="clear" w:color="auto" w:fill="FFFFFF"/>
-              </w:rPr>
-              <w:t xml:space="preserve"/>
-            </w:r>
-            <w:r>
-              <w:rPr>
-                <w:rStyle w:val="normaltextrun"/>
-                <w:rFonts w:ascii="Arial" w:hAnsi="Arial" w:cs="Arial"/>
-                <w:color w:val="000000"/>
-                <w:shd w:val="clear" w:color="auto" w:fill="FFFFFF"/>
-              </w:rPr>
-              <w:t/>
-            </w:r>
-            <w:r>
-              <w:rPr>
-                <w:rStyle w:val="normaltextrun"/>
-                <w:rFonts w:ascii="Arial" w:hAnsi="Arial" w:cs="Arial"/>
-                <w:color w:val="000000"/>
-                <w:shd w:val="clear" w:color="auto" w:fill="FFFFFF"/>
-              </w:rPr>
-              <w:t/>
+              <w:t>{plazo_texto}</w:t>
             </w:r>
           </w:p>
         </w:tc>
@@ -645,6 +561,7 @@
     </w:p>
     <w:p>
       <w:pPr>
+        <w:ind w:right="-425"/>
         <w:jc w:val="both"/>
         <w:rPr>
           <w:rFonts w:ascii="Arial" w:eastAsia="Arial" w:hAnsi="Arial" w:cs="Arial"/>
@@ -1005,7 +922,7 @@
           <w:bCs/>
           <w:color w:val="000000"/>
         </w:rPr>
-        <w:t xml:space="preserve">{nombre_contratista}</w:t>
+        <w:t>{nombre_contratista}</w:t>
       </w:r>
       <w:r>
         <w:rPr>
@@ -1065,7 +982,7 @@
           <w:rFonts w:ascii="Arial" w:eastAsia="Arial" w:hAnsi="Arial" w:cs="Arial"/>
           <w:color w:val="000000" w:themeColor="text1"/>
         </w:rPr>
-        <w:t xml:space="preserve">{cedula_contratista}</w:t>
+        <w:t>{cedula_contratista}</w:t>
       </w:r>
       <w:r>
         <w:rPr>
@@ -1177,7 +1094,7 @@
           <w:rFonts w:ascii="Arial" w:hAnsi="Arial" w:cs="Arial"/>
           <w:color w:val="000000" w:themeColor="text1"/>
         </w:rPr>
-        <w:t xml:space="preserve">{objeto_contrato}</w:t>
+        <w:t>{objeto_contrato}</w:t>
       </w:r>
     </w:p>
     <w:p>
@@ -1230,44 +1147,7 @@
           <w:sz w:val="22"/>
           <w:szCs w:val="22"/>
         </w:rPr>
-        <w:t xml:space="preserve">{alcance}</w:t>
-      </w:r>
-      <w:r>
-        <w:rPr>
-          <w:rFonts w:eastAsia="Arial" w:cs="Arial"/>
-          <w:color w:val="000000" w:themeColor="text1"/>
-          <w:sz w:val="22"/>
-          <w:szCs w:val="22"/>
-        </w:rPr>
-        <w:t/>
-      </w:r>
-      <w:r>
-        <w:rPr>
-          <w:rFonts w:eastAsiaTheme="minorEastAsia" w:cs="Arial"/>
-          <w:color w:val="000000" w:themeColor="text1"/>
-          <w:sz w:val="22"/>
-          <w:szCs w:val="22"/>
-          <w:lang w:eastAsia="es-CO"/>
-        </w:rPr>
-        <w:t/>
-      </w:r>
-      <w:r>
-        <w:rPr>
-          <w:rFonts w:eastAsiaTheme="majorEastAsia" w:cs="Arial"/>
-          <w:sz w:val="22"/>
-          <w:szCs w:val="22"/>
-        </w:rPr>
-        <w:t xml:space="preserve"/>
-      </w:r>
-      <w:r>
-        <w:rPr>
-          <w:rFonts w:cs="Arial"/>
-          <w:color w:val="000000" w:themeColor="text1"/>
-          <w:sz w:val="22"/>
-          <w:szCs w:val="22"/>
-          <w:lang w:val="es-ES" w:eastAsia="es-CO"/>
-        </w:rPr>
-        <w:t/>
+        <w:t>{alcance}</w:t>
       </w:r>
     </w:p>
     <w:p>
@@ -1341,7 +1221,7 @@
           <w:sz w:val="22"/>
           <w:szCs w:val="22"/>
         </w:rPr>
-        <w:t xml:space="preserve">{actividades_principales}</w:t>
+        <w:t>{actividades_principales}</w:t>
       </w:r>
     </w:p>
     <w:p>
@@ -1413,7 +1293,7 @@
           <w:szCs w:val="22"/>
           <w:shd w:val="clear" w:color="auto" w:fill="FFFFFF"/>
         </w:rPr>
-        <w:t xml:space="preserve">{fecha_terminacion_texto}</w:t>
+        <w:t>{fecha_terminacion_texto}</w:t>
       </w:r>
       <w:r>
         <w:rPr>
@@ -1424,61 +1304,6 @@
           <w:szCs w:val="22"/>
           <w:shd w:val="clear" w:color="auto" w:fill="FFFFFF"/>
         </w:rPr>
-        <w:t/>
-      </w:r>
-      <w:r>
-        <w:rPr>
-          <w:rStyle w:val="normaltextrun"/>
-          <w:rFonts w:cs="Arial"/>
-          <w:color w:val="000000"/>
-          <w:sz w:val="22"/>
-          <w:szCs w:val="22"/>
-          <w:shd w:val="clear" w:color="auto" w:fill="FFFFFF"/>
-        </w:rPr>
-        <w:t xml:space="preserve"/>
-      </w:r>
-      <w:r>
-        <w:rPr>
-          <w:rStyle w:val="normaltextrun"/>
-          <w:rFonts w:cs="Arial"/>
-          <w:color w:val="000000"/>
-          <w:sz w:val="22"/>
-          <w:szCs w:val="22"/>
-          <w:shd w:val="clear" w:color="auto" w:fill="FFFFFF"/>
-        </w:rPr>
-        <w:t xml:space="preserve"/>
-      </w:r>
-      <w:r>
-        <w:rPr>
-          <w:rStyle w:val="normaltextrun"/>
-          <w:rFonts w:cs="Arial"/>
-          <w:color w:val="000000"/>
-          <w:sz w:val="22"/>
-          <w:szCs w:val="22"/>
-          <w:shd w:val="clear" w:color="auto" w:fill="FFFFFF"/>
-        </w:rPr>
-        <w:t/>
-      </w:r>
-      <w:r>
-        <w:rPr>
-          <w:rStyle w:val="normaltextrun"/>
-          <w:rFonts w:cs="Arial"/>
-          <w:color w:val="000000"/>
-          <w:sz w:val="22"/>
-          <w:szCs w:val="22"/>
-          <w:shd w:val="clear" w:color="auto" w:fill="FFFFFF"/>
-        </w:rPr>
-        <w:t/>
-      </w:r>
-      <w:r>
-        <w:rPr>
-          <w:rStyle w:val="normaltextrun"/>
-          <w:rFonts w:cs="Arial"/>
-          <w:color w:val="000000"/>
-          <w:sz w:val="22"/>
-          <w:szCs w:val="22"/>
-          <w:shd w:val="clear" w:color="auto" w:fill="FFFFFF"/>
-        </w:rPr>
         <w:t>.</w:t>
       </w:r>
     </w:p>
@@ -1569,6 +1394,7 @@
     </w:p>
     <w:p>
       <w:pPr>
+        <w:ind w:right="-425"/>
         <w:jc w:val="both"/>
         <w:rPr>
           <w:rFonts w:ascii="Arial" w:eastAsia="Arial" w:hAnsi="Arial" w:cs="Arial"/>
@@ -1610,7 +1436,7 @@
           <w:color w:val="000000" w:themeColor="text1"/>
           <w:lang w:val="es-CO"/>
         </w:rPr>
-        <w:t xml:space="preserve">{valor_total_texto}</w:t>
+        <w:t>{valor_total_texto}</w:t>
       </w:r>
     </w:p>
     <w:p>
@@ -1640,6 +1466,7 @@
           <w:color w:val="0D0D0D" w:themeColor="text1" w:themeTint="F2"/>
           <w:lang w:val="es-CO" w:eastAsia="es-ES"/>
         </w:rPr>
+        <w:lastRenderedPageBreak/>
         <w:t xml:space="preserve">La EMPRESA DE PARQUES Y EVENTOS DE ANTIOQUIA – ACTIVA, pagará al contratista los honorarios mediante  pagos mensuales, proporcionales a los días de servicio prestados con corte al 30 de cada mes, por valor de </w:t>
       </w:r>
       <w:r>
@@ -1648,7 +1475,7 @@
           <w:color w:val="0D0D0D" w:themeColor="text1" w:themeTint="F2"/>
           <w:lang w:val="es-CO" w:eastAsia="es-ES"/>
         </w:rPr>
-        <w:t xml:space="preserve">{valor_mensual_texto}</w:t>
+        <w:t>{valor_mensual_texto}</w:t>
       </w:r>
       <w:r>
         <w:rPr>
@@ -1656,7 +1483,7 @@
           <w:color w:val="0D0D0D" w:themeColor="text1" w:themeTint="F2"/>
           <w:lang w:val="es-CO" w:eastAsia="es-ES"/>
         </w:rPr>
-        <w:t xml:space="preserve"/>
+        <w:t xml:space="preserve"> </w:t>
       </w:r>
       <w:r>
         <w:rPr>
@@ -1664,63 +1491,91 @@
           <w:color w:val="0D0D0D" w:themeColor="text1" w:themeTint="F2"/>
           <w:lang w:val="es-CO" w:eastAsia="es-ES"/>
         </w:rPr>
-        <w:t/>
-      </w:r>
-      <w:r>
+        <w:t xml:space="preserve">una vez el supervisor del contrato emita el respectivo recibo de satisfacción e informe de supervisión conforme a lo estipulado en los estudios previos, como también previa presentación de la cuenta de cobro, documento equivalente y/o factura según el caso; Informe mensual de ejecución de actividades y sus respectivas evidencias según el objeto del contrato. La cuenta de cobro debe ser presentada los treinta (30) de cada mes, en caso de no ser día hábil se debe presentar el día hábil inmediatamente anterior. </w:t>
+      </w:r>
+    </w:p>
+    <w:p>
+      <w:pPr>
+        <w:suppressAutoHyphens/>
+        <w:ind w:right="-425"/>
+        <w:jc w:val="both"/>
         <w:rPr>
           <w:rFonts w:ascii="Arial" w:eastAsia="Times New Roman" w:hAnsi="Arial" w:cs="Arial"/>
           <w:color w:val="0D0D0D" w:themeColor="text1" w:themeTint="F2"/>
           <w:lang w:val="es-CO" w:eastAsia="es-ES"/>
         </w:rPr>
-        <w:t/>
-      </w:r>
-      <w:r>
+      </w:pPr>
+    </w:p>
+    <w:p>
+      <w:pPr>
+        <w:suppressAutoHyphens/>
+        <w:ind w:right="-425"/>
+        <w:jc w:val="both"/>
         <w:rPr>
           <w:rFonts w:ascii="Arial" w:eastAsia="Times New Roman" w:hAnsi="Arial" w:cs="Arial"/>
           <w:color w:val="0D0D0D" w:themeColor="text1" w:themeTint="F2"/>
           <w:lang w:val="es-CO" w:eastAsia="es-ES"/>
         </w:rPr>
-        <w:t/>
-      </w:r>
+      </w:pPr>
       <w:r>
         <w:rPr>
           <w:rFonts w:ascii="Arial" w:eastAsia="Times New Roman" w:hAnsi="Arial" w:cs="Arial"/>
           <w:color w:val="0D0D0D" w:themeColor="text1" w:themeTint="F2"/>
           <w:lang w:val="es-CO" w:eastAsia="es-ES"/>
         </w:rPr>
-        <w:t/>
-      </w:r>
-      <w:r>
+        <w:t xml:space="preserve">La cuenta de cobro, documento equivalente y/o factura debe ir acompañada de la certificación de pago de aportes a los sistemas de salud, riesgos laborales, pensiones y aportes de cajas de compensación familiar, ICBF y SENA, cuando hubiere lugar a ello, según lo establecido en la Ley 789 de 2002. Además de la certificación de la cuenta bancaria donde se realizará la transferencia. </w:t>
+      </w:r>
+    </w:p>
+    <w:p>
+      <w:pPr>
+        <w:suppressAutoHyphens/>
+        <w:ind w:right="-425"/>
+        <w:jc w:val="both"/>
         <w:rPr>
           <w:rFonts w:ascii="Arial" w:eastAsia="Times New Roman" w:hAnsi="Arial" w:cs="Arial"/>
           <w:color w:val="0D0D0D" w:themeColor="text1" w:themeTint="F2"/>
           <w:lang w:val="es-CO" w:eastAsia="es-ES"/>
         </w:rPr>
-        <w:t/>
-      </w:r>
-      <w:r>
+      </w:pPr>
+    </w:p>
+    <w:p>
+      <w:pPr>
+        <w:suppressAutoHyphens/>
+        <w:ind w:right="-425"/>
+        <w:jc w:val="both"/>
         <w:rPr>
           <w:rFonts w:ascii="Arial" w:eastAsia="Times New Roman" w:hAnsi="Arial" w:cs="Arial"/>
           <w:color w:val="0D0D0D" w:themeColor="text1" w:themeTint="F2"/>
           <w:lang w:val="es-CO" w:eastAsia="es-ES"/>
         </w:rPr>
-        <w:t/>
-      </w:r>
-      <w:r>
+      </w:pPr>
+      <w:r>
+        <w:rPr>
+          <w:rFonts w:ascii="Arial" w:eastAsia="Times New Roman" w:hAnsi="Arial" w:cs="Arial"/>
+          <w:color w:val="000000" w:themeColor="text1"/>
+          <w:lang w:val="es-CO" w:eastAsia="es-ES"/>
+        </w:rPr>
+        <w:t>La EMPRESA DE PARQUES Y EVENTOS DE ANTIOQUIA – ACTIVA, dispone de cinco (5) días hábiles para cancelar de la cuenta de cobro, documento equivalente y/o factura, según el caso, después del recibido del total de la documentación por el área financiera y previa deducción de los impuestos, retenciones y descuentos a que hubiere lugar, de acuerdo con las normas y leyes vigentes. En todo caso el pago está supeditado a la disponibilidad de recursos del cliente de ACTIVA.</w:t>
+      </w:r>
+    </w:p>
+    <w:p>
+      <w:pPr>
+        <w:suppressAutoHyphens/>
+        <w:ind w:right="-425"/>
+        <w:jc w:val="both"/>
         <w:rPr>
           <w:rFonts w:ascii="Arial" w:eastAsia="Times New Roman" w:hAnsi="Arial" w:cs="Arial"/>
           <w:color w:val="0D0D0D" w:themeColor="text1" w:themeTint="F2"/>
           <w:lang w:val="es-CO" w:eastAsia="es-ES"/>
         </w:rPr>
-        <w:t xml:space="preserve"> </w:t>
-      </w:r>
+      </w:pPr>
       <w:r>
         <w:rPr>
           <w:rFonts w:ascii="Arial" w:eastAsia="Times New Roman" w:hAnsi="Arial" w:cs="Arial"/>
           <w:color w:val="0D0D0D" w:themeColor="text1" w:themeTint="F2"/>
           <w:lang w:val="es-CO" w:eastAsia="es-ES"/>
         </w:rPr>
-        <w:t xml:space="preserve">una vez el supervisor del contrato emita el respectivo recibo de satisfacción e informe de supervisión conforme a lo estipulado en los estudios previos, como también previa presentación de la cuenta de cobro, documento equivalente y/o factura según el caso; Informe mensual de ejecución de actividades y sus respectivas evidencias según el objeto del contrato. La cuenta de cobro debe ser presentada los treinta (30) de cada mes, en caso de no ser día hábil se debe presentar el día hábil inmediatamente anterior. </w:t>
+        <w:t>Así mismo, para proceder al pago, la EMPRESA DE PARQUES Y EVENTOS DE ANTIOQUIA – ACTIVA, verificará que el contratista se encuentre al día en el pago de sus obligaciones parafiscales y aquellas relacionadas con los sistemas de seguridad social integral.</w:t>
       </w:r>
     </w:p>
     <w:p>
@@ -1752,7 +1607,7 @@
           <w:color w:val="0D0D0D" w:themeColor="text1" w:themeTint="F2"/>
           <w:lang w:val="es-CO" w:eastAsia="es-ES"/>
         </w:rPr>
-        <w:t xml:space="preserve">La cuenta de cobro, documento equivalente y/o factura debe ir acompañada de la certificación de pago de aportes a los sistemas de salud, riesgos laborales, pensiones y aportes de cajas de compensación familiar, ICBF y SENA, cuando hubiere lugar a ello, según lo establecido en la Ley 789 de 2002. Además de la certificación de la cuenta bancaria donde se realizará la transferencia. </w:t>
+        <w:t>El contratista deberá aportar las certificaciones y documentación de los dependientes económicos en caso de tenerlos, para ACTIVA realizar los respectivos análisis y depuraciones fiscales en los abonos en cuenta o pagos derivados de este contrato.</w:t>
       </w:r>
     </w:p>
     <w:p>
@@ -1781,11 +1636,10 @@
       <w:r>
         <w:rPr>
           <w:rFonts w:ascii="Arial" w:eastAsia="Times New Roman" w:hAnsi="Arial" w:cs="Arial"/>
-          <w:color w:val="000000" w:themeColor="text1"/>
+          <w:color w:val="0D0D0D" w:themeColor="text1" w:themeTint="F2"/>
           <w:lang w:val="es-CO" w:eastAsia="es-ES"/>
         </w:rPr>
-        <w:lastRenderedPageBreak/>
-        <w:t>La EMPRESA DE PARQUES Y EVENTOS DE ANTIOQUIA – ACTIVA, dispone de cinco (5) días hábiles para cancelar de la cuenta de cobro, documento equivalente y/o factura, según el caso, después del recibido del total de la documentación por el área financiera y previa deducción de los impuestos, retenciones y descuentos a que hubiere lugar, de acuerdo con las normas y leyes vigentes. En todo caso el pago está supeditado a la disponibilidad de recursos del cliente de ACTIVA.</w:t>
+        <w:t>El recurso no ejecutado será liberado por parte de ACTIVA una vez terminado el contrato.</w:t>
       </w:r>
     </w:p>
     <w:p>
@@ -1799,26 +1653,36 @@
           <w:lang w:val="es-CO" w:eastAsia="es-ES"/>
         </w:rPr>
       </w:pPr>
-      <w:r>
+    </w:p>
+    <w:p>
+      <w:pPr>
+        <w:suppressAutoHyphens/>
+        <w:ind w:right="-425"/>
+        <w:jc w:val="both"/>
         <w:rPr>
           <w:rFonts w:ascii="Arial" w:eastAsia="Times New Roman" w:hAnsi="Arial" w:cs="Arial"/>
           <w:color w:val="0D0D0D" w:themeColor="text1" w:themeTint="F2"/>
           <w:lang w:val="es-CO" w:eastAsia="es-ES"/>
         </w:rPr>
-        <w:t>Así mismo, para proceder al pago, la EMPRESA DE PARQUES Y EVENTOS DE ANTIOQUIA – ACTIVA, verificará que el contratista se encuentre al día en el pago de sus obligaciones parafiscales y aquellas relacionadas con los sistemas de seguridad social integral.</w:t>
-      </w:r>
-    </w:p>
-    <w:p>
-      <w:pPr>
-        <w:suppressAutoHyphens/>
-        <w:ind w:right="-425"/>
-        <w:jc w:val="both"/>
+      </w:pPr>
+      <w:r>
+        <w:rPr>
+          <w:rFonts w:ascii="Arial" w:eastAsia="Times New Roman" w:hAnsi="Arial" w:cs="Arial"/>
+          <w:b/>
+          <w:bCs/>
+          <w:color w:val="0D0D0D" w:themeColor="text1" w:themeTint="F2"/>
+          <w:lang w:val="es-CO" w:eastAsia="es-ES"/>
+        </w:rPr>
+        <w:t xml:space="preserve">Nota: </w:t>
+      </w:r>
+      <w:r>
         <w:rPr>
           <w:rFonts w:ascii="Arial" w:eastAsia="Times New Roman" w:hAnsi="Arial" w:cs="Arial"/>
           <w:color w:val="0D0D0D" w:themeColor="text1" w:themeTint="F2"/>
           <w:lang w:val="es-CO" w:eastAsia="es-ES"/>
         </w:rPr>
-      </w:pPr>
+        <w:t>los impuestos, estampillas y retenciones que apliquen estarán a cargo del contratista.</w:t>
+      </w:r>
     </w:p>
     <w:p>
       <w:pPr>
@@ -1831,14 +1695,6 @@
           <w:lang w:val="es-CO" w:eastAsia="es-ES"/>
         </w:rPr>
       </w:pPr>
-      <w:r>
-        <w:rPr>
-          <w:rFonts w:ascii="Arial" w:eastAsia="Times New Roman" w:hAnsi="Arial" w:cs="Arial"/>
-          <w:color w:val="0D0D0D" w:themeColor="text1" w:themeTint="F2"/>
-          <w:lang w:val="es-CO" w:eastAsia="es-ES"/>
-        </w:rPr>
-        <w:t>El contratista deberá aportar las certificaciones y documentación de los dependientes económicos en caso de tenerlos, para ACTIVA realizar los respectivos análisis y depuraciones fiscales en los abonos en cuenta o pagos derivados de este contrato.</w:t>
-      </w:r>
     </w:p>
     <w:p>
       <w:pPr>
@@ -1846,92 +1702,6 @@
         <w:ind w:right="-425"/>
         <w:jc w:val="both"/>
         <w:rPr>
-          <w:rFonts w:ascii="Arial" w:eastAsia="Times New Roman" w:hAnsi="Arial" w:cs="Arial"/>
-          <w:color w:val="0D0D0D" w:themeColor="text1" w:themeTint="F2"/>
-          <w:lang w:val="es-CO" w:eastAsia="es-ES"/>
-        </w:rPr>
-      </w:pPr>
-    </w:p>
-    <w:p>
-      <w:pPr>
-        <w:suppressAutoHyphens/>
-        <w:ind w:right="-425"/>
-        <w:jc w:val="both"/>
-        <w:rPr>
-          <w:rFonts w:ascii="Arial" w:eastAsia="Times New Roman" w:hAnsi="Arial" w:cs="Arial"/>
-          <w:color w:val="0D0D0D" w:themeColor="text1" w:themeTint="F2"/>
-          <w:lang w:val="es-CO" w:eastAsia="es-ES"/>
-        </w:rPr>
-      </w:pPr>
-      <w:r>
-        <w:rPr>
-          <w:rFonts w:ascii="Arial" w:eastAsia="Times New Roman" w:hAnsi="Arial" w:cs="Arial"/>
-          <w:color w:val="0D0D0D" w:themeColor="text1" w:themeTint="F2"/>
-          <w:lang w:val="es-CO" w:eastAsia="es-ES"/>
-        </w:rPr>
-        <w:t>El recurso no ejecutado será liberado por parte de ACTIVA una vez terminado el contrato.</w:t>
-      </w:r>
-    </w:p>
-    <w:p>
-      <w:pPr>
-        <w:suppressAutoHyphens/>
-        <w:ind w:right="-425"/>
-        <w:jc w:val="both"/>
-        <w:rPr>
-          <w:rFonts w:ascii="Arial" w:eastAsia="Times New Roman" w:hAnsi="Arial" w:cs="Arial"/>
-          <w:color w:val="0D0D0D" w:themeColor="text1" w:themeTint="F2"/>
-          <w:lang w:val="es-CO" w:eastAsia="es-ES"/>
-        </w:rPr>
-      </w:pPr>
-    </w:p>
-    <w:p>
-      <w:pPr>
-        <w:suppressAutoHyphens/>
-        <w:ind w:right="-425"/>
-        <w:jc w:val="both"/>
-        <w:rPr>
-          <w:rFonts w:ascii="Arial" w:eastAsia="Times New Roman" w:hAnsi="Arial" w:cs="Arial"/>
-          <w:color w:val="0D0D0D" w:themeColor="text1" w:themeTint="F2"/>
-          <w:lang w:val="es-CO" w:eastAsia="es-ES"/>
-        </w:rPr>
-      </w:pPr>
-      <w:r>
-        <w:rPr>
-          <w:rFonts w:ascii="Arial" w:eastAsia="Times New Roman" w:hAnsi="Arial" w:cs="Arial"/>
-          <w:b/>
-          <w:bCs/>
-          <w:color w:val="0D0D0D" w:themeColor="text1" w:themeTint="F2"/>
-          <w:lang w:val="es-CO" w:eastAsia="es-ES"/>
-        </w:rPr>
-        <w:t xml:space="preserve">Nota: </w:t>
-      </w:r>
-      <w:r>
-        <w:rPr>
-          <w:rFonts w:ascii="Arial" w:eastAsia="Times New Roman" w:hAnsi="Arial" w:cs="Arial"/>
-          <w:color w:val="0D0D0D" w:themeColor="text1" w:themeTint="F2"/>
-          <w:lang w:val="es-CO" w:eastAsia="es-ES"/>
-        </w:rPr>
-        <w:t>los impuestos, estampillas y retenciones que apliquen estarán a cargo del contratista.</w:t>
-      </w:r>
-    </w:p>
-    <w:p>
-      <w:pPr>
-        <w:suppressAutoHyphens/>
-        <w:ind w:right="-425"/>
-        <w:jc w:val="both"/>
-        <w:rPr>
-          <w:rFonts w:ascii="Arial" w:eastAsia="Times New Roman" w:hAnsi="Arial" w:cs="Arial"/>
-          <w:color w:val="0D0D0D" w:themeColor="text1" w:themeTint="F2"/>
-          <w:lang w:val="es-CO" w:eastAsia="es-ES"/>
-        </w:rPr>
-      </w:pPr>
-    </w:p>
-    <w:p>
-      <w:pPr>
-        <w:suppressAutoHyphens/>
-        <w:ind w:right="-425"/>
-        <w:jc w:val="both"/>
-        <w:rPr>
           <w:rFonts w:ascii="Arial" w:hAnsi="Arial" w:cs="Arial"/>
           <w:color w:val="000000" w:themeColor="text1"/>
         </w:rPr>
@@ -1980,263 +1750,7 @@
           <w:rFonts w:ascii="Arial" w:hAnsi="Arial" w:cs="Arial"/>
           <w:color w:val="000000" w:themeColor="text1"/>
         </w:rPr>
-        <w:t xml:space="preserve">{presupuesto_texto}</w:t>
-      </w:r>
-      <w:r>
-        <w:rPr>
-          <w:rFonts w:ascii="Arial" w:hAnsi="Arial" w:cs="Arial"/>
-          <w:color w:val="000000" w:themeColor="text1"/>
-        </w:rPr>
-        <w:t xml:space="preserve"/>
-      </w:r>
-      <w:r>
-        <w:rPr>
-          <w:rFonts w:ascii="Arial" w:hAnsi="Arial" w:cs="Arial"/>
-          <w:color w:val="000000" w:themeColor="text1"/>
-        </w:rPr>
-        <w:t/>
-      </w:r>
-      <w:r>
-        <w:rPr>
-          <w:rFonts w:ascii="Arial" w:hAnsi="Arial" w:cs="Arial"/>
-          <w:color w:val="000000" w:themeColor="text1"/>
-        </w:rPr>
-        <w:t xml:space="preserve"/>
-      </w:r>
-      <w:r>
-        <w:rPr>
-          <w:rFonts w:ascii="Arial" w:hAnsi="Arial" w:cs="Arial"/>
-          <w:color w:val="000000" w:themeColor="text1"/>
-        </w:rPr>
-        <w:t/>
-      </w:r>
-      <w:r>
-        <w:rPr>
-          <w:rFonts w:ascii="Arial" w:hAnsi="Arial" w:cs="Arial"/>
-        </w:rPr>
-        <w:t xml:space="preserve"/>
-      </w:r>
-      <w:r>
-        <w:rPr>
-          <w:rFonts w:ascii="Arial" w:hAnsi="Arial" w:cs="Arial"/>
-        </w:rPr>
-        <w:t/>
-      </w:r>
-      <w:r>
-        <w:rPr>
-          <w:rFonts w:ascii="Arial" w:hAnsi="Arial" w:cs="Arial"/>
-        </w:rPr>
-        <w:t/>
-      </w:r>
-      <w:r>
-        <w:rPr>
-          <w:rFonts w:ascii="Arial" w:hAnsi="Arial" w:cs="Arial"/>
-        </w:rPr>
-        <w:t/>
-      </w:r>
-      <w:r>
-        <w:rPr>
-          <w:rFonts w:ascii="Arial" w:hAnsi="Arial" w:cs="Arial"/>
-        </w:rPr>
-        <w:t/>
-      </w:r>
-      <w:r>
-        <w:rPr>
-          <w:rFonts w:ascii="Arial" w:hAnsi="Arial" w:cs="Arial"/>
-        </w:rPr>
-        <w:t/>
-      </w:r>
-      <w:r>
-        <w:rPr>
-          <w:rFonts w:ascii="Arial" w:hAnsi="Arial" w:cs="Arial"/>
-        </w:rPr>
-        <w:t/>
-      </w:r>
-      <w:r>
-        <w:rPr>
-          <w:rFonts w:ascii="Arial" w:hAnsi="Arial" w:cs="Arial"/>
-        </w:rPr>
-        <w:t xml:space="preserve"/>
-      </w:r>
-      <w:r>
-        <w:rPr>
-          <w:rFonts w:ascii="Arial" w:hAnsi="Arial" w:cs="Arial"/>
-        </w:rPr>
-        <w:t xml:space="preserve"/>
-      </w:r>
-      <w:r>
-        <w:rPr>
-          <w:rFonts w:ascii="Arial" w:hAnsi="Arial" w:cs="Arial"/>
-        </w:rPr>
-        <w:t/>
-      </w:r>
-      <w:r>
-        <w:rPr>
-          <w:rFonts w:ascii="Arial" w:hAnsi="Arial" w:cs="Arial"/>
-        </w:rPr>
-        <w:t/>
-      </w:r>
-      <w:r>
-        <w:rPr>
-          <w:rFonts w:ascii="Arial" w:hAnsi="Arial" w:cs="Arial"/>
-        </w:rPr>
-        <w:t/>
-      </w:r>
-      <w:r>
-        <w:rPr>
-          <w:rFonts w:ascii="Arial" w:hAnsi="Arial" w:cs="Arial"/>
-        </w:rPr>
-        <w:t/>
-      </w:r>
-      <w:r>
-        <w:rPr>
-          <w:rFonts w:ascii="Arial" w:hAnsi="Arial" w:cs="Arial"/>
-        </w:rPr>
-        <w:t/>
-      </w:r>
-      <w:r>
-        <w:rPr>
-          <w:rFonts w:ascii="Arial" w:hAnsi="Arial" w:cs="Arial"/>
-        </w:rPr>
-        <w:t/>
-      </w:r>
-      <w:r>
-        <w:rPr>
-          <w:rFonts w:ascii="Arial" w:hAnsi="Arial" w:cs="Arial"/>
-        </w:rPr>
-        <w:t/>
-      </w:r>
-      <w:r>
-        <w:rPr>
-          <w:rFonts w:ascii="Arial" w:hAnsi="Arial" w:cs="Arial"/>
-        </w:rPr>
-        <w:t xml:space="preserve"/>
-      </w:r>
-      <w:r>
-        <w:rPr>
-          <w:rFonts w:ascii="Arial" w:hAnsi="Arial" w:cs="Arial"/>
-          <w:color w:val="000000" w:themeColor="text1"/>
-        </w:rPr>
-        <w:t xml:space="preserve"/>
-      </w:r>
-      <w:r>
-        <w:rPr>
-          <w:rFonts w:ascii="Arial" w:hAnsi="Arial" w:cs="Arial"/>
-          <w:color w:val="000000" w:themeColor="text1"/>
-        </w:rPr>
-        <w:t xml:space="preserve"/>
-      </w:r>
-      <w:r>
-        <w:rPr>
-          <w:rFonts w:ascii="Arial" w:hAnsi="Arial" w:cs="Arial"/>
-          <w:color w:val="000000" w:themeColor="text1"/>
-        </w:rPr>
-        <w:t xml:space="preserve"/>
-      </w:r>
-      <w:r>
-        <w:rPr>
-          <w:rFonts w:ascii="Arial" w:hAnsi="Arial" w:cs="Arial"/>
-          <w:color w:val="000000" w:themeColor="text1"/>
-        </w:rPr>
-        <w:t/>
-      </w:r>
-      <w:r>
-        <w:rPr>
-          <w:rFonts w:ascii="Arial" w:hAnsi="Arial" w:cs="Arial"/>
-          <w:color w:val="000000" w:themeColor="text1"/>
-        </w:rPr>
-        <w:t xml:space="preserve"/>
-      </w:r>
-      <w:r>
-        <w:rPr>
-          <w:rFonts w:ascii="Arial" w:hAnsi="Arial" w:cs="Arial"/>
-          <w:color w:val="000000" w:themeColor="text1"/>
-        </w:rPr>
-        <w:t/>
-      </w:r>
-      <w:r>
-        <w:rPr>
-          <w:rFonts w:ascii="Arial" w:hAnsi="Arial" w:cs="Arial"/>
-          <w:color w:val="000000" w:themeColor="text1"/>
-        </w:rPr>
-        <w:t/>
-      </w:r>
-      <w:r>
-        <w:rPr>
-          <w:rFonts w:ascii="Arial" w:hAnsi="Arial" w:cs="Arial"/>
-          <w:color w:val="000000" w:themeColor="text1"/>
-        </w:rPr>
-        <w:t/>
-      </w:r>
-      <w:r>
-        <w:rPr>
-          <w:rFonts w:ascii="Arial" w:hAnsi="Arial" w:cs="Arial"/>
-          <w:color w:val="000000" w:themeColor="text1"/>
-        </w:rPr>
-        <w:t/>
-      </w:r>
-      <w:r>
-        <w:rPr>
-          <w:rFonts w:ascii="Arial" w:hAnsi="Arial" w:cs="Arial"/>
-          <w:color w:val="000000" w:themeColor="text1"/>
-        </w:rPr>
-        <w:t xml:space="preserve"/>
-      </w:r>
-      <w:r>
-        <w:rPr>
-          <w:rFonts w:ascii="Arial" w:hAnsi="Arial" w:cs="Arial"/>
-          <w:color w:val="000000" w:themeColor="text1"/>
-        </w:rPr>
-        <w:t/>
-      </w:r>
-      <w:r>
-        <w:rPr>
-          <w:rFonts w:ascii="Arial" w:hAnsi="Arial" w:cs="Arial"/>
-          <w:color w:val="000000" w:themeColor="text1"/>
-        </w:rPr>
-        <w:t/>
-      </w:r>
-      <w:r>
-        <w:rPr>
-          <w:rFonts w:ascii="Arial" w:hAnsi="Arial" w:cs="Arial"/>
-          <w:color w:val="000000" w:themeColor="text1"/>
-        </w:rPr>
-        <w:t/>
-      </w:r>
-      <w:r>
-        <w:rPr>
-          <w:rFonts w:ascii="Arial" w:hAnsi="Arial" w:cs="Arial"/>
-          <w:color w:val="000000" w:themeColor="text1"/>
-        </w:rPr>
-        <w:t/>
-      </w:r>
-      <w:r>
-        <w:rPr>
-          <w:rFonts w:ascii="Arial" w:hAnsi="Arial" w:cs="Arial"/>
-          <w:color w:val="000000" w:themeColor="text1"/>
-        </w:rPr>
-        <w:t/>
-      </w:r>
-      <w:r>
-        <w:rPr>
-          <w:rFonts w:ascii="Arial" w:hAnsi="Arial" w:cs="Arial"/>
-          <w:color w:val="000000" w:themeColor="text1"/>
-        </w:rPr>
-        <w:t/>
-      </w:r>
-      <w:r>
-        <w:rPr>
-          <w:rFonts w:ascii="Arial" w:hAnsi="Arial" w:cs="Arial"/>
-          <w:color w:val="000000" w:themeColor="text1"/>
-        </w:rPr>
-        <w:t/>
-      </w:r>
-      <w:r>
-        <w:rPr>
-          <w:rFonts w:ascii="Arial" w:hAnsi="Arial" w:cs="Arial"/>
-          <w:color w:val="000000" w:themeColor="text1"/>
-        </w:rPr>
-        <w:t/>
+        <w:t>{presupuesto_texto}</w:t>
       </w:r>
     </w:p>
     <w:p>
@@ -2319,6 +1833,7 @@
           <w:rFonts w:ascii="Arial" w:eastAsia="Calibri" w:hAnsi="Arial" w:cs="Arial"/>
           <w:lang w:val="es-CO" w:eastAsia="es-CO"/>
         </w:rPr>
+        <w:lastRenderedPageBreak/>
         <w:t>Perfeccionar conjuntamente la minuta del contrato en los términos previstos, suscripción del acta de inicio, suspensiones o prórrogas, modificaciones y en general, las actas que se produzcan en el desarrollo del contrato, incluyendo acta de liquidación. </w:t>
       </w:r>
     </w:p>
@@ -2769,7 +2284,7 @@
         <w:autoSpaceDE w:val="0"/>
         <w:autoSpaceDN w:val="0"/>
         <w:adjustRightInd w:val="0"/>
-        <w:ind w:left="284" w:right="51" w:hanging="284"/>
+        <w:ind w:left="284" w:right="-425" w:hanging="284"/>
         <w:jc w:val="both"/>
         <w:rPr>
           <w:rFonts w:ascii="Arial" w:hAnsi="Arial" w:cs="Arial"/>
@@ -2793,7 +2308,7 @@
         <w:autoSpaceDE w:val="0"/>
         <w:autoSpaceDN w:val="0"/>
         <w:adjustRightInd w:val="0"/>
-        <w:ind w:left="284" w:right="51" w:hanging="284"/>
+        <w:ind w:left="284" w:right="-425" w:hanging="284"/>
         <w:jc w:val="both"/>
         <w:rPr>
           <w:rFonts w:ascii="Arial" w:hAnsi="Arial" w:cs="Arial"/>
@@ -2816,7 +2331,7 @@
         <w:autoSpaceDE w:val="0"/>
         <w:autoSpaceDN w:val="0"/>
         <w:adjustRightInd w:val="0"/>
-        <w:ind w:left="284" w:right="51" w:hanging="284"/>
+        <w:ind w:left="284" w:right="-425" w:hanging="284"/>
         <w:jc w:val="both"/>
         <w:rPr>
           <w:rFonts w:ascii="Arial" w:hAnsi="Arial" w:cs="Arial"/>
@@ -2839,7 +2354,7 @@
         <w:autoSpaceDE w:val="0"/>
         <w:autoSpaceDN w:val="0"/>
         <w:adjustRightInd w:val="0"/>
-        <w:ind w:left="284" w:right="51" w:hanging="284"/>
+        <w:ind w:left="284" w:right="-425" w:hanging="284"/>
         <w:jc w:val="both"/>
         <w:rPr>
           <w:rFonts w:ascii="Arial" w:hAnsi="Arial" w:cs="Arial"/>
@@ -2862,16 +2377,17 @@
         <w:autoSpaceDE w:val="0"/>
         <w:autoSpaceDN w:val="0"/>
         <w:adjustRightInd w:val="0"/>
-        <w:ind w:left="284" w:right="51" w:hanging="284"/>
-        <w:jc w:val="both"/>
-        <w:rPr>
-          <w:rFonts w:ascii="Arial" w:hAnsi="Arial" w:cs="Arial"/>
-        </w:rPr>
-      </w:pPr>
-      <w:r>
-        <w:rPr>
-          <w:rFonts w:ascii="Arial" w:hAnsi="Arial" w:cs="Arial"/>
-        </w:rPr>
+        <w:ind w:left="284" w:right="-425" w:hanging="284"/>
+        <w:jc w:val="both"/>
+        <w:rPr>
+          <w:rFonts w:ascii="Arial" w:hAnsi="Arial" w:cs="Arial"/>
+        </w:rPr>
+      </w:pPr>
+      <w:r>
+        <w:rPr>
+          <w:rFonts w:ascii="Arial" w:hAnsi="Arial" w:cs="Arial"/>
+        </w:rPr>
+        <w:lastRenderedPageBreak/>
         <w:t>Cumplir con los objetivos contractuales con calidad, eficacia y efectividad en el plazo previsto para su ejecución, asumiendo las responsabilidades propias y buen desempeño del contrato, y contribuyendo a que la gestión de la Entidad contratante sea más eficaz.</w:t>
       </w:r>
     </w:p>
@@ -2885,7 +2401,7 @@
         <w:autoSpaceDE w:val="0"/>
         <w:autoSpaceDN w:val="0"/>
         <w:adjustRightInd w:val="0"/>
-        <w:ind w:left="284" w:right="51" w:hanging="284"/>
+        <w:ind w:left="284" w:right="-425" w:hanging="284"/>
         <w:jc w:val="both"/>
         <w:rPr>
           <w:rFonts w:ascii="Arial" w:hAnsi="Arial" w:cs="Arial"/>
@@ -2908,7 +2424,7 @@
         <w:autoSpaceDE w:val="0"/>
         <w:autoSpaceDN w:val="0"/>
         <w:adjustRightInd w:val="0"/>
-        <w:ind w:left="284" w:right="51" w:hanging="284"/>
+        <w:ind w:left="284" w:right="-425" w:hanging="284"/>
         <w:jc w:val="both"/>
         <w:rPr>
           <w:rFonts w:ascii="Arial" w:hAnsi="Arial" w:cs="Arial"/>
@@ -2931,7 +2447,7 @@
         <w:autoSpaceDE w:val="0"/>
         <w:autoSpaceDN w:val="0"/>
         <w:adjustRightInd w:val="0"/>
-        <w:ind w:left="284" w:right="51" w:hanging="284"/>
+        <w:ind w:left="284" w:right="-425" w:hanging="284"/>
         <w:jc w:val="both"/>
         <w:rPr>
           <w:rFonts w:ascii="Arial" w:hAnsi="Arial" w:cs="Arial"/>
@@ -2954,7 +2470,7 @@
         <w:autoSpaceDE w:val="0"/>
         <w:autoSpaceDN w:val="0"/>
         <w:adjustRightInd w:val="0"/>
-        <w:ind w:left="284" w:right="51" w:hanging="284"/>
+        <w:ind w:left="284" w:right="-425" w:hanging="284"/>
         <w:jc w:val="both"/>
         <w:rPr>
           <w:rFonts w:ascii="Arial" w:hAnsi="Arial" w:cs="Arial"/>
@@ -2977,7 +2493,7 @@
         <w:autoSpaceDE w:val="0"/>
         <w:autoSpaceDN w:val="0"/>
         <w:adjustRightInd w:val="0"/>
-        <w:ind w:left="284" w:right="51" w:hanging="426"/>
+        <w:ind w:left="284" w:right="-425" w:hanging="426"/>
         <w:jc w:val="both"/>
         <w:rPr>
           <w:rFonts w:ascii="Arial" w:hAnsi="Arial" w:cs="Arial"/>
@@ -3000,7 +2516,7 @@
         <w:autoSpaceDE w:val="0"/>
         <w:autoSpaceDN w:val="0"/>
         <w:adjustRightInd w:val="0"/>
-        <w:ind w:left="284" w:right="51" w:hanging="426"/>
+        <w:ind w:left="284" w:right="-425" w:hanging="426"/>
         <w:jc w:val="both"/>
         <w:rPr>
           <w:rFonts w:ascii="Arial" w:hAnsi="Arial" w:cs="Arial"/>
@@ -3023,17 +2539,16 @@
         <w:autoSpaceDE w:val="0"/>
         <w:autoSpaceDN w:val="0"/>
         <w:adjustRightInd w:val="0"/>
-        <w:ind w:left="284" w:right="51" w:hanging="426"/>
-        <w:jc w:val="both"/>
-        <w:rPr>
-          <w:rFonts w:ascii="Arial" w:hAnsi="Arial" w:cs="Arial"/>
-        </w:rPr>
-      </w:pPr>
-      <w:r>
-        <w:rPr>
-          <w:rFonts w:ascii="Arial" w:hAnsi="Arial" w:cs="Arial"/>
-        </w:rPr>
-        <w:lastRenderedPageBreak/>
+        <w:ind w:left="284" w:right="-425" w:hanging="426"/>
+        <w:jc w:val="both"/>
+        <w:rPr>
+          <w:rFonts w:ascii="Arial" w:hAnsi="Arial" w:cs="Arial"/>
+        </w:rPr>
+      </w:pPr>
+      <w:r>
+        <w:rPr>
+          <w:rFonts w:ascii="Arial" w:hAnsi="Arial" w:cs="Arial"/>
+        </w:rPr>
         <w:t>Cumplir con las normas del Sistema General de Riesgos Laborales, en especial las siguientes:</w:t>
       </w:r>
     </w:p>
@@ -3047,7 +2562,7 @@
         <w:autoSpaceDE w:val="0"/>
         <w:autoSpaceDN w:val="0"/>
         <w:adjustRightInd w:val="0"/>
-        <w:ind w:left="851" w:right="51" w:hanging="284"/>
+        <w:ind w:left="851" w:right="-425" w:hanging="284"/>
         <w:jc w:val="both"/>
         <w:rPr>
           <w:rFonts w:ascii="Arial" w:hAnsi="Arial" w:cs="Arial"/>
@@ -3070,7 +2585,7 @@
         <w:autoSpaceDE w:val="0"/>
         <w:autoSpaceDN w:val="0"/>
         <w:adjustRightInd w:val="0"/>
-        <w:ind w:left="851" w:right="51" w:hanging="284"/>
+        <w:ind w:left="851" w:right="-425" w:hanging="284"/>
         <w:jc w:val="both"/>
         <w:rPr>
           <w:rFonts w:ascii="Arial" w:hAnsi="Arial" w:cs="Arial"/>
@@ -3093,7 +2608,7 @@
         <w:autoSpaceDE w:val="0"/>
         <w:autoSpaceDN w:val="0"/>
         <w:adjustRightInd w:val="0"/>
-        <w:ind w:left="851" w:right="51" w:hanging="284"/>
+        <w:ind w:left="851" w:right="-425" w:hanging="284"/>
         <w:jc w:val="both"/>
         <w:rPr>
           <w:rFonts w:ascii="Arial" w:hAnsi="Arial" w:cs="Arial"/>
@@ -3116,7 +2631,7 @@
         <w:autoSpaceDE w:val="0"/>
         <w:autoSpaceDN w:val="0"/>
         <w:adjustRightInd w:val="0"/>
-        <w:ind w:left="851" w:right="51" w:hanging="284"/>
+        <w:ind w:left="851" w:right="-425" w:hanging="284"/>
         <w:jc w:val="both"/>
         <w:rPr>
           <w:rFonts w:ascii="Arial" w:hAnsi="Arial" w:cs="Arial"/>
@@ -3139,7 +2654,7 @@
         <w:autoSpaceDE w:val="0"/>
         <w:autoSpaceDN w:val="0"/>
         <w:adjustRightInd w:val="0"/>
-        <w:ind w:left="851" w:right="51" w:hanging="284"/>
+        <w:ind w:left="851" w:right="-425" w:hanging="284"/>
         <w:jc w:val="both"/>
         <w:rPr>
           <w:rFonts w:ascii="Arial" w:hAnsi="Arial" w:cs="Arial"/>
@@ -3162,7 +2677,7 @@
         <w:autoSpaceDE w:val="0"/>
         <w:autoSpaceDN w:val="0"/>
         <w:adjustRightInd w:val="0"/>
-        <w:ind w:left="851" w:right="51" w:hanging="284"/>
+        <w:ind w:left="851" w:right="-425" w:hanging="284"/>
         <w:jc w:val="both"/>
         <w:rPr>
           <w:rFonts w:ascii="Arial" w:hAnsi="Arial" w:cs="Arial"/>
@@ -3173,6 +2688,144 @@
           <w:rFonts w:ascii="Arial" w:hAnsi="Arial" w:cs="Arial"/>
         </w:rPr>
         <w:t>Practicarse de acuerdo con lo establecido en los artículos 8 y 9 de la resolución 2346 – 2007 el examen médico pre – ocupacional y allegar el certificado a ACTIVA.</w:t>
+      </w:r>
+    </w:p>
+    <w:p>
+      <w:pPr>
+        <w:pStyle w:val="Prrafodelista"/>
+        <w:numPr>
+          <w:ilvl w:val="0"/>
+          <w:numId w:val="13"/>
+        </w:numPr>
+        <w:autoSpaceDE w:val="0"/>
+        <w:autoSpaceDN w:val="0"/>
+        <w:adjustRightInd w:val="0"/>
+        <w:ind w:left="426" w:right="-425" w:hanging="426"/>
+        <w:jc w:val="both"/>
+        <w:rPr>
+          <w:rFonts w:ascii="Arial" w:hAnsi="Arial" w:cs="Arial"/>
+        </w:rPr>
+      </w:pPr>
+      <w:r>
+        <w:rPr>
+          <w:rFonts w:ascii="Arial" w:hAnsi="Arial" w:cs="Arial"/>
+        </w:rPr>
+        <w:t>Los derechos de propiedad intelectual de los trabajos que desarrolle el Contratista serán exclusivos de ACTIVA.</w:t>
+      </w:r>
+    </w:p>
+    <w:p>
+      <w:pPr>
+        <w:pStyle w:val="Prrafodelista"/>
+        <w:numPr>
+          <w:ilvl w:val="0"/>
+          <w:numId w:val="13"/>
+        </w:numPr>
+        <w:autoSpaceDE w:val="0"/>
+        <w:autoSpaceDN w:val="0"/>
+        <w:adjustRightInd w:val="0"/>
+        <w:ind w:left="426" w:right="-425" w:hanging="426"/>
+        <w:jc w:val="both"/>
+        <w:rPr>
+          <w:rFonts w:ascii="Arial" w:hAnsi="Arial" w:cs="Arial"/>
+        </w:rPr>
+      </w:pPr>
+      <w:r>
+        <w:rPr>
+          <w:rFonts w:ascii="Arial" w:hAnsi="Arial" w:cs="Arial"/>
+        </w:rPr>
+        <w:t>Entregar los servicios objeto del contrato en los términos establecidos en la propuesta presentada.</w:t>
+      </w:r>
+    </w:p>
+    <w:p>
+      <w:pPr>
+        <w:pStyle w:val="Prrafodelista"/>
+        <w:numPr>
+          <w:ilvl w:val="0"/>
+          <w:numId w:val="13"/>
+        </w:numPr>
+        <w:autoSpaceDE w:val="0"/>
+        <w:autoSpaceDN w:val="0"/>
+        <w:adjustRightInd w:val="0"/>
+        <w:ind w:left="426" w:right="-425" w:hanging="426"/>
+        <w:jc w:val="both"/>
+        <w:rPr>
+          <w:rFonts w:ascii="Arial" w:hAnsi="Arial" w:cs="Arial"/>
+        </w:rPr>
+      </w:pPr>
+      <w:r>
+        <w:rPr>
+          <w:rFonts w:ascii="Arial" w:hAnsi="Arial" w:cs="Arial"/>
+        </w:rPr>
+        <w:t>Informar a la EMPRESA DE PARQUES Y EVENTOS DE ANTIOQUIA – ACTIVA   sobre la ocurrencia de hechos o circunstancias que puedan generar una inoportuna o indebida ejecución del contrato o que puedan poner en peligro los intereses legítimos de la Entidad. El aviso mencionado deberá hacerse efectivo dentro de las veinticuatro (24) horas siguientes, del hecho o circunstancia en referencia.</w:t>
+      </w:r>
+    </w:p>
+    <w:p>
+      <w:pPr>
+        <w:pStyle w:val="Prrafodelista"/>
+        <w:numPr>
+          <w:ilvl w:val="0"/>
+          <w:numId w:val="13"/>
+        </w:numPr>
+        <w:autoSpaceDE w:val="0"/>
+        <w:autoSpaceDN w:val="0"/>
+        <w:adjustRightInd w:val="0"/>
+        <w:ind w:left="426" w:right="-425" w:hanging="426"/>
+        <w:jc w:val="both"/>
+        <w:rPr>
+          <w:rFonts w:ascii="Arial" w:hAnsi="Arial" w:cs="Arial"/>
+        </w:rPr>
+      </w:pPr>
+      <w:r>
+        <w:rPr>
+          <w:rFonts w:ascii="Arial" w:hAnsi="Arial" w:cs="Arial"/>
+        </w:rPr>
+        <w:t>Informar a la EMPRESA DE PARQUES Y EVENTOS DE ANTIOQUIA – ACTIVA.  sobre su incursión en causal de incompatibilidad o inhabilidad sobreviniente. El aviso deberá hacerse efectivo dentro del día hábil siguiente al conocimiento, por parte del contratista, de los hechos o circunstancias que generen la inhabilidad o incompatibilidad.</w:t>
+      </w:r>
+    </w:p>
+    <w:p>
+      <w:pPr>
+        <w:pStyle w:val="Prrafodelista"/>
+        <w:numPr>
+          <w:ilvl w:val="0"/>
+          <w:numId w:val="13"/>
+        </w:numPr>
+        <w:autoSpaceDE w:val="0"/>
+        <w:autoSpaceDN w:val="0"/>
+        <w:adjustRightInd w:val="0"/>
+        <w:ind w:left="426" w:right="-425" w:hanging="426"/>
+        <w:jc w:val="both"/>
+        <w:rPr>
+          <w:rFonts w:ascii="Arial" w:hAnsi="Arial" w:cs="Arial"/>
+        </w:rPr>
+      </w:pPr>
+      <w:r>
+        <w:rPr>
+          <w:rFonts w:ascii="Arial" w:hAnsi="Arial" w:cs="Arial"/>
+        </w:rPr>
+        <w:t>Entregar los productos descritos en las especificaciones técnicas del proceso y/o la propuesta.</w:t>
+      </w:r>
+    </w:p>
+    <w:p>
+      <w:pPr>
+        <w:pStyle w:val="Prrafodelista"/>
+        <w:numPr>
+          <w:ilvl w:val="0"/>
+          <w:numId w:val="13"/>
+        </w:numPr>
+        <w:autoSpaceDE w:val="0"/>
+        <w:autoSpaceDN w:val="0"/>
+        <w:adjustRightInd w:val="0"/>
+        <w:ind w:left="426" w:right="-425" w:hanging="426"/>
+        <w:jc w:val="both"/>
+        <w:rPr>
+          <w:rFonts w:ascii="Arial" w:hAnsi="Arial" w:cs="Arial"/>
+        </w:rPr>
+      </w:pPr>
+      <w:r>
+        <w:rPr>
+          <w:rFonts w:ascii="Arial" w:hAnsi="Arial" w:cs="Arial"/>
+        </w:rPr>
+        <w:t>Realizar todas las actividades necesarias para el cumplimiento del objeto del contrato a satisfacción, así como todas las actividades relacionadas con el objeto de este, y que sean necesarias para el cabal cumplimiento de éste.</w:t>
       </w:r>
     </w:p>
     <w:p>
@@ -3195,144 +2848,7 @@
         <w:rPr>
           <w:rFonts w:ascii="Arial" w:hAnsi="Arial" w:cs="Arial"/>
         </w:rPr>
-        <w:t>Los derechos de propiedad intelectual de los trabajos que desarrolle el Contratista serán exclusivos de ACTIVA.</w:t>
-      </w:r>
-    </w:p>
-    <w:p>
-      <w:pPr>
-        <w:pStyle w:val="Prrafodelista"/>
-        <w:numPr>
-          <w:ilvl w:val="0"/>
-          <w:numId w:val="13"/>
-        </w:numPr>
-        <w:autoSpaceDE w:val="0"/>
-        <w:autoSpaceDN w:val="0"/>
-        <w:adjustRightInd w:val="0"/>
-        <w:ind w:left="426" w:right="51" w:hanging="426"/>
-        <w:jc w:val="both"/>
-        <w:rPr>
-          <w:rFonts w:ascii="Arial" w:hAnsi="Arial" w:cs="Arial"/>
-        </w:rPr>
-      </w:pPr>
-      <w:r>
-        <w:rPr>
-          <w:rFonts w:ascii="Arial" w:hAnsi="Arial" w:cs="Arial"/>
-        </w:rPr>
-        <w:t>Entregar los servicios objeto del contrato en los términos establecidos en la propuesta presentada.</w:t>
-      </w:r>
-    </w:p>
-    <w:p>
-      <w:pPr>
-        <w:pStyle w:val="Prrafodelista"/>
-        <w:numPr>
-          <w:ilvl w:val="0"/>
-          <w:numId w:val="13"/>
-        </w:numPr>
-        <w:autoSpaceDE w:val="0"/>
-        <w:autoSpaceDN w:val="0"/>
-        <w:adjustRightInd w:val="0"/>
-        <w:ind w:left="426" w:right="51" w:hanging="426"/>
-        <w:jc w:val="both"/>
-        <w:rPr>
-          <w:rFonts w:ascii="Arial" w:hAnsi="Arial" w:cs="Arial"/>
-        </w:rPr>
-      </w:pPr>
-      <w:r>
-        <w:rPr>
-          <w:rFonts w:ascii="Arial" w:hAnsi="Arial" w:cs="Arial"/>
-        </w:rPr>
-        <w:t>Informar a la EMPRESA DE PARQUES Y EVENTOS DE ANTIOQUIA – ACTIVA   sobre la ocurrencia de hechos o circunstancias que puedan generar una inoportuna o indebida ejecución del contrato o que puedan poner en peligro los intereses legítimos de la Entidad. El aviso mencionado deberá hacerse efectivo dentro de las veinticuatro (24) horas siguientes, del hecho o circunstancia en referencia.</w:t>
-      </w:r>
-    </w:p>
-    <w:p>
-      <w:pPr>
-        <w:pStyle w:val="Prrafodelista"/>
-        <w:numPr>
-          <w:ilvl w:val="0"/>
-          <w:numId w:val="13"/>
-        </w:numPr>
-        <w:autoSpaceDE w:val="0"/>
-        <w:autoSpaceDN w:val="0"/>
-        <w:adjustRightInd w:val="0"/>
-        <w:ind w:left="426" w:right="51" w:hanging="426"/>
-        <w:jc w:val="both"/>
-        <w:rPr>
-          <w:rFonts w:ascii="Arial" w:hAnsi="Arial" w:cs="Arial"/>
-        </w:rPr>
-      </w:pPr>
-      <w:r>
-        <w:rPr>
-          <w:rFonts w:ascii="Arial" w:hAnsi="Arial" w:cs="Arial"/>
-        </w:rPr>
-        <w:t>Informar a la EMPRESA DE PARQUES Y EVENTOS DE ANTIOQUIA – ACTIVA.  sobre su incursión en causal de incompatibilidad o inhabilidad sobreviniente. El aviso deberá hacerse efectivo dentro del día hábil siguiente al conocimiento, por parte del contratista, de los hechos o circunstancias que generen la inhabilidad o incompatibilidad.</w:t>
-      </w:r>
-    </w:p>
-    <w:p>
-      <w:pPr>
-        <w:pStyle w:val="Prrafodelista"/>
-        <w:numPr>
-          <w:ilvl w:val="0"/>
-          <w:numId w:val="13"/>
-        </w:numPr>
-        <w:autoSpaceDE w:val="0"/>
-        <w:autoSpaceDN w:val="0"/>
-        <w:adjustRightInd w:val="0"/>
-        <w:ind w:left="426" w:right="51" w:hanging="426"/>
-        <w:jc w:val="both"/>
-        <w:rPr>
-          <w:rFonts w:ascii="Arial" w:hAnsi="Arial" w:cs="Arial"/>
-        </w:rPr>
-      </w:pPr>
-      <w:r>
-        <w:rPr>
-          <w:rFonts w:ascii="Arial" w:hAnsi="Arial" w:cs="Arial"/>
-        </w:rPr>
-        <w:t>Entregar los productos descritos en las especificaciones técnicas del proceso y/o la propuesta.</w:t>
-      </w:r>
-    </w:p>
-    <w:p>
-      <w:pPr>
-        <w:pStyle w:val="Prrafodelista"/>
-        <w:numPr>
-          <w:ilvl w:val="0"/>
-          <w:numId w:val="13"/>
-        </w:numPr>
-        <w:autoSpaceDE w:val="0"/>
-        <w:autoSpaceDN w:val="0"/>
-        <w:adjustRightInd w:val="0"/>
-        <w:ind w:left="426" w:right="51" w:hanging="426"/>
-        <w:jc w:val="both"/>
-        <w:rPr>
-          <w:rFonts w:ascii="Arial" w:hAnsi="Arial" w:cs="Arial"/>
-        </w:rPr>
-      </w:pPr>
-      <w:r>
-        <w:rPr>
-          <w:rFonts w:ascii="Arial" w:hAnsi="Arial" w:cs="Arial"/>
-        </w:rPr>
-        <w:t>Realizar todas las actividades necesarias para el cumplimiento del objeto del contrato a satisfacción, así como todas las actividades relacionadas con el objeto de este, y que sean necesarias para el cabal cumplimiento de éste.</w:t>
-      </w:r>
-    </w:p>
-    <w:p>
-      <w:pPr>
-        <w:pStyle w:val="Prrafodelista"/>
-        <w:numPr>
-          <w:ilvl w:val="0"/>
-          <w:numId w:val="13"/>
-        </w:numPr>
-        <w:autoSpaceDE w:val="0"/>
-        <w:autoSpaceDN w:val="0"/>
-        <w:adjustRightInd w:val="0"/>
-        <w:ind w:left="426" w:right="51" w:hanging="426"/>
-        <w:jc w:val="both"/>
-        <w:rPr>
-          <w:rFonts w:ascii="Arial" w:hAnsi="Arial" w:cs="Arial"/>
-        </w:rPr>
-      </w:pPr>
-      <w:r>
-        <w:rPr>
-          <w:rFonts w:ascii="Arial" w:hAnsi="Arial" w:cs="Arial"/>
-        </w:rPr>
+        <w:lastRenderedPageBreak/>
         <w:t>Contar con las herramientas necesarias para desarrollar el objeto del contrato.</w:t>
       </w:r>
     </w:p>
@@ -3358,7 +2874,7 @@
         <w:autoSpaceDE w:val="0"/>
         <w:autoSpaceDN w:val="0"/>
         <w:adjustRightInd w:val="0"/>
-        <w:ind w:right="51"/>
+        <w:ind w:right="-425"/>
         <w:contextualSpacing/>
         <w:jc w:val="both"/>
         <w:rPr>
@@ -3442,7 +2958,7 @@
           <w:rFonts w:ascii="Arial" w:eastAsia="Arial" w:hAnsi="Arial" w:cs="Arial"/>
           <w:bdr w:val="none" w:sz="0" w:space="0" w:color="auto" w:frame="1"/>
         </w:rPr>
-        <w:t xml:space="preserve">{supervisor_nombre}</w:t>
+        <w:t>{supervisor_nombre}</w:t>
       </w:r>
       <w:r>
         <w:rPr>
@@ -3467,14 +2983,7 @@
           <w:rFonts w:ascii="Arial" w:hAnsi="Arial" w:cs="Arial"/>
           <w:lang w:eastAsia="es-CO"/>
         </w:rPr>
-        <w:t xml:space="preserve">{supervisor_cargo}</w:t>
-      </w:r>
-      <w:r>
-        <w:rPr>
-          <w:rFonts w:ascii="Arial" w:hAnsi="Arial" w:cs="Arial"/>
-          <w:lang w:eastAsia="es-CO"/>
-        </w:rPr>
-        <w:t xml:space="preserve"/>
+        <w:t>{supervisor_cargo}</w:t>
       </w:r>
       <w:r>
         <w:rPr>
@@ -3733,15 +3242,7 @@
           <w:rFonts w:ascii="Arial" w:hAnsi="Arial" w:cs="Arial"/>
           <w:color w:val="000000" w:themeColor="text1"/>
         </w:rPr>
-        <w:t xml:space="preserve">Exigir </w:t>
-      </w:r>
-      <w:r>
-        <w:rPr>
-          <w:rFonts w:ascii="Arial" w:hAnsi="Arial" w:cs="Arial"/>
-          <w:color w:val="000000" w:themeColor="text1"/>
-        </w:rPr>
-        <w:lastRenderedPageBreak/>
-        <w:t xml:space="preserve">y verificar previo a la realización de los pagos, que </w:t>
+        <w:t xml:space="preserve">Exigir y verificar previo a la realización de los pagos, que </w:t>
       </w:r>
       <w:r>
         <w:rPr>
@@ -4025,6 +3526,7 @@
     <w:p>
       <w:pPr>
         <w:spacing w:line="300" w:lineRule="auto"/>
+        <w:ind w:right="-283"/>
         <w:jc w:val="both"/>
       </w:pPr>
       <w:r>
@@ -4077,7 +3579,7 @@
         <w:autoSpaceDE w:val="0"/>
         <w:autoSpaceDN w:val="0"/>
         <w:adjustRightInd w:val="0"/>
-        <w:ind w:left="708" w:right="-374"/>
+        <w:ind w:right="-374"/>
         <w:jc w:val="both"/>
         <w:rPr>
           <w:rFonts w:ascii="Arial" w:eastAsia="Calibri" w:hAnsi="Arial" w:cs="Arial"/>
@@ -4140,6 +3642,7 @@
       <w:pPr>
         <w:suppressAutoHyphens/>
         <w:spacing w:before="240" w:after="240"/>
+        <w:ind w:right="-425"/>
         <w:jc w:val="both"/>
         <w:rPr>
           <w:rFonts w:ascii="Arial" w:hAnsi="Arial" w:cs="Arial"/>
@@ -4207,7 +3710,15 @@
           <w:rFonts w:eastAsiaTheme="minorEastAsia"/>
           <w:color w:val="000000" w:themeColor="text1"/>
         </w:rPr>
-        <w:t xml:space="preserve"> es inferior a veinte (20) salarios mínimos legales mensuales vigentes (SMMLV), no se exigirá la constitución de garantías, atendiendo la naturaleza del objeto, la modalidad de contratación y la justificación contenida en los estudios previos, conforme a la normativa vigente y al Manual de Contratación de la EMPRESA DE PARQUES Y EVENTOS DE ANTIOQUIA – ACTIVA. No obstante, la entidad podrá exigir garantías cuando lo considere necesario para proteger los intereses públicos, dejando constancia de la motivación en los documentos del proceso</w:t>
+        <w:t xml:space="preserve"> es inferior a veinte (20) salarios mínimos legales mensuales vigentes (SMMLV), no se exigirá la constitución de garantías, atendiendo la naturaleza del objeto, la modalidad de contratación y la justificación contenida en los estudios previos, </w:t>
+      </w:r>
+      <w:r>
+        <w:rPr>
+          <w:rFonts w:eastAsiaTheme="minorEastAsia"/>
+          <w:color w:val="000000" w:themeColor="text1"/>
+        </w:rPr>
+        <w:lastRenderedPageBreak/>
+        <w:t>conforme a la normativa vigente y al Manual de Contratación de la EMPRESA DE PARQUES Y EVENTOS DE ANTIOQUIA – ACTIVA. No obstante, la entidad podrá exigir garantías cuando lo considere necesario para proteger los intereses públicos, dejando constancia de la motivación en los documentos del proceso</w:t>
       </w:r>
       <w:r>
         <w:rPr>
@@ -4222,6 +3733,7 @@
       <w:pPr>
         <w:suppressAutoHyphens/>
         <w:spacing w:before="240" w:after="240"/>
+        <w:ind w:right="-425"/>
         <w:jc w:val="both"/>
         <w:rPr>
           <w:rFonts w:ascii="Arial" w:hAnsi="Arial" w:cs="Arial"/>
@@ -4268,22 +3780,22 @@
       <w:pPr>
         <w:suppressAutoHyphens/>
         <w:spacing w:before="240" w:after="240"/>
-        <w:jc w:val="both"/>
-        <w:rPr>
-          <w:rFonts w:ascii="Arial" w:hAnsi="Arial" w:cs="Arial"/>
-          <w:color w:val="000000" w:themeColor="text1"/>
-          <w:spacing w:val="-3"/>
-        </w:rPr>
-      </w:pPr>
-      <w:r>
-        <w:rPr>
-          <w:rFonts w:ascii="Arial" w:hAnsi="Arial" w:cs="Arial"/>
-          <w:b/>
-          <w:bCs/>
-          <w:color w:val="000000" w:themeColor="text1"/>
-          <w:spacing w:val="-3"/>
-        </w:rPr>
-        <w:lastRenderedPageBreak/>
+        <w:ind w:right="-425"/>
+        <w:jc w:val="both"/>
+        <w:rPr>
+          <w:rFonts w:ascii="Arial" w:hAnsi="Arial" w:cs="Arial"/>
+          <w:color w:val="000000" w:themeColor="text1"/>
+          <w:spacing w:val="-3"/>
+        </w:rPr>
+      </w:pPr>
+      <w:r>
+        <w:rPr>
+          <w:rFonts w:ascii="Arial" w:hAnsi="Arial" w:cs="Arial"/>
+          <w:b/>
+          <w:bCs/>
+          <w:color w:val="000000" w:themeColor="text1"/>
+          <w:spacing w:val="-3"/>
+        </w:rPr>
         <w:t xml:space="preserve">DÉCIMA SEGUNDA: CESIÓN Y SUBCONTRATACIÓN. </w:t>
       </w:r>
       <w:r>
@@ -4920,7 +4432,14 @@
         <w:rPr>
           <w:rFonts w:ascii="Arial" w:hAnsi="Arial" w:cs="Arial"/>
         </w:rPr>
-        <w:t xml:space="preserve">se compromete a responder por su cuenta y riesgo, todo aquel requerimiento, reclamación o presentación de informes, si con posterioridad a la terminación de este contrato llegare a necesitar </w:t>
+        <w:t xml:space="preserve">se compromete a responder por su cuenta y riesgo, todo aquel requerimiento, reclamación o presentación de informes, si con posterioridad a la </w:t>
+      </w:r>
+      <w:r>
+        <w:rPr>
+          <w:rFonts w:ascii="Arial" w:hAnsi="Arial" w:cs="Arial"/>
+        </w:rPr>
+        <w:lastRenderedPageBreak/>
+        <w:t xml:space="preserve">terminación de este contrato llegare a necesitar </w:t>
       </w:r>
       <w:r>
         <w:rPr>
@@ -5111,16 +4630,7 @@
           <w:color w:val="000000" w:themeColor="text1"/>
           <w:spacing w:val="-3"/>
         </w:rPr>
-        <w:t xml:space="preserve"> por las </w:t>
-      </w:r>
-      <w:r>
-        <w:rPr>
-          <w:rFonts w:ascii="Arial" w:hAnsi="Arial" w:cs="Arial"/>
-          <w:color w:val="000000" w:themeColor="text1"/>
-          <w:spacing w:val="-3"/>
-        </w:rPr>
-        <w:lastRenderedPageBreak/>
-        <w:t xml:space="preserve">partes. Para su ejecución se requiere el Registro Presupuestal, la asignación del Supervisor y la firma del Acta de </w:t>
+        <w:t xml:space="preserve"> por las partes. Para su ejecución se requiere el Registro Presupuestal, la asignación del Supervisor y la firma del Acta de </w:t>
       </w:r>
       <w:r>
         <w:rPr>
@@ -5449,6 +4959,7 @@
       <w:pPr>
         <w:suppressAutoHyphens/>
         <w:spacing w:before="240" w:after="240"/>
+        <w:ind w:right="-425"/>
         <w:jc w:val="both"/>
         <w:rPr>
           <w:rFonts w:ascii="Arial" w:eastAsia="Arial" w:hAnsi="Arial" w:cs="Arial"/>
@@ -5485,6 +4996,7 @@
       <w:pPr>
         <w:suppressAutoHyphens/>
         <w:spacing w:before="240" w:after="240"/>
+        <w:ind w:right="-425"/>
         <w:jc w:val="both"/>
         <w:rPr>
           <w:rFonts w:ascii="Arial" w:eastAsia="Arial" w:hAnsi="Arial" w:cs="Arial"/>
@@ -5521,6 +5033,7 @@
       <w:pPr>
         <w:suppressAutoHyphens/>
         <w:spacing w:before="240" w:after="240"/>
+        <w:ind w:right="-425"/>
         <w:jc w:val="both"/>
         <w:rPr>
           <w:rStyle w:val="normaltextrun"/>
@@ -5537,6 +5050,7 @@
           <w:bCs/>
           <w:color w:val="000000" w:themeColor="text1"/>
         </w:rPr>
+        <w:lastRenderedPageBreak/>
         <w:t xml:space="preserve">VIGÉSIMA </w:t>
       </w:r>
       <w:r>
@@ -5574,7 +5088,7 @@
             <w:rStyle w:val="Hipervnculo"/>
             <w:rFonts w:ascii="Arial" w:hAnsi="Arial" w:cs="Arial"/>
           </w:rPr>
-          <w:t xml:space="preserve">{email_contratista}</w:t>
+          <w:t>{email_contratista}</w:t>
         </w:r>
       </w:hyperlink>
     </w:p>
@@ -5623,84 +5137,7 @@
           <w:rFonts w:ascii="Arial" w:hAnsi="Arial" w:cs="Arial"/>
           <w:color w:val="000000" w:themeColor="text1"/>
         </w:rPr>
-        <w:t xml:space="preserve">{fecha_firma_letras}</w:t>
-      </w:r>
-      <w:r>
-        <w:rPr>
-          <w:rFonts w:ascii="Arial" w:hAnsi="Arial" w:cs="Arial"/>
-          <w:color w:val="000000" w:themeColor="text1"/>
-        </w:rPr>
-        <w:t xml:space="preserve"/>
-      </w:r>
-      <w:r>
-        <w:rPr>
-          <w:rFonts w:ascii="Arial" w:hAnsi="Arial" w:cs="Arial"/>
-          <w:color w:val="000000" w:themeColor="text1"/>
-        </w:rPr>
-        <w:t/>
-      </w:r>
-      <w:r>
-        <w:rPr>
-          <w:rFonts w:ascii="Arial" w:hAnsi="Arial" w:cs="Arial"/>
-          <w:color w:val="000000" w:themeColor="text1"/>
-        </w:rPr>
-        <w:t/>
-      </w:r>
-      <w:r>
-        <w:rPr>
-          <w:rFonts w:ascii="Arial" w:hAnsi="Arial" w:cs="Arial"/>
-          <w:color w:val="000000" w:themeColor="text1"/>
-        </w:rPr>
-        <w:t/>
-      </w:r>
-      <w:r>
-        <w:rPr>
-          <w:rFonts w:ascii="Arial" w:hAnsi="Arial" w:cs="Arial"/>
-          <w:color w:val="000000" w:themeColor="text1"/>
-        </w:rPr>
-        <w:t/>
-      </w:r>
-      <w:r>
-        <w:rPr>
-          <w:rFonts w:ascii="Arial" w:hAnsi="Arial" w:cs="Arial"/>
-          <w:color w:val="000000" w:themeColor="text1"/>
-        </w:rPr>
-        <w:t xml:space="preserve"/>
-      </w:r>
-      <w:r>
-        <w:rPr>
-          <w:rFonts w:ascii="Arial" w:hAnsi="Arial" w:cs="Arial"/>
-          <w:color w:val="000000" w:themeColor="text1"/>
-        </w:rPr>
-        <w:t xml:space="preserve"/>
-      </w:r>
-      <w:r>
-        <w:rPr>
-          <w:rFonts w:ascii="Arial" w:hAnsi="Arial" w:cs="Arial"/>
-          <w:color w:val="000000" w:themeColor="text1"/>
-        </w:rPr>
-        <w:t/>
-      </w:r>
-      <w:r>
-        <w:rPr>
-          <w:rFonts w:ascii="Arial" w:hAnsi="Arial" w:cs="Arial"/>
-          <w:color w:val="000000" w:themeColor="text1"/>
-        </w:rPr>
-        <w:t xml:space="preserve"/>
-      </w:r>
-      <w:r>
-        <w:rPr>
-          <w:rFonts w:ascii="Arial" w:hAnsi="Arial" w:cs="Arial"/>
-          <w:color w:val="000000" w:themeColor="text1"/>
-        </w:rPr>
-        <w:t/>
-      </w:r>
-      <w:r>
-        <w:rPr>
-          <w:rFonts w:ascii="Arial" w:hAnsi="Arial" w:cs="Arial"/>
-          <w:color w:val="000000" w:themeColor="text1"/>
-        </w:rPr>
-        <w:t/>
+        <w:t>{fecha_firma_letras}</w:t>
       </w:r>
     </w:p>
     <w:p>
@@ -5908,16 +5345,22 @@
           <w:bCs/>
           <w:lang w:val="pt-BR"/>
         </w:rPr>
-        <w:t xml:space="preserve">{nombre_contratista}</w:t>
-      </w:r>
-      <w:r>
+        <w:t>{nombre_contratista}</w:t>
+      </w:r>
+    </w:p>
+    <w:p>
+      <w:pPr>
+        <w:ind w:right="-425"/>
+        <w:jc w:val="both"/>
         <w:rPr>
           <w:rFonts w:ascii="Arial" w:eastAsia="Calibri" w:hAnsi="Arial" w:cs="Arial"/>
-          <w:b/>
-          <w:bCs/>
-          <w:lang w:val="pt-BR"/>
-        </w:rPr>
-        <w:t xml:space="preserve"/>
+        </w:rPr>
+      </w:pPr>
+      <w:r>
+        <w:rPr>
+          <w:rFonts w:ascii="Arial" w:eastAsia="Calibri" w:hAnsi="Arial" w:cs="Arial"/>
+        </w:rPr>
+        <w:t xml:space="preserve">CONTRATISTA </w:t>
       </w:r>
     </w:p>
     <w:p>
@@ -5928,37 +5371,518 @@
           <w:rFonts w:ascii="Arial" w:eastAsia="Calibri" w:hAnsi="Arial" w:cs="Arial"/>
         </w:rPr>
       </w:pPr>
-      <w:r>
+    </w:p>
+    <w:p>
+      <w:pPr>
+        <w:ind w:right="-425"/>
+        <w:jc w:val="both"/>
         <w:rPr>
           <w:rFonts w:ascii="Arial" w:eastAsia="Calibri" w:hAnsi="Arial" w:cs="Arial"/>
         </w:rPr>
-        <w:t xml:space="preserve">CONTRATISTA </w:t>
-      </w:r>
-    </w:p>
+      </w:pPr>
+    </w:p>
+    <w:tbl>
+      <w:tblPr>
+        <w:tblW w:w="0" w:type="auto"/>
+        <w:tblLook w:val="04A0" w:firstRow="1" w:lastRow="0" w:firstColumn="1" w:lastColumn="0" w:noHBand="0" w:noVBand="1"/>
+      </w:tblPr>
+      <w:tblGrid>
+        <w:gridCol w:w="1550"/>
+        <w:gridCol w:w="4058"/>
+        <w:gridCol w:w="3161"/>
+      </w:tblGrid>
+      <w:tr>
+        <w:trPr>
+          <w:trHeight w:val="195"/>
+        </w:trPr>
+        <w:tc>
+          <w:tcPr>
+            <w:tcW w:w="1550" w:type="dxa"/>
+            <w:tcBorders>
+              <w:top w:val="single" w:sz="8" w:space="0" w:color="auto"/>
+              <w:left w:val="single" w:sz="8" w:space="0" w:color="auto"/>
+              <w:bottom w:val="single" w:sz="8" w:space="0" w:color="auto"/>
+              <w:right w:val="single" w:sz="8" w:space="0" w:color="auto"/>
+            </w:tcBorders>
+          </w:tcPr>
+          <w:p>
+            <w:pPr>
+              <w:ind w:right="-425"/>
+              <w:jc w:val="both"/>
+              <w:rPr>
+                <w:rFonts w:ascii="Arial" w:eastAsia="Calibri" w:hAnsi="Arial" w:cs="Arial"/>
+                <w:sz w:val="16"/>
+                <w:szCs w:val="16"/>
+              </w:rPr>
+            </w:pPr>
+          </w:p>
+        </w:tc>
+        <w:tc>
+          <w:tcPr>
+            <w:tcW w:w="4058" w:type="dxa"/>
+            <w:tcBorders>
+              <w:top w:val="single" w:sz="8" w:space="0" w:color="auto"/>
+              <w:left w:val="single" w:sz="8" w:space="0" w:color="auto"/>
+              <w:bottom w:val="single" w:sz="8" w:space="0" w:color="auto"/>
+              <w:right w:val="single" w:sz="8" w:space="0" w:color="auto"/>
+            </w:tcBorders>
+            <w:hideMark/>
+          </w:tcPr>
+          <w:p>
+            <w:pPr>
+              <w:ind w:right="-425"/>
+              <w:jc w:val="both"/>
+              <w:rPr>
+                <w:rFonts w:ascii="Arial" w:eastAsia="Calibri" w:hAnsi="Arial" w:cs="Arial"/>
+                <w:sz w:val="16"/>
+                <w:szCs w:val="16"/>
+              </w:rPr>
+            </w:pPr>
+            <w:r>
+              <w:rPr>
+                <w:rFonts w:ascii="Arial" w:eastAsia="Calibri" w:hAnsi="Arial" w:cs="Arial"/>
+                <w:sz w:val="16"/>
+                <w:szCs w:val="16"/>
+              </w:rPr>
+              <w:t>NOMBRE</w:t>
+            </w:r>
+          </w:p>
+        </w:tc>
+        <w:tc>
+          <w:tcPr>
+            <w:tcW w:w="3161" w:type="dxa"/>
+            <w:tcBorders>
+              <w:top w:val="single" w:sz="8" w:space="0" w:color="auto"/>
+              <w:left w:val="single" w:sz="8" w:space="0" w:color="auto"/>
+              <w:bottom w:val="single" w:sz="8" w:space="0" w:color="auto"/>
+              <w:right w:val="single" w:sz="8" w:space="0" w:color="auto"/>
+            </w:tcBorders>
+            <w:hideMark/>
+          </w:tcPr>
+          <w:p>
+            <w:pPr>
+              <w:ind w:right="-425"/>
+              <w:jc w:val="both"/>
+              <w:rPr>
+                <w:rFonts w:ascii="Arial" w:eastAsia="Calibri" w:hAnsi="Arial" w:cs="Arial"/>
+                <w:sz w:val="16"/>
+                <w:szCs w:val="16"/>
+              </w:rPr>
+            </w:pPr>
+            <w:r>
+              <w:rPr>
+                <w:rFonts w:ascii="Arial" w:eastAsia="Calibri" w:hAnsi="Arial" w:cs="Arial"/>
+                <w:sz w:val="16"/>
+                <w:szCs w:val="16"/>
+              </w:rPr>
+              <w:t>FIRMA</w:t>
+            </w:r>
+          </w:p>
+        </w:tc>
+      </w:tr>
+      <w:tr>
+        <w:trPr>
+          <w:trHeight w:val="210"/>
+        </w:trPr>
+        <w:tc>
+          <w:tcPr>
+            <w:tcW w:w="1550" w:type="dxa"/>
+            <w:tcBorders>
+              <w:top w:val="single" w:sz="8" w:space="0" w:color="auto"/>
+              <w:left w:val="single" w:sz="8" w:space="0" w:color="auto"/>
+              <w:bottom w:val="single" w:sz="8" w:space="0" w:color="auto"/>
+              <w:right w:val="single" w:sz="8" w:space="0" w:color="auto"/>
+            </w:tcBorders>
+            <w:hideMark/>
+          </w:tcPr>
+          <w:p>
+            <w:pPr>
+              <w:ind w:right="-425"/>
+              <w:jc w:val="both"/>
+              <w:rPr>
+                <w:rFonts w:ascii="Arial" w:eastAsia="Calibri" w:hAnsi="Arial" w:cs="Arial"/>
+                <w:sz w:val="16"/>
+                <w:szCs w:val="16"/>
+              </w:rPr>
+            </w:pPr>
+            <w:r>
+              <w:rPr>
+                <w:rFonts w:ascii="Arial" w:eastAsia="Calibri" w:hAnsi="Arial" w:cs="Arial"/>
+                <w:sz w:val="16"/>
+                <w:szCs w:val="16"/>
+              </w:rPr>
+              <w:t>Proyectó:</w:t>
+            </w:r>
+          </w:p>
+        </w:tc>
+        <w:tc>
+          <w:tcPr>
+            <w:tcW w:w="4058" w:type="dxa"/>
+            <w:tcBorders>
+              <w:top w:val="single" w:sz="8" w:space="0" w:color="auto"/>
+              <w:left w:val="single" w:sz="8" w:space="0" w:color="auto"/>
+              <w:bottom w:val="single" w:sz="8" w:space="0" w:color="auto"/>
+              <w:right w:val="single" w:sz="8" w:space="0" w:color="auto"/>
+            </w:tcBorders>
+          </w:tcPr>
+          <w:p>
+            <w:pPr>
+              <w:ind w:right="-425"/>
+              <w:jc w:val="both"/>
+              <w:rPr>
+                <w:rFonts w:ascii="Arial" w:eastAsia="Calibri" w:hAnsi="Arial" w:cs="Arial"/>
+                <w:sz w:val="16"/>
+                <w:szCs w:val="16"/>
+              </w:rPr>
+            </w:pPr>
+            <w:r>
+              <w:rPr>
+                <w:rFonts w:ascii="Arial" w:eastAsia="Calibri" w:hAnsi="Arial" w:cs="Arial"/>
+                <w:sz w:val="16"/>
+                <w:szCs w:val="16"/>
+              </w:rPr>
+              <w:t xml:space="preserve">{proyecto}</w:t>
+            </w:r>
+          </w:p>
+        </w:tc>
+        <w:tc>
+          <w:tcPr>
+            <w:tcW w:w="3161" w:type="dxa"/>
+            <w:tcBorders>
+              <w:top w:val="single" w:sz="8" w:space="0" w:color="auto"/>
+              <w:left w:val="single" w:sz="8" w:space="0" w:color="auto"/>
+              <w:bottom w:val="single" w:sz="8" w:space="0" w:color="auto"/>
+              <w:right w:val="single" w:sz="8" w:space="0" w:color="auto"/>
+            </w:tcBorders>
+            <w:hideMark/>
+          </w:tcPr>
+          <w:p>
+            <w:pPr>
+              <w:ind w:right="-425"/>
+              <w:jc w:val="both"/>
+              <w:rPr>
+                <w:rFonts w:ascii="Arial" w:eastAsia="Calibri" w:hAnsi="Arial" w:cs="Arial"/>
+                <w:sz w:val="16"/>
+                <w:szCs w:val="16"/>
+              </w:rPr>
+            </w:pPr>
+            <w:r>
+              <w:rPr>
+                <w:rFonts w:ascii="Arial" w:eastAsia="Calibri" w:hAnsi="Arial" w:cs="Arial"/>
+                <w:sz w:val="16"/>
+                <w:szCs w:val="16"/>
+              </w:rPr>
+              <w:t xml:space="preserve"> </w:t>
+            </w:r>
+          </w:p>
+        </w:tc>
+      </w:tr>
+      <w:tr>
+        <w:trPr>
+          <w:trHeight w:val="150"/>
+        </w:trPr>
+        <w:tc>
+          <w:tcPr>
+            <w:tcW w:w="1550" w:type="dxa"/>
+            <w:tcBorders>
+              <w:top w:val="single" w:sz="8" w:space="0" w:color="auto"/>
+              <w:left w:val="single" w:sz="8" w:space="0" w:color="auto"/>
+              <w:bottom w:val="single" w:sz="8" w:space="0" w:color="auto"/>
+              <w:right w:val="single" w:sz="8" w:space="0" w:color="auto"/>
+            </w:tcBorders>
+            <w:hideMark/>
+          </w:tcPr>
+          <w:p>
+            <w:pPr>
+              <w:ind w:right="-425"/>
+              <w:jc w:val="both"/>
+              <w:rPr>
+                <w:rFonts w:ascii="Arial" w:eastAsia="Calibri" w:hAnsi="Arial" w:cs="Arial"/>
+                <w:sz w:val="16"/>
+                <w:szCs w:val="16"/>
+              </w:rPr>
+            </w:pPr>
+            <w:r>
+              <w:rPr>
+                <w:rFonts w:ascii="Arial" w:eastAsia="Calibri" w:hAnsi="Arial" w:cs="Arial"/>
+                <w:sz w:val="16"/>
+                <w:szCs w:val="16"/>
+              </w:rPr>
+              <w:t>Revis</w:t>
+            </w:r>
+            <w:r>
+              <w:rPr>
+                <w:rFonts w:ascii="Arial" w:eastAsia="Calibri" w:hAnsi="Arial" w:cs="Arial"/>
+                <w:sz w:val="16"/>
+                <w:szCs w:val="16"/>
+              </w:rPr>
+              <w:t>ión jurídica</w:t>
+            </w:r>
+          </w:p>
+        </w:tc>
+        <w:tc>
+          <w:tcPr>
+            <w:tcW w:w="4058" w:type="dxa"/>
+            <w:tcBorders>
+              <w:top w:val="single" w:sz="8" w:space="0" w:color="auto"/>
+              <w:left w:val="single" w:sz="8" w:space="0" w:color="auto"/>
+              <w:bottom w:val="single" w:sz="8" w:space="0" w:color="auto"/>
+              <w:right w:val="single" w:sz="8" w:space="0" w:color="auto"/>
+            </w:tcBorders>
+          </w:tcPr>
+          <w:p>
+            <w:pPr>
+              <w:ind w:right="-425"/>
+              <w:jc w:val="both"/>
+              <w:rPr>
+                <w:rFonts w:ascii="Arial" w:eastAsia="Calibri" w:hAnsi="Arial" w:cs="Arial"/>
+                <w:sz w:val="16"/>
+                <w:szCs w:val="16"/>
+              </w:rPr>
+            </w:pPr>
+            <w:r>
+              <w:rPr>
+                <w:rFonts w:ascii="Arial" w:eastAsia="Calibri" w:hAnsi="Arial" w:cs="Arial"/>
+                <w:sz w:val="16"/>
+                <w:szCs w:val="16"/>
+              </w:rPr>
+              <w:t xml:space="preserve">{revision_juridica}</w:t>
+            </w:r>
+          </w:p>
+        </w:tc>
+        <w:tc>
+          <w:tcPr>
+            <w:tcW w:w="3161" w:type="dxa"/>
+            <w:tcBorders>
+              <w:top w:val="single" w:sz="8" w:space="0" w:color="auto"/>
+              <w:left w:val="single" w:sz="8" w:space="0" w:color="auto"/>
+              <w:bottom w:val="single" w:sz="8" w:space="0" w:color="auto"/>
+              <w:right w:val="single" w:sz="8" w:space="0" w:color="auto"/>
+            </w:tcBorders>
+            <w:hideMark/>
+          </w:tcPr>
+          <w:p>
+            <w:pPr>
+              <w:ind w:right="-425"/>
+              <w:jc w:val="both"/>
+              <w:rPr>
+                <w:rFonts w:ascii="Arial" w:eastAsia="Calibri" w:hAnsi="Arial" w:cs="Arial"/>
+                <w:sz w:val="16"/>
+                <w:szCs w:val="16"/>
+              </w:rPr>
+            </w:pPr>
+            <w:r>
+              <w:rPr>
+                <w:rFonts w:ascii="Arial" w:eastAsia="Calibri" w:hAnsi="Arial" w:cs="Arial"/>
+                <w:sz w:val="16"/>
+                <w:szCs w:val="16"/>
+              </w:rPr>
+              <w:t xml:space="preserve"> </w:t>
+            </w:r>
+          </w:p>
+        </w:tc>
+      </w:tr>
+      <w:tr>
+        <w:trPr>
+          <w:trHeight w:val="150"/>
+        </w:trPr>
+        <w:tc>
+          <w:tcPr>
+            <w:tcW w:w="1550" w:type="dxa"/>
+            <w:tcBorders>
+              <w:top w:val="single" w:sz="8" w:space="0" w:color="auto"/>
+              <w:left w:val="single" w:sz="8" w:space="0" w:color="auto"/>
+              <w:bottom w:val="single" w:sz="8" w:space="0" w:color="auto"/>
+              <w:right w:val="single" w:sz="8" w:space="0" w:color="auto"/>
+            </w:tcBorders>
+            <w:hideMark/>
+          </w:tcPr>
+          <w:p>
+            <w:pPr>
+              <w:ind w:right="-425"/>
+              <w:jc w:val="both"/>
+              <w:rPr>
+                <w:rFonts w:ascii="Arial" w:eastAsia="Calibri" w:hAnsi="Arial" w:cs="Arial"/>
+                <w:sz w:val="16"/>
+                <w:szCs w:val="16"/>
+              </w:rPr>
+            </w:pPr>
+            <w:r>
+              <w:rPr>
+                <w:rFonts w:ascii="Arial" w:eastAsia="Calibri" w:hAnsi="Arial" w:cs="Arial"/>
+                <w:sz w:val="16"/>
+                <w:szCs w:val="16"/>
+              </w:rPr>
+              <w:t>Revis</w:t>
+            </w:r>
+            <w:r>
+              <w:rPr>
+                <w:rFonts w:ascii="Arial" w:eastAsia="Calibri" w:hAnsi="Arial" w:cs="Arial"/>
+                <w:sz w:val="16"/>
+                <w:szCs w:val="16"/>
+              </w:rPr>
+              <w:t>ión financiera</w:t>
+            </w:r>
+          </w:p>
+        </w:tc>
+        <w:tc>
+          <w:tcPr>
+            <w:tcW w:w="4058" w:type="dxa"/>
+            <w:tcBorders>
+              <w:top w:val="single" w:sz="8" w:space="0" w:color="auto"/>
+              <w:left w:val="single" w:sz="8" w:space="0" w:color="auto"/>
+              <w:bottom w:val="single" w:sz="8" w:space="0" w:color="auto"/>
+              <w:right w:val="single" w:sz="8" w:space="0" w:color="auto"/>
+            </w:tcBorders>
+          </w:tcPr>
+          <w:p>
+            <w:pPr>
+              <w:ind w:right="-425"/>
+              <w:jc w:val="both"/>
+              <w:rPr>
+                <w:rFonts w:ascii="Arial" w:eastAsia="Calibri" w:hAnsi="Arial" w:cs="Arial"/>
+                <w:sz w:val="16"/>
+                <w:szCs w:val="16"/>
+              </w:rPr>
+            </w:pPr>
+            <w:r>
+              <w:rPr>
+                <w:rFonts w:ascii="Arial" w:eastAsia="Calibri" w:hAnsi="Arial" w:cs="Arial"/>
+                <w:sz w:val="16"/>
+                <w:szCs w:val="16"/>
+              </w:rPr>
+              <w:t xml:space="preserve">{revision_financiera}</w:t>
+            </w:r>
+          </w:p>
+        </w:tc>
+        <w:tc>
+          <w:tcPr>
+            <w:tcW w:w="3161" w:type="dxa"/>
+            <w:tcBorders>
+              <w:top w:val="single" w:sz="8" w:space="0" w:color="auto"/>
+              <w:left w:val="single" w:sz="8" w:space="0" w:color="auto"/>
+              <w:bottom w:val="single" w:sz="8" w:space="0" w:color="auto"/>
+              <w:right w:val="single" w:sz="8" w:space="0" w:color="auto"/>
+            </w:tcBorders>
+            <w:hideMark/>
+          </w:tcPr>
+          <w:p>
+            <w:pPr>
+              <w:ind w:right="-425"/>
+              <w:jc w:val="both"/>
+              <w:rPr>
+                <w:rFonts w:ascii="Arial" w:eastAsia="Calibri" w:hAnsi="Arial" w:cs="Arial"/>
+                <w:sz w:val="16"/>
+                <w:szCs w:val="16"/>
+              </w:rPr>
+            </w:pPr>
+            <w:r>
+              <w:rPr>
+                <w:rFonts w:ascii="Arial" w:eastAsia="Calibri" w:hAnsi="Arial" w:cs="Arial"/>
+                <w:sz w:val="16"/>
+                <w:szCs w:val="16"/>
+              </w:rPr>
+              <w:t xml:space="preserve"> </w:t>
+            </w:r>
+          </w:p>
+        </w:tc>
+      </w:tr>
+      <w:tr>
+        <w:trPr>
+          <w:trHeight w:val="255"/>
+        </w:trPr>
+        <w:tc>
+          <w:tcPr>
+            <w:tcW w:w="1550" w:type="dxa"/>
+            <w:tcBorders>
+              <w:top w:val="single" w:sz="8" w:space="0" w:color="auto"/>
+              <w:left w:val="single" w:sz="8" w:space="0" w:color="auto"/>
+              <w:bottom w:val="single" w:sz="8" w:space="0" w:color="auto"/>
+              <w:right w:val="single" w:sz="8" w:space="0" w:color="auto"/>
+            </w:tcBorders>
+            <w:hideMark/>
+          </w:tcPr>
+          <w:p>
+            <w:pPr>
+              <w:ind w:right="-425"/>
+              <w:jc w:val="both"/>
+              <w:rPr>
+                <w:rFonts w:ascii="Arial" w:eastAsia="Calibri" w:hAnsi="Arial" w:cs="Arial"/>
+                <w:sz w:val="16"/>
+                <w:szCs w:val="16"/>
+              </w:rPr>
+            </w:pPr>
+            <w:r>
+              <w:rPr>
+                <w:rFonts w:ascii="Arial" w:eastAsia="Calibri" w:hAnsi="Arial" w:cs="Arial"/>
+                <w:sz w:val="16"/>
+                <w:szCs w:val="16"/>
+              </w:rPr>
+              <w:t xml:space="preserve">Aprobó: </w:t>
+            </w:r>
+          </w:p>
+        </w:tc>
+        <w:tc>
+          <w:tcPr>
+            <w:tcW w:w="4058" w:type="dxa"/>
+            <w:tcBorders>
+              <w:top w:val="single" w:sz="8" w:space="0" w:color="auto"/>
+              <w:left w:val="single" w:sz="8" w:space="0" w:color="auto"/>
+              <w:bottom w:val="single" w:sz="8" w:space="0" w:color="auto"/>
+              <w:right w:val="single" w:sz="8" w:space="0" w:color="auto"/>
+            </w:tcBorders>
+          </w:tcPr>
+          <w:p>
+            <w:pPr>
+              <w:ind w:right="-425"/>
+              <w:jc w:val="both"/>
+              <w:rPr>
+                <w:rFonts w:ascii="Arial" w:eastAsia="Calibri" w:hAnsi="Arial" w:cs="Arial"/>
+                <w:sz w:val="16"/>
+                <w:szCs w:val="16"/>
+              </w:rPr>
+            </w:pPr>
+            <w:r>
+              <w:rPr>
+                <w:rFonts w:ascii="Arial" w:eastAsia="Calibri" w:hAnsi="Arial" w:cs="Arial"/>
+                <w:sz w:val="16"/>
+                <w:szCs w:val="16"/>
+              </w:rPr>
+              <w:t xml:space="preserve">{aprobo}</w:t>
+            </w:r>
+          </w:p>
+        </w:tc>
+        <w:tc>
+          <w:tcPr>
+            <w:tcW w:w="3161" w:type="dxa"/>
+            <w:tcBorders>
+              <w:top w:val="single" w:sz="8" w:space="0" w:color="auto"/>
+              <w:left w:val="single" w:sz="8" w:space="0" w:color="auto"/>
+              <w:bottom w:val="single" w:sz="8" w:space="0" w:color="auto"/>
+              <w:right w:val="single" w:sz="8" w:space="0" w:color="auto"/>
+            </w:tcBorders>
+          </w:tcPr>
+          <w:p>
+            <w:pPr>
+              <w:ind w:right="-425"/>
+              <w:jc w:val="both"/>
+              <w:rPr>
+                <w:rFonts w:ascii="Arial" w:eastAsia="Calibri" w:hAnsi="Arial" w:cs="Arial"/>
+                <w:sz w:val="16"/>
+                <w:szCs w:val="16"/>
+              </w:rPr>
+            </w:pPr>
+          </w:p>
+        </w:tc>
+      </w:tr>
+    </w:tbl>
     <w:p>
       <w:pPr>
         <w:ind w:right="-425"/>
         <w:jc w:val="both"/>
         <w:rPr>
           <w:rFonts w:ascii="Arial" w:eastAsia="Calibri" w:hAnsi="Arial" w:cs="Arial"/>
-        </w:rPr>
-      </w:pPr>
-    </w:p>
-    <w:p>
-      <w:pPr>
-        <w:ind w:right="-425"/>
-        <w:jc w:val="both"/>
-        <w:rPr>
-          <w:rFonts w:ascii="Arial" w:eastAsia="Calibri" w:hAnsi="Arial" w:cs="Arial"/>
-        </w:rPr>
-      </w:pPr>
-    </w:p>
-    <w:p>
-      <w:pPr>
-        <w:ind w:right="-425"/>
-        <w:jc w:val="both"/>
-        <w:rPr>
-          <w:rFonts w:ascii="Arial" w:eastAsia="Calibri" w:hAnsi="Arial" w:cs="Arial"/>
+          <w:lang w:val="es-CO"/>
         </w:rPr>
       </w:pPr>
     </w:p>
@@ -7811,7 +7735,6 @@
   <w:style w:type="character" w:default="1" w:styleId="Fuentedeprrafopredeter">
     <w:name w:val="Default Paragraph Font"/>
     <w:uiPriority w:val="1"/>
-    <w:semiHidden/>
     <w:unhideWhenUsed/>
   </w:style>
   <w:style w:type="table" w:default="1" w:styleId="Tablanormal">
@@ -9948,17 +9871,6 @@
 </file>
 
 <file path=customXml/item1.xml><?xml version="1.0" encoding="utf-8"?>
-<p:properties xmlns:p="http://schemas.microsoft.com/office/2006/metadata/properties" xmlns:xsi="http://www.w3.org/2001/XMLSchema-instance" xmlns:pc="http://schemas.microsoft.com/office/infopath/2007/PartnerControls">
-  <documentManagement>
-    <TaxCatchAll xmlns="e817aef0-ee18-43df-8fb6-a8e286a8ac2b" xsi:nil="true"/>
-    <lcf76f155ced4ddcb4097134ff3c332f xmlns="0492cccb-6647-486e-854d-ea79f74918b5">
-      <Terms xmlns="http://schemas.microsoft.com/office/infopath/2007/PartnerControls"/>
-    </lcf76f155ced4ddcb4097134ff3c332f>
-  </documentManagement>
-</p:properties>
-</file>
-
-<file path=customXml/item2.xml><?xml version="1.0" encoding="utf-8"?>
 <ct:contentTypeSchema xmlns:ct="http://schemas.microsoft.com/office/2006/metadata/contentType" xmlns:ma="http://schemas.microsoft.com/office/2006/metadata/properties/metaAttributes" ct:_="" ma:_="" ma:contentTypeName="Documento" ma:contentTypeID="0x01010009D7B0C64E77F64B88D164F77CD540CE" ma:contentTypeVersion="20" ma:contentTypeDescription="Crear nuevo documento." ma:contentTypeScope="" ma:versionID="d8051832bc294fed6848679ea26f6dc1">
   <xsd:schema xmlns:xsd="http://www.w3.org/2001/XMLSchema" xmlns:xs="http://www.w3.org/2001/XMLSchema" xmlns:p="http://schemas.microsoft.com/office/2006/metadata/properties" xmlns:ns2="e817aef0-ee18-43df-8fb6-a8e286a8ac2b" xmlns:ns3="0492cccb-6647-486e-854d-ea79f74918b5" targetNamespace="http://schemas.microsoft.com/office/2006/metadata/properties" ma:root="true" ma:fieldsID="75340f7370c80217d15047bf2bf01844" ns2:_="" ns3:_="">
     <xsd:import namespace="e817aef0-ee18-43df-8fb6-a8e286a8ac2b"/>
@@ -10219,6 +10131,17 @@
 </ct:contentTypeSchema>
 </file>
 
+<file path=customXml/item2.xml><?xml version="1.0" encoding="utf-8"?>
+<p:properties xmlns:p="http://schemas.microsoft.com/office/2006/metadata/properties" xmlns:xsi="http://www.w3.org/2001/XMLSchema-instance" xmlns:pc="http://schemas.microsoft.com/office/infopath/2007/PartnerControls">
+  <documentManagement>
+    <TaxCatchAll xmlns="e817aef0-ee18-43df-8fb6-a8e286a8ac2b" xsi:nil="true"/>
+    <lcf76f155ced4ddcb4097134ff3c332f xmlns="0492cccb-6647-486e-854d-ea79f74918b5">
+      <Terms xmlns="http://schemas.microsoft.com/office/infopath/2007/PartnerControls"/>
+    </lcf76f155ced4ddcb4097134ff3c332f>
+  </documentManagement>
+</p:properties>
+</file>
+
 <file path=customXml/item3.xml><?xml version="1.0" encoding="utf-8"?>
 <?mso-contentType ?>
 <FormTemplates xmlns="http://schemas.microsoft.com/sharepoint/v3/contenttype/forms">
@@ -10229,17 +10152,6 @@
 </file>
 
 <file path=customXml/itemProps1.xml><?xml version="1.0" encoding="utf-8"?>
-<ds:datastoreItem xmlns:ds="http://schemas.openxmlformats.org/officeDocument/2006/customXml" ds:itemID="{450D9E2E-3E33-4BC6-ADC7-18A7ACCB1B1D}">
-  <ds:schemaRefs>
-    <ds:schemaRef ds:uri="http://schemas.microsoft.com/office/2006/metadata/properties"/>
-    <ds:schemaRef ds:uri="http://schemas.microsoft.com/office/infopath/2007/PartnerControls"/>
-    <ds:schemaRef ds:uri="e817aef0-ee18-43df-8fb6-a8e286a8ac2b"/>
-    <ds:schemaRef ds:uri="0492cccb-6647-486e-854d-ea79f74918b5"/>
-  </ds:schemaRefs>
-</ds:datastoreItem>
-</file>
-
-<file path=customXml/itemProps2.xml><?xml version="1.0" encoding="utf-8"?>
 <ds:datastoreItem xmlns:ds="http://schemas.openxmlformats.org/officeDocument/2006/customXml" ds:itemID="{F4E5EB90-5BAF-4863-892F-E288E4160F4D}">
   <ds:schemaRefs>
     <ds:schemaRef ds:uri="http://schemas.microsoft.com/office/2006/metadata/contentType"/>
@@ -10258,6 +10170,17 @@
 </ds:datastoreItem>
 </file>
 
+<file path=customXml/itemProps2.xml><?xml version="1.0" encoding="utf-8"?>
+<ds:datastoreItem xmlns:ds="http://schemas.openxmlformats.org/officeDocument/2006/customXml" ds:itemID="{450D9E2E-3E33-4BC6-ADC7-18A7ACCB1B1D}">
+  <ds:schemaRefs>
+    <ds:schemaRef ds:uri="http://schemas.microsoft.com/office/2006/metadata/properties"/>
+    <ds:schemaRef ds:uri="http://schemas.microsoft.com/office/infopath/2007/PartnerControls"/>
+    <ds:schemaRef ds:uri="e817aef0-ee18-43df-8fb6-a8e286a8ac2b"/>
+    <ds:schemaRef ds:uri="0492cccb-6647-486e-854d-ea79f74918b5"/>
+  </ds:schemaRefs>
+</ds:datastoreItem>
+</file>
+
 <file path=customXml/itemProps3.xml><?xml version="1.0" encoding="utf-8"?>
 <ds:datastoreItem xmlns:ds="http://schemas.openxmlformats.org/officeDocument/2006/customXml" ds:itemID="{14603871-D6DD-49BB-A886-8F65CE0FA38A}">
   <ds:schemaRefs>

</xml_diff>

<commit_message>
Actualizar plantilla oficial: responsables del documento y quitar campos de resolución (#7)
- Reemplaza plantilla_contrato.docx por la versión nueva e inserta en la
  tabla de firmas los marcadores {proyecto}, {revision_juridica},
  {revision_financiera} y {aprobo} (columna NOMBRE).
- Formulario: nueva sección "Responsables del documento" (Proyectó, Revisión
  jurídica, Revisión financiera, Aprobó) y se eliminan los campos Resolución
  N° y Fecha de la resolución (no usados en la plantilla). Se conservan CDP y
  CRP porque alimentan {presupuesto_texto} (cláusula SEXTA).
- datosPlantilla: mapea los 4 nuevos campos y, además, supervisor_nombre y
  supervisor_cargo, que tenían marcador en la plantilla pero no se rellenaban.
- Verificado con render real (docxtemplater): los 19 marcadores se completan
  y ninguno queda sin resolver.


Claude-Session: https://claude.ai/code/session_01RbqmWfif1ErCa4oEtLm5Ho

Co-authored-by: Claude <noreply@anthropic.com>
</commit_message>
<xml_diff>
--- a/plantilla_contrato.docx
+++ b/plantilla_contrato.docx
@@ -69,35 +69,7 @@
                 <w:rFonts w:ascii="Arial" w:eastAsia="Times New Roman" w:hAnsi="Arial" w:cs="Arial"/>
                 <w:color w:val="000000" w:themeColor="text1"/>
               </w:rPr>
-              <w:t xml:space="preserve">{numero_contrato}</w:t>
-            </w:r>
-            <w:r>
-              <w:rPr>
-                <w:rFonts w:ascii="Arial" w:eastAsia="Times New Roman" w:hAnsi="Arial" w:cs="Arial"/>
-                <w:color w:val="000000" w:themeColor="text1"/>
-              </w:rPr>
-              <w:t/>
-            </w:r>
-            <w:r>
-              <w:rPr>
-                <w:rFonts w:ascii="Arial" w:eastAsia="Times New Roman" w:hAnsi="Arial" w:cs="Arial"/>
-                <w:color w:val="000000" w:themeColor="text1"/>
-              </w:rPr>
-              <w:t/>
-            </w:r>
-            <w:r>
-              <w:rPr>
-                <w:rFonts w:ascii="Arial" w:eastAsia="Times New Roman" w:hAnsi="Arial" w:cs="Arial"/>
-                <w:color w:val="000000" w:themeColor="text1"/>
-              </w:rPr>
-              <w:t/>
-            </w:r>
-            <w:r>
-              <w:rPr>
-                <w:rFonts w:ascii="Arial" w:eastAsia="Times New Roman" w:hAnsi="Arial" w:cs="Arial"/>
-                <w:color w:val="000000" w:themeColor="text1"/>
-              </w:rPr>
-              <w:t/>
+              <w:t>{numero_contrato}</w:t>
             </w:r>
           </w:p>
         </w:tc>
@@ -266,18 +238,7 @@
                 <w:sz w:val="22"/>
                 <w:szCs w:val="22"/>
               </w:rPr>
-              <w:t xml:space="preserve">{nombre_contratista}</w:t>
-            </w:r>
-            <w:r>
-              <w:rPr>
-                <w:rFonts w:cs="Arial"/>
-                <w:b/>
-                <w:bCs/>
-                <w:color w:val="000000" w:themeColor="text1"/>
-                <w:sz w:val="22"/>
-                <w:szCs w:val="22"/>
-              </w:rPr>
-              <w:t xml:space="preserve"/>
+              <w:t>{nombre_contratista}</w:t>
             </w:r>
           </w:p>
         </w:tc>
@@ -342,7 +303,7 @@
                 <w:sz w:val="22"/>
                 <w:szCs w:val="22"/>
               </w:rPr>
-              <w:t xml:space="preserve">{cedula_contratista}</w:t>
+              <w:t>{cedula_contratista}</w:t>
             </w:r>
           </w:p>
         </w:tc>
@@ -401,7 +362,7 @@
                 <w:rFonts w:ascii="Arial" w:hAnsi="Arial" w:cs="Arial"/>
                 <w:color w:val="000000" w:themeColor="text1"/>
               </w:rPr>
-              <w:t xml:space="preserve">{objeto_contrato}</w:t>
+              <w:t>{objeto_contrato}</w:t>
             </w:r>
           </w:p>
         </w:tc>
@@ -519,7 +480,7 @@
                 <w:color w:val="000000" w:themeColor="text1"/>
                 <w:lang w:val="es-CO"/>
               </w:rPr>
-              <w:t xml:space="preserve">{valor_total_texto}</w:t>
+              <w:t>{valor_total_texto}</w:t>
             </w:r>
           </w:p>
         </w:tc>
@@ -578,52 +539,7 @@
                 <w:color w:val="000000"/>
                 <w:shd w:val="clear" w:color="auto" w:fill="FFFFFF"/>
               </w:rPr>
-              <w:t xml:space="preserve">{plazo_texto}</w:t>
-            </w:r>
-            <w:r>
-              <w:rPr>
-                <w:rStyle w:val="normaltextrun"/>
-                <w:rFonts w:ascii="Arial" w:hAnsi="Arial" w:cs="Arial"/>
-                <w:color w:val="000000"/>
-                <w:shd w:val="clear" w:color="auto" w:fill="FFFFFF"/>
-              </w:rPr>
-              <w:t/>
-            </w:r>
-            <w:r>
-              <w:rPr>
-                <w:rStyle w:val="normaltextrun"/>
-                <w:rFonts w:ascii="Arial" w:hAnsi="Arial" w:cs="Arial"/>
-                <w:color w:val="000000"/>
-                <w:shd w:val="clear" w:color="auto" w:fill="FFFFFF"/>
-              </w:rPr>
-              <w:t xml:space="preserve"/>
-            </w:r>
-            <w:r>
-              <w:rPr>
-                <w:rStyle w:val="normaltextrun"/>
-                <w:rFonts w:ascii="Arial" w:hAnsi="Arial" w:cs="Arial"/>
-                <w:color w:val="000000"/>
-                <w:shd w:val="clear" w:color="auto" w:fill="FFFFFF"/>
-              </w:rPr>
-              <w:t xml:space="preserve"/>
-            </w:r>
-            <w:r>
-              <w:rPr>
-                <w:rStyle w:val="normaltextrun"/>
-                <w:rFonts w:ascii="Arial" w:hAnsi="Arial" w:cs="Arial"/>
-                <w:color w:val="000000"/>
-                <w:shd w:val="clear" w:color="auto" w:fill="FFFFFF"/>
-              </w:rPr>
-              <w:t/>
-            </w:r>
-            <w:r>
-              <w:rPr>
-                <w:rStyle w:val="normaltextrun"/>
-                <w:rFonts w:ascii="Arial" w:hAnsi="Arial" w:cs="Arial"/>
-                <w:color w:val="000000"/>
-                <w:shd w:val="clear" w:color="auto" w:fill="FFFFFF"/>
-              </w:rPr>
-              <w:t/>
+              <w:t>{plazo_texto}</w:t>
             </w:r>
           </w:p>
         </w:tc>
@@ -645,6 +561,7 @@
     </w:p>
     <w:p>
       <w:pPr>
+        <w:ind w:right="-425"/>
         <w:jc w:val="both"/>
         <w:rPr>
           <w:rFonts w:ascii="Arial" w:eastAsia="Arial" w:hAnsi="Arial" w:cs="Arial"/>
@@ -1005,7 +922,7 @@
           <w:bCs/>
           <w:color w:val="000000"/>
         </w:rPr>
-        <w:t xml:space="preserve">{nombre_contratista}</w:t>
+        <w:t>{nombre_contratista}</w:t>
       </w:r>
       <w:r>
         <w:rPr>
@@ -1065,7 +982,7 @@
           <w:rFonts w:ascii="Arial" w:eastAsia="Arial" w:hAnsi="Arial" w:cs="Arial"/>
           <w:color w:val="000000" w:themeColor="text1"/>
         </w:rPr>
-        <w:t xml:space="preserve">{cedula_contratista}</w:t>
+        <w:t>{cedula_contratista}</w:t>
       </w:r>
       <w:r>
         <w:rPr>
@@ -1177,7 +1094,7 @@
           <w:rFonts w:ascii="Arial" w:hAnsi="Arial" w:cs="Arial"/>
           <w:color w:val="000000" w:themeColor="text1"/>
         </w:rPr>
-        <w:t xml:space="preserve">{objeto_contrato}</w:t>
+        <w:t>{objeto_contrato}</w:t>
       </w:r>
     </w:p>
     <w:p>
@@ -1230,44 +1147,7 @@
           <w:sz w:val="22"/>
           <w:szCs w:val="22"/>
         </w:rPr>
-        <w:t xml:space="preserve">{alcance}</w:t>
-      </w:r>
-      <w:r>
-        <w:rPr>
-          <w:rFonts w:eastAsia="Arial" w:cs="Arial"/>
-          <w:color w:val="000000" w:themeColor="text1"/>
-          <w:sz w:val="22"/>
-          <w:szCs w:val="22"/>
-        </w:rPr>
-        <w:t/>
-      </w:r>
-      <w:r>
-        <w:rPr>
-          <w:rFonts w:eastAsiaTheme="minorEastAsia" w:cs="Arial"/>
-          <w:color w:val="000000" w:themeColor="text1"/>
-          <w:sz w:val="22"/>
-          <w:szCs w:val="22"/>
-          <w:lang w:eastAsia="es-CO"/>
-        </w:rPr>
-        <w:t/>
-      </w:r>
-      <w:r>
-        <w:rPr>
-          <w:rFonts w:eastAsiaTheme="majorEastAsia" w:cs="Arial"/>
-          <w:sz w:val="22"/>
-          <w:szCs w:val="22"/>
-        </w:rPr>
-        <w:t xml:space="preserve"/>
-      </w:r>
-      <w:r>
-        <w:rPr>
-          <w:rFonts w:cs="Arial"/>
-          <w:color w:val="000000" w:themeColor="text1"/>
-          <w:sz w:val="22"/>
-          <w:szCs w:val="22"/>
-          <w:lang w:val="es-ES" w:eastAsia="es-CO"/>
-        </w:rPr>
-        <w:t/>
+        <w:t>{alcance}</w:t>
       </w:r>
     </w:p>
     <w:p>
@@ -1341,7 +1221,7 @@
           <w:sz w:val="22"/>
           <w:szCs w:val="22"/>
         </w:rPr>
-        <w:t xml:space="preserve">{actividades_principales}</w:t>
+        <w:t>{actividades_principales}</w:t>
       </w:r>
     </w:p>
     <w:p>
@@ -1413,7 +1293,7 @@
           <w:szCs w:val="22"/>
           <w:shd w:val="clear" w:color="auto" w:fill="FFFFFF"/>
         </w:rPr>
-        <w:t xml:space="preserve">{fecha_terminacion_texto}</w:t>
+        <w:t>{fecha_terminacion_texto}</w:t>
       </w:r>
       <w:r>
         <w:rPr>
@@ -1424,61 +1304,6 @@
           <w:szCs w:val="22"/>
           <w:shd w:val="clear" w:color="auto" w:fill="FFFFFF"/>
         </w:rPr>
-        <w:t/>
-      </w:r>
-      <w:r>
-        <w:rPr>
-          <w:rStyle w:val="normaltextrun"/>
-          <w:rFonts w:cs="Arial"/>
-          <w:color w:val="000000"/>
-          <w:sz w:val="22"/>
-          <w:szCs w:val="22"/>
-          <w:shd w:val="clear" w:color="auto" w:fill="FFFFFF"/>
-        </w:rPr>
-        <w:t xml:space="preserve"/>
-      </w:r>
-      <w:r>
-        <w:rPr>
-          <w:rStyle w:val="normaltextrun"/>
-          <w:rFonts w:cs="Arial"/>
-          <w:color w:val="000000"/>
-          <w:sz w:val="22"/>
-          <w:szCs w:val="22"/>
-          <w:shd w:val="clear" w:color="auto" w:fill="FFFFFF"/>
-        </w:rPr>
-        <w:t xml:space="preserve"/>
-      </w:r>
-      <w:r>
-        <w:rPr>
-          <w:rStyle w:val="normaltextrun"/>
-          <w:rFonts w:cs="Arial"/>
-          <w:color w:val="000000"/>
-          <w:sz w:val="22"/>
-          <w:szCs w:val="22"/>
-          <w:shd w:val="clear" w:color="auto" w:fill="FFFFFF"/>
-        </w:rPr>
-        <w:t/>
-      </w:r>
-      <w:r>
-        <w:rPr>
-          <w:rStyle w:val="normaltextrun"/>
-          <w:rFonts w:cs="Arial"/>
-          <w:color w:val="000000"/>
-          <w:sz w:val="22"/>
-          <w:szCs w:val="22"/>
-          <w:shd w:val="clear" w:color="auto" w:fill="FFFFFF"/>
-        </w:rPr>
-        <w:t/>
-      </w:r>
-      <w:r>
-        <w:rPr>
-          <w:rStyle w:val="normaltextrun"/>
-          <w:rFonts w:cs="Arial"/>
-          <w:color w:val="000000"/>
-          <w:sz w:val="22"/>
-          <w:szCs w:val="22"/>
-          <w:shd w:val="clear" w:color="auto" w:fill="FFFFFF"/>
-        </w:rPr>
         <w:t>.</w:t>
       </w:r>
     </w:p>
@@ -1569,6 +1394,7 @@
     </w:p>
     <w:p>
       <w:pPr>
+        <w:ind w:right="-425"/>
         <w:jc w:val="both"/>
         <w:rPr>
           <w:rFonts w:ascii="Arial" w:eastAsia="Arial" w:hAnsi="Arial" w:cs="Arial"/>
@@ -1610,7 +1436,7 @@
           <w:color w:val="000000" w:themeColor="text1"/>
           <w:lang w:val="es-CO"/>
         </w:rPr>
-        <w:t xml:space="preserve">{valor_total_texto}</w:t>
+        <w:t>{valor_total_texto}</w:t>
       </w:r>
     </w:p>
     <w:p>
@@ -1640,6 +1466,7 @@
           <w:color w:val="0D0D0D" w:themeColor="text1" w:themeTint="F2"/>
           <w:lang w:val="es-CO" w:eastAsia="es-ES"/>
         </w:rPr>
+        <w:lastRenderedPageBreak/>
         <w:t xml:space="preserve">La EMPRESA DE PARQUES Y EVENTOS DE ANTIOQUIA – ACTIVA, pagará al contratista los honorarios mediante  pagos mensuales, proporcionales a los días de servicio prestados con corte al 30 de cada mes, por valor de </w:t>
       </w:r>
       <w:r>
@@ -1648,7 +1475,7 @@
           <w:color w:val="0D0D0D" w:themeColor="text1" w:themeTint="F2"/>
           <w:lang w:val="es-CO" w:eastAsia="es-ES"/>
         </w:rPr>
-        <w:t xml:space="preserve">{valor_mensual_texto}</w:t>
+        <w:t>{valor_mensual_texto}</w:t>
       </w:r>
       <w:r>
         <w:rPr>
@@ -1656,7 +1483,7 @@
           <w:color w:val="0D0D0D" w:themeColor="text1" w:themeTint="F2"/>
           <w:lang w:val="es-CO" w:eastAsia="es-ES"/>
         </w:rPr>
-        <w:t xml:space="preserve"/>
+        <w:t xml:space="preserve"> </w:t>
       </w:r>
       <w:r>
         <w:rPr>
@@ -1664,63 +1491,91 @@
           <w:color w:val="0D0D0D" w:themeColor="text1" w:themeTint="F2"/>
           <w:lang w:val="es-CO" w:eastAsia="es-ES"/>
         </w:rPr>
-        <w:t/>
-      </w:r>
-      <w:r>
+        <w:t xml:space="preserve">una vez el supervisor del contrato emita el respectivo recibo de satisfacción e informe de supervisión conforme a lo estipulado en los estudios previos, como también previa presentación de la cuenta de cobro, documento equivalente y/o factura según el caso; Informe mensual de ejecución de actividades y sus respectivas evidencias según el objeto del contrato. La cuenta de cobro debe ser presentada los treinta (30) de cada mes, en caso de no ser día hábil se debe presentar el día hábil inmediatamente anterior. </w:t>
+      </w:r>
+    </w:p>
+    <w:p>
+      <w:pPr>
+        <w:suppressAutoHyphens/>
+        <w:ind w:right="-425"/>
+        <w:jc w:val="both"/>
         <w:rPr>
           <w:rFonts w:ascii="Arial" w:eastAsia="Times New Roman" w:hAnsi="Arial" w:cs="Arial"/>
           <w:color w:val="0D0D0D" w:themeColor="text1" w:themeTint="F2"/>
           <w:lang w:val="es-CO" w:eastAsia="es-ES"/>
         </w:rPr>
-        <w:t/>
-      </w:r>
-      <w:r>
+      </w:pPr>
+    </w:p>
+    <w:p>
+      <w:pPr>
+        <w:suppressAutoHyphens/>
+        <w:ind w:right="-425"/>
+        <w:jc w:val="both"/>
         <w:rPr>
           <w:rFonts w:ascii="Arial" w:eastAsia="Times New Roman" w:hAnsi="Arial" w:cs="Arial"/>
           <w:color w:val="0D0D0D" w:themeColor="text1" w:themeTint="F2"/>
           <w:lang w:val="es-CO" w:eastAsia="es-ES"/>
         </w:rPr>
-        <w:t/>
-      </w:r>
+      </w:pPr>
       <w:r>
         <w:rPr>
           <w:rFonts w:ascii="Arial" w:eastAsia="Times New Roman" w:hAnsi="Arial" w:cs="Arial"/>
           <w:color w:val="0D0D0D" w:themeColor="text1" w:themeTint="F2"/>
           <w:lang w:val="es-CO" w:eastAsia="es-ES"/>
         </w:rPr>
-        <w:t/>
-      </w:r>
-      <w:r>
+        <w:t xml:space="preserve">La cuenta de cobro, documento equivalente y/o factura debe ir acompañada de la certificación de pago de aportes a los sistemas de salud, riesgos laborales, pensiones y aportes de cajas de compensación familiar, ICBF y SENA, cuando hubiere lugar a ello, según lo establecido en la Ley 789 de 2002. Además de la certificación de la cuenta bancaria donde se realizará la transferencia. </w:t>
+      </w:r>
+    </w:p>
+    <w:p>
+      <w:pPr>
+        <w:suppressAutoHyphens/>
+        <w:ind w:right="-425"/>
+        <w:jc w:val="both"/>
         <w:rPr>
           <w:rFonts w:ascii="Arial" w:eastAsia="Times New Roman" w:hAnsi="Arial" w:cs="Arial"/>
           <w:color w:val="0D0D0D" w:themeColor="text1" w:themeTint="F2"/>
           <w:lang w:val="es-CO" w:eastAsia="es-ES"/>
         </w:rPr>
-        <w:t/>
-      </w:r>
-      <w:r>
+      </w:pPr>
+    </w:p>
+    <w:p>
+      <w:pPr>
+        <w:suppressAutoHyphens/>
+        <w:ind w:right="-425"/>
+        <w:jc w:val="both"/>
         <w:rPr>
           <w:rFonts w:ascii="Arial" w:eastAsia="Times New Roman" w:hAnsi="Arial" w:cs="Arial"/>
           <w:color w:val="0D0D0D" w:themeColor="text1" w:themeTint="F2"/>
           <w:lang w:val="es-CO" w:eastAsia="es-ES"/>
         </w:rPr>
-        <w:t/>
-      </w:r>
-      <w:r>
+      </w:pPr>
+      <w:r>
+        <w:rPr>
+          <w:rFonts w:ascii="Arial" w:eastAsia="Times New Roman" w:hAnsi="Arial" w:cs="Arial"/>
+          <w:color w:val="000000" w:themeColor="text1"/>
+          <w:lang w:val="es-CO" w:eastAsia="es-ES"/>
+        </w:rPr>
+        <w:t>La EMPRESA DE PARQUES Y EVENTOS DE ANTIOQUIA – ACTIVA, dispone de cinco (5) días hábiles para cancelar de la cuenta de cobro, documento equivalente y/o factura, según el caso, después del recibido del total de la documentación por el área financiera y previa deducción de los impuestos, retenciones y descuentos a que hubiere lugar, de acuerdo con las normas y leyes vigentes. En todo caso el pago está supeditado a la disponibilidad de recursos del cliente de ACTIVA.</w:t>
+      </w:r>
+    </w:p>
+    <w:p>
+      <w:pPr>
+        <w:suppressAutoHyphens/>
+        <w:ind w:right="-425"/>
+        <w:jc w:val="both"/>
         <w:rPr>
           <w:rFonts w:ascii="Arial" w:eastAsia="Times New Roman" w:hAnsi="Arial" w:cs="Arial"/>
           <w:color w:val="0D0D0D" w:themeColor="text1" w:themeTint="F2"/>
           <w:lang w:val="es-CO" w:eastAsia="es-ES"/>
         </w:rPr>
-        <w:t xml:space="preserve"> </w:t>
-      </w:r>
+      </w:pPr>
       <w:r>
         <w:rPr>
           <w:rFonts w:ascii="Arial" w:eastAsia="Times New Roman" w:hAnsi="Arial" w:cs="Arial"/>
           <w:color w:val="0D0D0D" w:themeColor="text1" w:themeTint="F2"/>
           <w:lang w:val="es-CO" w:eastAsia="es-ES"/>
         </w:rPr>
-        <w:t xml:space="preserve">una vez el supervisor del contrato emita el respectivo recibo de satisfacción e informe de supervisión conforme a lo estipulado en los estudios previos, como también previa presentación de la cuenta de cobro, documento equivalente y/o factura según el caso; Informe mensual de ejecución de actividades y sus respectivas evidencias según el objeto del contrato. La cuenta de cobro debe ser presentada los treinta (30) de cada mes, en caso de no ser día hábil se debe presentar el día hábil inmediatamente anterior. </w:t>
+        <w:t>Así mismo, para proceder al pago, la EMPRESA DE PARQUES Y EVENTOS DE ANTIOQUIA – ACTIVA, verificará que el contratista se encuentre al día en el pago de sus obligaciones parafiscales y aquellas relacionadas con los sistemas de seguridad social integral.</w:t>
       </w:r>
     </w:p>
     <w:p>
@@ -1752,7 +1607,7 @@
           <w:color w:val="0D0D0D" w:themeColor="text1" w:themeTint="F2"/>
           <w:lang w:val="es-CO" w:eastAsia="es-ES"/>
         </w:rPr>
-        <w:t xml:space="preserve">La cuenta de cobro, documento equivalente y/o factura debe ir acompañada de la certificación de pago de aportes a los sistemas de salud, riesgos laborales, pensiones y aportes de cajas de compensación familiar, ICBF y SENA, cuando hubiere lugar a ello, según lo establecido en la Ley 789 de 2002. Además de la certificación de la cuenta bancaria donde se realizará la transferencia. </w:t>
+        <w:t>El contratista deberá aportar las certificaciones y documentación de los dependientes económicos en caso de tenerlos, para ACTIVA realizar los respectivos análisis y depuraciones fiscales en los abonos en cuenta o pagos derivados de este contrato.</w:t>
       </w:r>
     </w:p>
     <w:p>
@@ -1781,11 +1636,10 @@
       <w:r>
         <w:rPr>
           <w:rFonts w:ascii="Arial" w:eastAsia="Times New Roman" w:hAnsi="Arial" w:cs="Arial"/>
-          <w:color w:val="000000" w:themeColor="text1"/>
+          <w:color w:val="0D0D0D" w:themeColor="text1" w:themeTint="F2"/>
           <w:lang w:val="es-CO" w:eastAsia="es-ES"/>
         </w:rPr>
-        <w:lastRenderedPageBreak/>
-        <w:t>La EMPRESA DE PARQUES Y EVENTOS DE ANTIOQUIA – ACTIVA, dispone de cinco (5) días hábiles para cancelar de la cuenta de cobro, documento equivalente y/o factura, según el caso, después del recibido del total de la documentación por el área financiera y previa deducción de los impuestos, retenciones y descuentos a que hubiere lugar, de acuerdo con las normas y leyes vigentes. En todo caso el pago está supeditado a la disponibilidad de recursos del cliente de ACTIVA.</w:t>
+        <w:t>El recurso no ejecutado será liberado por parte de ACTIVA una vez terminado el contrato.</w:t>
       </w:r>
     </w:p>
     <w:p>
@@ -1799,26 +1653,36 @@
           <w:lang w:val="es-CO" w:eastAsia="es-ES"/>
         </w:rPr>
       </w:pPr>
-      <w:r>
+    </w:p>
+    <w:p>
+      <w:pPr>
+        <w:suppressAutoHyphens/>
+        <w:ind w:right="-425"/>
+        <w:jc w:val="both"/>
         <w:rPr>
           <w:rFonts w:ascii="Arial" w:eastAsia="Times New Roman" w:hAnsi="Arial" w:cs="Arial"/>
           <w:color w:val="0D0D0D" w:themeColor="text1" w:themeTint="F2"/>
           <w:lang w:val="es-CO" w:eastAsia="es-ES"/>
         </w:rPr>
-        <w:t>Así mismo, para proceder al pago, la EMPRESA DE PARQUES Y EVENTOS DE ANTIOQUIA – ACTIVA, verificará que el contratista se encuentre al día en el pago de sus obligaciones parafiscales y aquellas relacionadas con los sistemas de seguridad social integral.</w:t>
-      </w:r>
-    </w:p>
-    <w:p>
-      <w:pPr>
-        <w:suppressAutoHyphens/>
-        <w:ind w:right="-425"/>
-        <w:jc w:val="both"/>
+      </w:pPr>
+      <w:r>
+        <w:rPr>
+          <w:rFonts w:ascii="Arial" w:eastAsia="Times New Roman" w:hAnsi="Arial" w:cs="Arial"/>
+          <w:b/>
+          <w:bCs/>
+          <w:color w:val="0D0D0D" w:themeColor="text1" w:themeTint="F2"/>
+          <w:lang w:val="es-CO" w:eastAsia="es-ES"/>
+        </w:rPr>
+        <w:t xml:space="preserve">Nota: </w:t>
+      </w:r>
+      <w:r>
         <w:rPr>
           <w:rFonts w:ascii="Arial" w:eastAsia="Times New Roman" w:hAnsi="Arial" w:cs="Arial"/>
           <w:color w:val="0D0D0D" w:themeColor="text1" w:themeTint="F2"/>
           <w:lang w:val="es-CO" w:eastAsia="es-ES"/>
         </w:rPr>
-      </w:pPr>
+        <w:t>los impuestos, estampillas y retenciones que apliquen estarán a cargo del contratista.</w:t>
+      </w:r>
     </w:p>
     <w:p>
       <w:pPr>
@@ -1831,14 +1695,6 @@
           <w:lang w:val="es-CO" w:eastAsia="es-ES"/>
         </w:rPr>
       </w:pPr>
-      <w:r>
-        <w:rPr>
-          <w:rFonts w:ascii="Arial" w:eastAsia="Times New Roman" w:hAnsi="Arial" w:cs="Arial"/>
-          <w:color w:val="0D0D0D" w:themeColor="text1" w:themeTint="F2"/>
-          <w:lang w:val="es-CO" w:eastAsia="es-ES"/>
-        </w:rPr>
-        <w:t>El contratista deberá aportar las certificaciones y documentación de los dependientes económicos en caso de tenerlos, para ACTIVA realizar los respectivos análisis y depuraciones fiscales en los abonos en cuenta o pagos derivados de este contrato.</w:t>
-      </w:r>
     </w:p>
     <w:p>
       <w:pPr>
@@ -1846,92 +1702,6 @@
         <w:ind w:right="-425"/>
         <w:jc w:val="both"/>
         <w:rPr>
-          <w:rFonts w:ascii="Arial" w:eastAsia="Times New Roman" w:hAnsi="Arial" w:cs="Arial"/>
-          <w:color w:val="0D0D0D" w:themeColor="text1" w:themeTint="F2"/>
-          <w:lang w:val="es-CO" w:eastAsia="es-ES"/>
-        </w:rPr>
-      </w:pPr>
-    </w:p>
-    <w:p>
-      <w:pPr>
-        <w:suppressAutoHyphens/>
-        <w:ind w:right="-425"/>
-        <w:jc w:val="both"/>
-        <w:rPr>
-          <w:rFonts w:ascii="Arial" w:eastAsia="Times New Roman" w:hAnsi="Arial" w:cs="Arial"/>
-          <w:color w:val="0D0D0D" w:themeColor="text1" w:themeTint="F2"/>
-          <w:lang w:val="es-CO" w:eastAsia="es-ES"/>
-        </w:rPr>
-      </w:pPr>
-      <w:r>
-        <w:rPr>
-          <w:rFonts w:ascii="Arial" w:eastAsia="Times New Roman" w:hAnsi="Arial" w:cs="Arial"/>
-          <w:color w:val="0D0D0D" w:themeColor="text1" w:themeTint="F2"/>
-          <w:lang w:val="es-CO" w:eastAsia="es-ES"/>
-        </w:rPr>
-        <w:t>El recurso no ejecutado será liberado por parte de ACTIVA una vez terminado el contrato.</w:t>
-      </w:r>
-    </w:p>
-    <w:p>
-      <w:pPr>
-        <w:suppressAutoHyphens/>
-        <w:ind w:right="-425"/>
-        <w:jc w:val="both"/>
-        <w:rPr>
-          <w:rFonts w:ascii="Arial" w:eastAsia="Times New Roman" w:hAnsi="Arial" w:cs="Arial"/>
-          <w:color w:val="0D0D0D" w:themeColor="text1" w:themeTint="F2"/>
-          <w:lang w:val="es-CO" w:eastAsia="es-ES"/>
-        </w:rPr>
-      </w:pPr>
-    </w:p>
-    <w:p>
-      <w:pPr>
-        <w:suppressAutoHyphens/>
-        <w:ind w:right="-425"/>
-        <w:jc w:val="both"/>
-        <w:rPr>
-          <w:rFonts w:ascii="Arial" w:eastAsia="Times New Roman" w:hAnsi="Arial" w:cs="Arial"/>
-          <w:color w:val="0D0D0D" w:themeColor="text1" w:themeTint="F2"/>
-          <w:lang w:val="es-CO" w:eastAsia="es-ES"/>
-        </w:rPr>
-      </w:pPr>
-      <w:r>
-        <w:rPr>
-          <w:rFonts w:ascii="Arial" w:eastAsia="Times New Roman" w:hAnsi="Arial" w:cs="Arial"/>
-          <w:b/>
-          <w:bCs/>
-          <w:color w:val="0D0D0D" w:themeColor="text1" w:themeTint="F2"/>
-          <w:lang w:val="es-CO" w:eastAsia="es-ES"/>
-        </w:rPr>
-        <w:t xml:space="preserve">Nota: </w:t>
-      </w:r>
-      <w:r>
-        <w:rPr>
-          <w:rFonts w:ascii="Arial" w:eastAsia="Times New Roman" w:hAnsi="Arial" w:cs="Arial"/>
-          <w:color w:val="0D0D0D" w:themeColor="text1" w:themeTint="F2"/>
-          <w:lang w:val="es-CO" w:eastAsia="es-ES"/>
-        </w:rPr>
-        <w:t>los impuestos, estampillas y retenciones que apliquen estarán a cargo del contratista.</w:t>
-      </w:r>
-    </w:p>
-    <w:p>
-      <w:pPr>
-        <w:suppressAutoHyphens/>
-        <w:ind w:right="-425"/>
-        <w:jc w:val="both"/>
-        <w:rPr>
-          <w:rFonts w:ascii="Arial" w:eastAsia="Times New Roman" w:hAnsi="Arial" w:cs="Arial"/>
-          <w:color w:val="0D0D0D" w:themeColor="text1" w:themeTint="F2"/>
-          <w:lang w:val="es-CO" w:eastAsia="es-ES"/>
-        </w:rPr>
-      </w:pPr>
-    </w:p>
-    <w:p>
-      <w:pPr>
-        <w:suppressAutoHyphens/>
-        <w:ind w:right="-425"/>
-        <w:jc w:val="both"/>
-        <w:rPr>
           <w:rFonts w:ascii="Arial" w:hAnsi="Arial" w:cs="Arial"/>
           <w:color w:val="000000" w:themeColor="text1"/>
         </w:rPr>
@@ -1980,263 +1750,7 @@
           <w:rFonts w:ascii="Arial" w:hAnsi="Arial" w:cs="Arial"/>
           <w:color w:val="000000" w:themeColor="text1"/>
         </w:rPr>
-        <w:t xml:space="preserve">{presupuesto_texto}</w:t>
-      </w:r>
-      <w:r>
-        <w:rPr>
-          <w:rFonts w:ascii="Arial" w:hAnsi="Arial" w:cs="Arial"/>
-          <w:color w:val="000000" w:themeColor="text1"/>
-        </w:rPr>
-        <w:t xml:space="preserve"/>
-      </w:r>
-      <w:r>
-        <w:rPr>
-          <w:rFonts w:ascii="Arial" w:hAnsi="Arial" w:cs="Arial"/>
-          <w:color w:val="000000" w:themeColor="text1"/>
-        </w:rPr>
-        <w:t/>
-      </w:r>
-      <w:r>
-        <w:rPr>
-          <w:rFonts w:ascii="Arial" w:hAnsi="Arial" w:cs="Arial"/>
-          <w:color w:val="000000" w:themeColor="text1"/>
-        </w:rPr>
-        <w:t xml:space="preserve"/>
-      </w:r>
-      <w:r>
-        <w:rPr>
-          <w:rFonts w:ascii="Arial" w:hAnsi="Arial" w:cs="Arial"/>
-          <w:color w:val="000000" w:themeColor="text1"/>
-        </w:rPr>
-        <w:t/>
-      </w:r>
-      <w:r>
-        <w:rPr>
-          <w:rFonts w:ascii="Arial" w:hAnsi="Arial" w:cs="Arial"/>
-        </w:rPr>
-        <w:t xml:space="preserve"/>
-      </w:r>
-      <w:r>
-        <w:rPr>
-          <w:rFonts w:ascii="Arial" w:hAnsi="Arial" w:cs="Arial"/>
-        </w:rPr>
-        <w:t/>
-      </w:r>
-      <w:r>
-        <w:rPr>
-          <w:rFonts w:ascii="Arial" w:hAnsi="Arial" w:cs="Arial"/>
-        </w:rPr>
-        <w:t/>
-      </w:r>
-      <w:r>
-        <w:rPr>
-          <w:rFonts w:ascii="Arial" w:hAnsi="Arial" w:cs="Arial"/>
-        </w:rPr>
-        <w:t/>
-      </w:r>
-      <w:r>
-        <w:rPr>
-          <w:rFonts w:ascii="Arial" w:hAnsi="Arial" w:cs="Arial"/>
-        </w:rPr>
-        <w:t/>
-      </w:r>
-      <w:r>
-        <w:rPr>
-          <w:rFonts w:ascii="Arial" w:hAnsi="Arial" w:cs="Arial"/>
-        </w:rPr>
-        <w:t/>
-      </w:r>
-      <w:r>
-        <w:rPr>
-          <w:rFonts w:ascii="Arial" w:hAnsi="Arial" w:cs="Arial"/>
-        </w:rPr>
-        <w:t/>
-      </w:r>
-      <w:r>
-        <w:rPr>
-          <w:rFonts w:ascii="Arial" w:hAnsi="Arial" w:cs="Arial"/>
-        </w:rPr>
-        <w:t xml:space="preserve"/>
-      </w:r>
-      <w:r>
-        <w:rPr>
-          <w:rFonts w:ascii="Arial" w:hAnsi="Arial" w:cs="Arial"/>
-        </w:rPr>
-        <w:t xml:space="preserve"/>
-      </w:r>
-      <w:r>
-        <w:rPr>
-          <w:rFonts w:ascii="Arial" w:hAnsi="Arial" w:cs="Arial"/>
-        </w:rPr>
-        <w:t/>
-      </w:r>
-      <w:r>
-        <w:rPr>
-          <w:rFonts w:ascii="Arial" w:hAnsi="Arial" w:cs="Arial"/>
-        </w:rPr>
-        <w:t/>
-      </w:r>
-      <w:r>
-        <w:rPr>
-          <w:rFonts w:ascii="Arial" w:hAnsi="Arial" w:cs="Arial"/>
-        </w:rPr>
-        <w:t/>
-      </w:r>
-      <w:r>
-        <w:rPr>
-          <w:rFonts w:ascii="Arial" w:hAnsi="Arial" w:cs="Arial"/>
-        </w:rPr>
-        <w:t/>
-      </w:r>
-      <w:r>
-        <w:rPr>
-          <w:rFonts w:ascii="Arial" w:hAnsi="Arial" w:cs="Arial"/>
-        </w:rPr>
-        <w:t/>
-      </w:r>
-      <w:r>
-        <w:rPr>
-          <w:rFonts w:ascii="Arial" w:hAnsi="Arial" w:cs="Arial"/>
-        </w:rPr>
-        <w:t/>
-      </w:r>
-      <w:r>
-        <w:rPr>
-          <w:rFonts w:ascii="Arial" w:hAnsi="Arial" w:cs="Arial"/>
-        </w:rPr>
-        <w:t/>
-      </w:r>
-      <w:r>
-        <w:rPr>
-          <w:rFonts w:ascii="Arial" w:hAnsi="Arial" w:cs="Arial"/>
-        </w:rPr>
-        <w:t xml:space="preserve"/>
-      </w:r>
-      <w:r>
-        <w:rPr>
-          <w:rFonts w:ascii="Arial" w:hAnsi="Arial" w:cs="Arial"/>
-          <w:color w:val="000000" w:themeColor="text1"/>
-        </w:rPr>
-        <w:t xml:space="preserve"/>
-      </w:r>
-      <w:r>
-        <w:rPr>
-          <w:rFonts w:ascii="Arial" w:hAnsi="Arial" w:cs="Arial"/>
-          <w:color w:val="000000" w:themeColor="text1"/>
-        </w:rPr>
-        <w:t xml:space="preserve"/>
-      </w:r>
-      <w:r>
-        <w:rPr>
-          <w:rFonts w:ascii="Arial" w:hAnsi="Arial" w:cs="Arial"/>
-          <w:color w:val="000000" w:themeColor="text1"/>
-        </w:rPr>
-        <w:t xml:space="preserve"/>
-      </w:r>
-      <w:r>
-        <w:rPr>
-          <w:rFonts w:ascii="Arial" w:hAnsi="Arial" w:cs="Arial"/>
-          <w:color w:val="000000" w:themeColor="text1"/>
-        </w:rPr>
-        <w:t/>
-      </w:r>
-      <w:r>
-        <w:rPr>
-          <w:rFonts w:ascii="Arial" w:hAnsi="Arial" w:cs="Arial"/>
-          <w:color w:val="000000" w:themeColor="text1"/>
-        </w:rPr>
-        <w:t xml:space="preserve"/>
-      </w:r>
-      <w:r>
-        <w:rPr>
-          <w:rFonts w:ascii="Arial" w:hAnsi="Arial" w:cs="Arial"/>
-          <w:color w:val="000000" w:themeColor="text1"/>
-        </w:rPr>
-        <w:t/>
-      </w:r>
-      <w:r>
-        <w:rPr>
-          <w:rFonts w:ascii="Arial" w:hAnsi="Arial" w:cs="Arial"/>
-          <w:color w:val="000000" w:themeColor="text1"/>
-        </w:rPr>
-        <w:t/>
-      </w:r>
-      <w:r>
-        <w:rPr>
-          <w:rFonts w:ascii="Arial" w:hAnsi="Arial" w:cs="Arial"/>
-          <w:color w:val="000000" w:themeColor="text1"/>
-        </w:rPr>
-        <w:t/>
-      </w:r>
-      <w:r>
-        <w:rPr>
-          <w:rFonts w:ascii="Arial" w:hAnsi="Arial" w:cs="Arial"/>
-          <w:color w:val="000000" w:themeColor="text1"/>
-        </w:rPr>
-        <w:t/>
-      </w:r>
-      <w:r>
-        <w:rPr>
-          <w:rFonts w:ascii="Arial" w:hAnsi="Arial" w:cs="Arial"/>
-          <w:color w:val="000000" w:themeColor="text1"/>
-        </w:rPr>
-        <w:t xml:space="preserve"/>
-      </w:r>
-      <w:r>
-        <w:rPr>
-          <w:rFonts w:ascii="Arial" w:hAnsi="Arial" w:cs="Arial"/>
-          <w:color w:val="000000" w:themeColor="text1"/>
-        </w:rPr>
-        <w:t/>
-      </w:r>
-      <w:r>
-        <w:rPr>
-          <w:rFonts w:ascii="Arial" w:hAnsi="Arial" w:cs="Arial"/>
-          <w:color w:val="000000" w:themeColor="text1"/>
-        </w:rPr>
-        <w:t/>
-      </w:r>
-      <w:r>
-        <w:rPr>
-          <w:rFonts w:ascii="Arial" w:hAnsi="Arial" w:cs="Arial"/>
-          <w:color w:val="000000" w:themeColor="text1"/>
-        </w:rPr>
-        <w:t/>
-      </w:r>
-      <w:r>
-        <w:rPr>
-          <w:rFonts w:ascii="Arial" w:hAnsi="Arial" w:cs="Arial"/>
-          <w:color w:val="000000" w:themeColor="text1"/>
-        </w:rPr>
-        <w:t/>
-      </w:r>
-      <w:r>
-        <w:rPr>
-          <w:rFonts w:ascii="Arial" w:hAnsi="Arial" w:cs="Arial"/>
-          <w:color w:val="000000" w:themeColor="text1"/>
-        </w:rPr>
-        <w:t/>
-      </w:r>
-      <w:r>
-        <w:rPr>
-          <w:rFonts w:ascii="Arial" w:hAnsi="Arial" w:cs="Arial"/>
-          <w:color w:val="000000" w:themeColor="text1"/>
-        </w:rPr>
-        <w:t/>
-      </w:r>
-      <w:r>
-        <w:rPr>
-          <w:rFonts w:ascii="Arial" w:hAnsi="Arial" w:cs="Arial"/>
-          <w:color w:val="000000" w:themeColor="text1"/>
-        </w:rPr>
-        <w:t/>
-      </w:r>
-      <w:r>
-        <w:rPr>
-          <w:rFonts w:ascii="Arial" w:hAnsi="Arial" w:cs="Arial"/>
-          <w:color w:val="000000" w:themeColor="text1"/>
-        </w:rPr>
-        <w:t/>
+        <w:t>{presupuesto_texto}</w:t>
       </w:r>
     </w:p>
     <w:p>
@@ -2319,6 +1833,7 @@
           <w:rFonts w:ascii="Arial" w:eastAsia="Calibri" w:hAnsi="Arial" w:cs="Arial"/>
           <w:lang w:val="es-CO" w:eastAsia="es-CO"/>
         </w:rPr>
+        <w:lastRenderedPageBreak/>
         <w:t>Perfeccionar conjuntamente la minuta del contrato en los términos previstos, suscripción del acta de inicio, suspensiones o prórrogas, modificaciones y en general, las actas que se produzcan en el desarrollo del contrato, incluyendo acta de liquidación. </w:t>
       </w:r>
     </w:p>
@@ -2769,7 +2284,7 @@
         <w:autoSpaceDE w:val="0"/>
         <w:autoSpaceDN w:val="0"/>
         <w:adjustRightInd w:val="0"/>
-        <w:ind w:left="284" w:right="51" w:hanging="284"/>
+        <w:ind w:left="284" w:right="-425" w:hanging="284"/>
         <w:jc w:val="both"/>
         <w:rPr>
           <w:rFonts w:ascii="Arial" w:hAnsi="Arial" w:cs="Arial"/>
@@ -2793,7 +2308,7 @@
         <w:autoSpaceDE w:val="0"/>
         <w:autoSpaceDN w:val="0"/>
         <w:adjustRightInd w:val="0"/>
-        <w:ind w:left="284" w:right="51" w:hanging="284"/>
+        <w:ind w:left="284" w:right="-425" w:hanging="284"/>
         <w:jc w:val="both"/>
         <w:rPr>
           <w:rFonts w:ascii="Arial" w:hAnsi="Arial" w:cs="Arial"/>
@@ -2816,7 +2331,7 @@
         <w:autoSpaceDE w:val="0"/>
         <w:autoSpaceDN w:val="0"/>
         <w:adjustRightInd w:val="0"/>
-        <w:ind w:left="284" w:right="51" w:hanging="284"/>
+        <w:ind w:left="284" w:right="-425" w:hanging="284"/>
         <w:jc w:val="both"/>
         <w:rPr>
           <w:rFonts w:ascii="Arial" w:hAnsi="Arial" w:cs="Arial"/>
@@ -2839,7 +2354,7 @@
         <w:autoSpaceDE w:val="0"/>
         <w:autoSpaceDN w:val="0"/>
         <w:adjustRightInd w:val="0"/>
-        <w:ind w:left="284" w:right="51" w:hanging="284"/>
+        <w:ind w:left="284" w:right="-425" w:hanging="284"/>
         <w:jc w:val="both"/>
         <w:rPr>
           <w:rFonts w:ascii="Arial" w:hAnsi="Arial" w:cs="Arial"/>
@@ -2862,16 +2377,17 @@
         <w:autoSpaceDE w:val="0"/>
         <w:autoSpaceDN w:val="0"/>
         <w:adjustRightInd w:val="0"/>
-        <w:ind w:left="284" w:right="51" w:hanging="284"/>
-        <w:jc w:val="both"/>
-        <w:rPr>
-          <w:rFonts w:ascii="Arial" w:hAnsi="Arial" w:cs="Arial"/>
-        </w:rPr>
-      </w:pPr>
-      <w:r>
-        <w:rPr>
-          <w:rFonts w:ascii="Arial" w:hAnsi="Arial" w:cs="Arial"/>
-        </w:rPr>
+        <w:ind w:left="284" w:right="-425" w:hanging="284"/>
+        <w:jc w:val="both"/>
+        <w:rPr>
+          <w:rFonts w:ascii="Arial" w:hAnsi="Arial" w:cs="Arial"/>
+        </w:rPr>
+      </w:pPr>
+      <w:r>
+        <w:rPr>
+          <w:rFonts w:ascii="Arial" w:hAnsi="Arial" w:cs="Arial"/>
+        </w:rPr>
+        <w:lastRenderedPageBreak/>
         <w:t>Cumplir con los objetivos contractuales con calidad, eficacia y efectividad en el plazo previsto para su ejecución, asumiendo las responsabilidades propias y buen desempeño del contrato, y contribuyendo a que la gestión de la Entidad contratante sea más eficaz.</w:t>
       </w:r>
     </w:p>
@@ -2885,7 +2401,7 @@
         <w:autoSpaceDE w:val="0"/>
         <w:autoSpaceDN w:val="0"/>
         <w:adjustRightInd w:val="0"/>
-        <w:ind w:left="284" w:right="51" w:hanging="284"/>
+        <w:ind w:left="284" w:right="-425" w:hanging="284"/>
         <w:jc w:val="both"/>
         <w:rPr>
           <w:rFonts w:ascii="Arial" w:hAnsi="Arial" w:cs="Arial"/>
@@ -2908,7 +2424,7 @@
         <w:autoSpaceDE w:val="0"/>
         <w:autoSpaceDN w:val="0"/>
         <w:adjustRightInd w:val="0"/>
-        <w:ind w:left="284" w:right="51" w:hanging="284"/>
+        <w:ind w:left="284" w:right="-425" w:hanging="284"/>
         <w:jc w:val="both"/>
         <w:rPr>
           <w:rFonts w:ascii="Arial" w:hAnsi="Arial" w:cs="Arial"/>
@@ -2931,7 +2447,7 @@
         <w:autoSpaceDE w:val="0"/>
         <w:autoSpaceDN w:val="0"/>
         <w:adjustRightInd w:val="0"/>
-        <w:ind w:left="284" w:right="51" w:hanging="284"/>
+        <w:ind w:left="284" w:right="-425" w:hanging="284"/>
         <w:jc w:val="both"/>
         <w:rPr>
           <w:rFonts w:ascii="Arial" w:hAnsi="Arial" w:cs="Arial"/>
@@ -2954,7 +2470,7 @@
         <w:autoSpaceDE w:val="0"/>
         <w:autoSpaceDN w:val="0"/>
         <w:adjustRightInd w:val="0"/>
-        <w:ind w:left="284" w:right="51" w:hanging="284"/>
+        <w:ind w:left="284" w:right="-425" w:hanging="284"/>
         <w:jc w:val="both"/>
         <w:rPr>
           <w:rFonts w:ascii="Arial" w:hAnsi="Arial" w:cs="Arial"/>
@@ -2977,7 +2493,7 @@
         <w:autoSpaceDE w:val="0"/>
         <w:autoSpaceDN w:val="0"/>
         <w:adjustRightInd w:val="0"/>
-        <w:ind w:left="284" w:right="51" w:hanging="426"/>
+        <w:ind w:left="284" w:right="-425" w:hanging="426"/>
         <w:jc w:val="both"/>
         <w:rPr>
           <w:rFonts w:ascii="Arial" w:hAnsi="Arial" w:cs="Arial"/>
@@ -3000,7 +2516,7 @@
         <w:autoSpaceDE w:val="0"/>
         <w:autoSpaceDN w:val="0"/>
         <w:adjustRightInd w:val="0"/>
-        <w:ind w:left="284" w:right="51" w:hanging="426"/>
+        <w:ind w:left="284" w:right="-425" w:hanging="426"/>
         <w:jc w:val="both"/>
         <w:rPr>
           <w:rFonts w:ascii="Arial" w:hAnsi="Arial" w:cs="Arial"/>
@@ -3023,17 +2539,16 @@
         <w:autoSpaceDE w:val="0"/>
         <w:autoSpaceDN w:val="0"/>
         <w:adjustRightInd w:val="0"/>
-        <w:ind w:left="284" w:right="51" w:hanging="426"/>
-        <w:jc w:val="both"/>
-        <w:rPr>
-          <w:rFonts w:ascii="Arial" w:hAnsi="Arial" w:cs="Arial"/>
-        </w:rPr>
-      </w:pPr>
-      <w:r>
-        <w:rPr>
-          <w:rFonts w:ascii="Arial" w:hAnsi="Arial" w:cs="Arial"/>
-        </w:rPr>
-        <w:lastRenderedPageBreak/>
+        <w:ind w:left="284" w:right="-425" w:hanging="426"/>
+        <w:jc w:val="both"/>
+        <w:rPr>
+          <w:rFonts w:ascii="Arial" w:hAnsi="Arial" w:cs="Arial"/>
+        </w:rPr>
+      </w:pPr>
+      <w:r>
+        <w:rPr>
+          <w:rFonts w:ascii="Arial" w:hAnsi="Arial" w:cs="Arial"/>
+        </w:rPr>
         <w:t>Cumplir con las normas del Sistema General de Riesgos Laborales, en especial las siguientes:</w:t>
       </w:r>
     </w:p>
@@ -3047,7 +2562,7 @@
         <w:autoSpaceDE w:val="0"/>
         <w:autoSpaceDN w:val="0"/>
         <w:adjustRightInd w:val="0"/>
-        <w:ind w:left="851" w:right="51" w:hanging="284"/>
+        <w:ind w:left="851" w:right="-425" w:hanging="284"/>
         <w:jc w:val="both"/>
         <w:rPr>
           <w:rFonts w:ascii="Arial" w:hAnsi="Arial" w:cs="Arial"/>
@@ -3070,7 +2585,7 @@
         <w:autoSpaceDE w:val="0"/>
         <w:autoSpaceDN w:val="0"/>
         <w:adjustRightInd w:val="0"/>
-        <w:ind w:left="851" w:right="51" w:hanging="284"/>
+        <w:ind w:left="851" w:right="-425" w:hanging="284"/>
         <w:jc w:val="both"/>
         <w:rPr>
           <w:rFonts w:ascii="Arial" w:hAnsi="Arial" w:cs="Arial"/>
@@ -3093,7 +2608,7 @@
         <w:autoSpaceDE w:val="0"/>
         <w:autoSpaceDN w:val="0"/>
         <w:adjustRightInd w:val="0"/>
-        <w:ind w:left="851" w:right="51" w:hanging="284"/>
+        <w:ind w:left="851" w:right="-425" w:hanging="284"/>
         <w:jc w:val="both"/>
         <w:rPr>
           <w:rFonts w:ascii="Arial" w:hAnsi="Arial" w:cs="Arial"/>
@@ -3116,7 +2631,7 @@
         <w:autoSpaceDE w:val="0"/>
         <w:autoSpaceDN w:val="0"/>
         <w:adjustRightInd w:val="0"/>
-        <w:ind w:left="851" w:right="51" w:hanging="284"/>
+        <w:ind w:left="851" w:right="-425" w:hanging="284"/>
         <w:jc w:val="both"/>
         <w:rPr>
           <w:rFonts w:ascii="Arial" w:hAnsi="Arial" w:cs="Arial"/>
@@ -3139,7 +2654,7 @@
         <w:autoSpaceDE w:val="0"/>
         <w:autoSpaceDN w:val="0"/>
         <w:adjustRightInd w:val="0"/>
-        <w:ind w:left="851" w:right="51" w:hanging="284"/>
+        <w:ind w:left="851" w:right="-425" w:hanging="284"/>
         <w:jc w:val="both"/>
         <w:rPr>
           <w:rFonts w:ascii="Arial" w:hAnsi="Arial" w:cs="Arial"/>
@@ -3162,7 +2677,7 @@
         <w:autoSpaceDE w:val="0"/>
         <w:autoSpaceDN w:val="0"/>
         <w:adjustRightInd w:val="0"/>
-        <w:ind w:left="851" w:right="51" w:hanging="284"/>
+        <w:ind w:left="851" w:right="-425" w:hanging="284"/>
         <w:jc w:val="both"/>
         <w:rPr>
           <w:rFonts w:ascii="Arial" w:hAnsi="Arial" w:cs="Arial"/>
@@ -3173,6 +2688,144 @@
           <w:rFonts w:ascii="Arial" w:hAnsi="Arial" w:cs="Arial"/>
         </w:rPr>
         <w:t>Practicarse de acuerdo con lo establecido en los artículos 8 y 9 de la resolución 2346 – 2007 el examen médico pre – ocupacional y allegar el certificado a ACTIVA.</w:t>
+      </w:r>
+    </w:p>
+    <w:p>
+      <w:pPr>
+        <w:pStyle w:val="Prrafodelista"/>
+        <w:numPr>
+          <w:ilvl w:val="0"/>
+          <w:numId w:val="13"/>
+        </w:numPr>
+        <w:autoSpaceDE w:val="0"/>
+        <w:autoSpaceDN w:val="0"/>
+        <w:adjustRightInd w:val="0"/>
+        <w:ind w:left="426" w:right="-425" w:hanging="426"/>
+        <w:jc w:val="both"/>
+        <w:rPr>
+          <w:rFonts w:ascii="Arial" w:hAnsi="Arial" w:cs="Arial"/>
+        </w:rPr>
+      </w:pPr>
+      <w:r>
+        <w:rPr>
+          <w:rFonts w:ascii="Arial" w:hAnsi="Arial" w:cs="Arial"/>
+        </w:rPr>
+        <w:t>Los derechos de propiedad intelectual de los trabajos que desarrolle el Contratista serán exclusivos de ACTIVA.</w:t>
+      </w:r>
+    </w:p>
+    <w:p>
+      <w:pPr>
+        <w:pStyle w:val="Prrafodelista"/>
+        <w:numPr>
+          <w:ilvl w:val="0"/>
+          <w:numId w:val="13"/>
+        </w:numPr>
+        <w:autoSpaceDE w:val="0"/>
+        <w:autoSpaceDN w:val="0"/>
+        <w:adjustRightInd w:val="0"/>
+        <w:ind w:left="426" w:right="-425" w:hanging="426"/>
+        <w:jc w:val="both"/>
+        <w:rPr>
+          <w:rFonts w:ascii="Arial" w:hAnsi="Arial" w:cs="Arial"/>
+        </w:rPr>
+      </w:pPr>
+      <w:r>
+        <w:rPr>
+          <w:rFonts w:ascii="Arial" w:hAnsi="Arial" w:cs="Arial"/>
+        </w:rPr>
+        <w:t>Entregar los servicios objeto del contrato en los términos establecidos en la propuesta presentada.</w:t>
+      </w:r>
+    </w:p>
+    <w:p>
+      <w:pPr>
+        <w:pStyle w:val="Prrafodelista"/>
+        <w:numPr>
+          <w:ilvl w:val="0"/>
+          <w:numId w:val="13"/>
+        </w:numPr>
+        <w:autoSpaceDE w:val="0"/>
+        <w:autoSpaceDN w:val="0"/>
+        <w:adjustRightInd w:val="0"/>
+        <w:ind w:left="426" w:right="-425" w:hanging="426"/>
+        <w:jc w:val="both"/>
+        <w:rPr>
+          <w:rFonts w:ascii="Arial" w:hAnsi="Arial" w:cs="Arial"/>
+        </w:rPr>
+      </w:pPr>
+      <w:r>
+        <w:rPr>
+          <w:rFonts w:ascii="Arial" w:hAnsi="Arial" w:cs="Arial"/>
+        </w:rPr>
+        <w:t>Informar a la EMPRESA DE PARQUES Y EVENTOS DE ANTIOQUIA – ACTIVA   sobre la ocurrencia de hechos o circunstancias que puedan generar una inoportuna o indebida ejecución del contrato o que puedan poner en peligro los intereses legítimos de la Entidad. El aviso mencionado deberá hacerse efectivo dentro de las veinticuatro (24) horas siguientes, del hecho o circunstancia en referencia.</w:t>
+      </w:r>
+    </w:p>
+    <w:p>
+      <w:pPr>
+        <w:pStyle w:val="Prrafodelista"/>
+        <w:numPr>
+          <w:ilvl w:val="0"/>
+          <w:numId w:val="13"/>
+        </w:numPr>
+        <w:autoSpaceDE w:val="0"/>
+        <w:autoSpaceDN w:val="0"/>
+        <w:adjustRightInd w:val="0"/>
+        <w:ind w:left="426" w:right="-425" w:hanging="426"/>
+        <w:jc w:val="both"/>
+        <w:rPr>
+          <w:rFonts w:ascii="Arial" w:hAnsi="Arial" w:cs="Arial"/>
+        </w:rPr>
+      </w:pPr>
+      <w:r>
+        <w:rPr>
+          <w:rFonts w:ascii="Arial" w:hAnsi="Arial" w:cs="Arial"/>
+        </w:rPr>
+        <w:t>Informar a la EMPRESA DE PARQUES Y EVENTOS DE ANTIOQUIA – ACTIVA.  sobre su incursión en causal de incompatibilidad o inhabilidad sobreviniente. El aviso deberá hacerse efectivo dentro del día hábil siguiente al conocimiento, por parte del contratista, de los hechos o circunstancias que generen la inhabilidad o incompatibilidad.</w:t>
+      </w:r>
+    </w:p>
+    <w:p>
+      <w:pPr>
+        <w:pStyle w:val="Prrafodelista"/>
+        <w:numPr>
+          <w:ilvl w:val="0"/>
+          <w:numId w:val="13"/>
+        </w:numPr>
+        <w:autoSpaceDE w:val="0"/>
+        <w:autoSpaceDN w:val="0"/>
+        <w:adjustRightInd w:val="0"/>
+        <w:ind w:left="426" w:right="-425" w:hanging="426"/>
+        <w:jc w:val="both"/>
+        <w:rPr>
+          <w:rFonts w:ascii="Arial" w:hAnsi="Arial" w:cs="Arial"/>
+        </w:rPr>
+      </w:pPr>
+      <w:r>
+        <w:rPr>
+          <w:rFonts w:ascii="Arial" w:hAnsi="Arial" w:cs="Arial"/>
+        </w:rPr>
+        <w:t>Entregar los productos descritos en las especificaciones técnicas del proceso y/o la propuesta.</w:t>
+      </w:r>
+    </w:p>
+    <w:p>
+      <w:pPr>
+        <w:pStyle w:val="Prrafodelista"/>
+        <w:numPr>
+          <w:ilvl w:val="0"/>
+          <w:numId w:val="13"/>
+        </w:numPr>
+        <w:autoSpaceDE w:val="0"/>
+        <w:autoSpaceDN w:val="0"/>
+        <w:adjustRightInd w:val="0"/>
+        <w:ind w:left="426" w:right="-425" w:hanging="426"/>
+        <w:jc w:val="both"/>
+        <w:rPr>
+          <w:rFonts w:ascii="Arial" w:hAnsi="Arial" w:cs="Arial"/>
+        </w:rPr>
+      </w:pPr>
+      <w:r>
+        <w:rPr>
+          <w:rFonts w:ascii="Arial" w:hAnsi="Arial" w:cs="Arial"/>
+        </w:rPr>
+        <w:t>Realizar todas las actividades necesarias para el cumplimiento del objeto del contrato a satisfacción, así como todas las actividades relacionadas con el objeto de este, y que sean necesarias para el cabal cumplimiento de éste.</w:t>
       </w:r>
     </w:p>
     <w:p>
@@ -3195,144 +2848,7 @@
         <w:rPr>
           <w:rFonts w:ascii="Arial" w:hAnsi="Arial" w:cs="Arial"/>
         </w:rPr>
-        <w:t>Los derechos de propiedad intelectual de los trabajos que desarrolle el Contratista serán exclusivos de ACTIVA.</w:t>
-      </w:r>
-    </w:p>
-    <w:p>
-      <w:pPr>
-        <w:pStyle w:val="Prrafodelista"/>
-        <w:numPr>
-          <w:ilvl w:val="0"/>
-          <w:numId w:val="13"/>
-        </w:numPr>
-        <w:autoSpaceDE w:val="0"/>
-        <w:autoSpaceDN w:val="0"/>
-        <w:adjustRightInd w:val="0"/>
-        <w:ind w:left="426" w:right="51" w:hanging="426"/>
-        <w:jc w:val="both"/>
-        <w:rPr>
-          <w:rFonts w:ascii="Arial" w:hAnsi="Arial" w:cs="Arial"/>
-        </w:rPr>
-      </w:pPr>
-      <w:r>
-        <w:rPr>
-          <w:rFonts w:ascii="Arial" w:hAnsi="Arial" w:cs="Arial"/>
-        </w:rPr>
-        <w:t>Entregar los servicios objeto del contrato en los términos establecidos en la propuesta presentada.</w:t>
-      </w:r>
-    </w:p>
-    <w:p>
-      <w:pPr>
-        <w:pStyle w:val="Prrafodelista"/>
-        <w:numPr>
-          <w:ilvl w:val="0"/>
-          <w:numId w:val="13"/>
-        </w:numPr>
-        <w:autoSpaceDE w:val="0"/>
-        <w:autoSpaceDN w:val="0"/>
-        <w:adjustRightInd w:val="0"/>
-        <w:ind w:left="426" w:right="51" w:hanging="426"/>
-        <w:jc w:val="both"/>
-        <w:rPr>
-          <w:rFonts w:ascii="Arial" w:hAnsi="Arial" w:cs="Arial"/>
-        </w:rPr>
-      </w:pPr>
-      <w:r>
-        <w:rPr>
-          <w:rFonts w:ascii="Arial" w:hAnsi="Arial" w:cs="Arial"/>
-        </w:rPr>
-        <w:t>Informar a la EMPRESA DE PARQUES Y EVENTOS DE ANTIOQUIA – ACTIVA   sobre la ocurrencia de hechos o circunstancias que puedan generar una inoportuna o indebida ejecución del contrato o que puedan poner en peligro los intereses legítimos de la Entidad. El aviso mencionado deberá hacerse efectivo dentro de las veinticuatro (24) horas siguientes, del hecho o circunstancia en referencia.</w:t>
-      </w:r>
-    </w:p>
-    <w:p>
-      <w:pPr>
-        <w:pStyle w:val="Prrafodelista"/>
-        <w:numPr>
-          <w:ilvl w:val="0"/>
-          <w:numId w:val="13"/>
-        </w:numPr>
-        <w:autoSpaceDE w:val="0"/>
-        <w:autoSpaceDN w:val="0"/>
-        <w:adjustRightInd w:val="0"/>
-        <w:ind w:left="426" w:right="51" w:hanging="426"/>
-        <w:jc w:val="both"/>
-        <w:rPr>
-          <w:rFonts w:ascii="Arial" w:hAnsi="Arial" w:cs="Arial"/>
-        </w:rPr>
-      </w:pPr>
-      <w:r>
-        <w:rPr>
-          <w:rFonts w:ascii="Arial" w:hAnsi="Arial" w:cs="Arial"/>
-        </w:rPr>
-        <w:t>Informar a la EMPRESA DE PARQUES Y EVENTOS DE ANTIOQUIA – ACTIVA.  sobre su incursión en causal de incompatibilidad o inhabilidad sobreviniente. El aviso deberá hacerse efectivo dentro del día hábil siguiente al conocimiento, por parte del contratista, de los hechos o circunstancias que generen la inhabilidad o incompatibilidad.</w:t>
-      </w:r>
-    </w:p>
-    <w:p>
-      <w:pPr>
-        <w:pStyle w:val="Prrafodelista"/>
-        <w:numPr>
-          <w:ilvl w:val="0"/>
-          <w:numId w:val="13"/>
-        </w:numPr>
-        <w:autoSpaceDE w:val="0"/>
-        <w:autoSpaceDN w:val="0"/>
-        <w:adjustRightInd w:val="0"/>
-        <w:ind w:left="426" w:right="51" w:hanging="426"/>
-        <w:jc w:val="both"/>
-        <w:rPr>
-          <w:rFonts w:ascii="Arial" w:hAnsi="Arial" w:cs="Arial"/>
-        </w:rPr>
-      </w:pPr>
-      <w:r>
-        <w:rPr>
-          <w:rFonts w:ascii="Arial" w:hAnsi="Arial" w:cs="Arial"/>
-        </w:rPr>
-        <w:t>Entregar los productos descritos en las especificaciones técnicas del proceso y/o la propuesta.</w:t>
-      </w:r>
-    </w:p>
-    <w:p>
-      <w:pPr>
-        <w:pStyle w:val="Prrafodelista"/>
-        <w:numPr>
-          <w:ilvl w:val="0"/>
-          <w:numId w:val="13"/>
-        </w:numPr>
-        <w:autoSpaceDE w:val="0"/>
-        <w:autoSpaceDN w:val="0"/>
-        <w:adjustRightInd w:val="0"/>
-        <w:ind w:left="426" w:right="51" w:hanging="426"/>
-        <w:jc w:val="both"/>
-        <w:rPr>
-          <w:rFonts w:ascii="Arial" w:hAnsi="Arial" w:cs="Arial"/>
-        </w:rPr>
-      </w:pPr>
-      <w:r>
-        <w:rPr>
-          <w:rFonts w:ascii="Arial" w:hAnsi="Arial" w:cs="Arial"/>
-        </w:rPr>
-        <w:t>Realizar todas las actividades necesarias para el cumplimiento del objeto del contrato a satisfacción, así como todas las actividades relacionadas con el objeto de este, y que sean necesarias para el cabal cumplimiento de éste.</w:t>
-      </w:r>
-    </w:p>
-    <w:p>
-      <w:pPr>
-        <w:pStyle w:val="Prrafodelista"/>
-        <w:numPr>
-          <w:ilvl w:val="0"/>
-          <w:numId w:val="13"/>
-        </w:numPr>
-        <w:autoSpaceDE w:val="0"/>
-        <w:autoSpaceDN w:val="0"/>
-        <w:adjustRightInd w:val="0"/>
-        <w:ind w:left="426" w:right="51" w:hanging="426"/>
-        <w:jc w:val="both"/>
-        <w:rPr>
-          <w:rFonts w:ascii="Arial" w:hAnsi="Arial" w:cs="Arial"/>
-        </w:rPr>
-      </w:pPr>
-      <w:r>
-        <w:rPr>
-          <w:rFonts w:ascii="Arial" w:hAnsi="Arial" w:cs="Arial"/>
-        </w:rPr>
+        <w:lastRenderedPageBreak/>
         <w:t>Contar con las herramientas necesarias para desarrollar el objeto del contrato.</w:t>
       </w:r>
     </w:p>
@@ -3358,7 +2874,7 @@
         <w:autoSpaceDE w:val="0"/>
         <w:autoSpaceDN w:val="0"/>
         <w:adjustRightInd w:val="0"/>
-        <w:ind w:right="51"/>
+        <w:ind w:right="-425"/>
         <w:contextualSpacing/>
         <w:jc w:val="both"/>
         <w:rPr>
@@ -3442,7 +2958,7 @@
           <w:rFonts w:ascii="Arial" w:eastAsia="Arial" w:hAnsi="Arial" w:cs="Arial"/>
           <w:bdr w:val="none" w:sz="0" w:space="0" w:color="auto" w:frame="1"/>
         </w:rPr>
-        <w:t xml:space="preserve">{supervisor_nombre}</w:t>
+        <w:t>{supervisor_nombre}</w:t>
       </w:r>
       <w:r>
         <w:rPr>
@@ -3467,14 +2983,7 @@
           <w:rFonts w:ascii="Arial" w:hAnsi="Arial" w:cs="Arial"/>
           <w:lang w:eastAsia="es-CO"/>
         </w:rPr>
-        <w:t xml:space="preserve">{supervisor_cargo}</w:t>
-      </w:r>
-      <w:r>
-        <w:rPr>
-          <w:rFonts w:ascii="Arial" w:hAnsi="Arial" w:cs="Arial"/>
-          <w:lang w:eastAsia="es-CO"/>
-        </w:rPr>
-        <w:t xml:space="preserve"/>
+        <w:t>{supervisor_cargo}</w:t>
       </w:r>
       <w:r>
         <w:rPr>
@@ -3733,15 +3242,7 @@
           <w:rFonts w:ascii="Arial" w:hAnsi="Arial" w:cs="Arial"/>
           <w:color w:val="000000" w:themeColor="text1"/>
         </w:rPr>
-        <w:t xml:space="preserve">Exigir </w:t>
-      </w:r>
-      <w:r>
-        <w:rPr>
-          <w:rFonts w:ascii="Arial" w:hAnsi="Arial" w:cs="Arial"/>
-          <w:color w:val="000000" w:themeColor="text1"/>
-        </w:rPr>
-        <w:lastRenderedPageBreak/>
-        <w:t xml:space="preserve">y verificar previo a la realización de los pagos, que </w:t>
+        <w:t xml:space="preserve">Exigir y verificar previo a la realización de los pagos, que </w:t>
       </w:r>
       <w:r>
         <w:rPr>
@@ -4025,6 +3526,7 @@
     <w:p>
       <w:pPr>
         <w:spacing w:line="300" w:lineRule="auto"/>
+        <w:ind w:right="-283"/>
         <w:jc w:val="both"/>
       </w:pPr>
       <w:r>
@@ -4077,7 +3579,7 @@
         <w:autoSpaceDE w:val="0"/>
         <w:autoSpaceDN w:val="0"/>
         <w:adjustRightInd w:val="0"/>
-        <w:ind w:left="708" w:right="-374"/>
+        <w:ind w:right="-374"/>
         <w:jc w:val="both"/>
         <w:rPr>
           <w:rFonts w:ascii="Arial" w:eastAsia="Calibri" w:hAnsi="Arial" w:cs="Arial"/>
@@ -4140,6 +3642,7 @@
       <w:pPr>
         <w:suppressAutoHyphens/>
         <w:spacing w:before="240" w:after="240"/>
+        <w:ind w:right="-425"/>
         <w:jc w:val="both"/>
         <w:rPr>
           <w:rFonts w:ascii="Arial" w:hAnsi="Arial" w:cs="Arial"/>
@@ -4207,7 +3710,15 @@
           <w:rFonts w:eastAsiaTheme="minorEastAsia"/>
           <w:color w:val="000000" w:themeColor="text1"/>
         </w:rPr>
-        <w:t xml:space="preserve"> es inferior a veinte (20) salarios mínimos legales mensuales vigentes (SMMLV), no se exigirá la constitución de garantías, atendiendo la naturaleza del objeto, la modalidad de contratación y la justificación contenida en los estudios previos, conforme a la normativa vigente y al Manual de Contratación de la EMPRESA DE PARQUES Y EVENTOS DE ANTIOQUIA – ACTIVA. No obstante, la entidad podrá exigir garantías cuando lo considere necesario para proteger los intereses públicos, dejando constancia de la motivación en los documentos del proceso</w:t>
+        <w:t xml:space="preserve"> es inferior a veinte (20) salarios mínimos legales mensuales vigentes (SMMLV), no se exigirá la constitución de garantías, atendiendo la naturaleza del objeto, la modalidad de contratación y la justificación contenida en los estudios previos, </w:t>
+      </w:r>
+      <w:r>
+        <w:rPr>
+          <w:rFonts w:eastAsiaTheme="minorEastAsia"/>
+          <w:color w:val="000000" w:themeColor="text1"/>
+        </w:rPr>
+        <w:lastRenderedPageBreak/>
+        <w:t>conforme a la normativa vigente y al Manual de Contratación de la EMPRESA DE PARQUES Y EVENTOS DE ANTIOQUIA – ACTIVA. No obstante, la entidad podrá exigir garantías cuando lo considere necesario para proteger los intereses públicos, dejando constancia de la motivación en los documentos del proceso</w:t>
       </w:r>
       <w:r>
         <w:rPr>
@@ -4222,6 +3733,7 @@
       <w:pPr>
         <w:suppressAutoHyphens/>
         <w:spacing w:before="240" w:after="240"/>
+        <w:ind w:right="-425"/>
         <w:jc w:val="both"/>
         <w:rPr>
           <w:rFonts w:ascii="Arial" w:hAnsi="Arial" w:cs="Arial"/>
@@ -4268,22 +3780,22 @@
       <w:pPr>
         <w:suppressAutoHyphens/>
         <w:spacing w:before="240" w:after="240"/>
-        <w:jc w:val="both"/>
-        <w:rPr>
-          <w:rFonts w:ascii="Arial" w:hAnsi="Arial" w:cs="Arial"/>
-          <w:color w:val="000000" w:themeColor="text1"/>
-          <w:spacing w:val="-3"/>
-        </w:rPr>
-      </w:pPr>
-      <w:r>
-        <w:rPr>
-          <w:rFonts w:ascii="Arial" w:hAnsi="Arial" w:cs="Arial"/>
-          <w:b/>
-          <w:bCs/>
-          <w:color w:val="000000" w:themeColor="text1"/>
-          <w:spacing w:val="-3"/>
-        </w:rPr>
-        <w:lastRenderedPageBreak/>
+        <w:ind w:right="-425"/>
+        <w:jc w:val="both"/>
+        <w:rPr>
+          <w:rFonts w:ascii="Arial" w:hAnsi="Arial" w:cs="Arial"/>
+          <w:color w:val="000000" w:themeColor="text1"/>
+          <w:spacing w:val="-3"/>
+        </w:rPr>
+      </w:pPr>
+      <w:r>
+        <w:rPr>
+          <w:rFonts w:ascii="Arial" w:hAnsi="Arial" w:cs="Arial"/>
+          <w:b/>
+          <w:bCs/>
+          <w:color w:val="000000" w:themeColor="text1"/>
+          <w:spacing w:val="-3"/>
+        </w:rPr>
         <w:t xml:space="preserve">DÉCIMA SEGUNDA: CESIÓN Y SUBCONTRATACIÓN. </w:t>
       </w:r>
       <w:r>
@@ -4920,7 +4432,14 @@
         <w:rPr>
           <w:rFonts w:ascii="Arial" w:hAnsi="Arial" w:cs="Arial"/>
         </w:rPr>
-        <w:t xml:space="preserve">se compromete a responder por su cuenta y riesgo, todo aquel requerimiento, reclamación o presentación de informes, si con posterioridad a la terminación de este contrato llegare a necesitar </w:t>
+        <w:t xml:space="preserve">se compromete a responder por su cuenta y riesgo, todo aquel requerimiento, reclamación o presentación de informes, si con posterioridad a la </w:t>
+      </w:r>
+      <w:r>
+        <w:rPr>
+          <w:rFonts w:ascii="Arial" w:hAnsi="Arial" w:cs="Arial"/>
+        </w:rPr>
+        <w:lastRenderedPageBreak/>
+        <w:t xml:space="preserve">terminación de este contrato llegare a necesitar </w:t>
       </w:r>
       <w:r>
         <w:rPr>
@@ -5111,16 +4630,7 @@
           <w:color w:val="000000" w:themeColor="text1"/>
           <w:spacing w:val="-3"/>
         </w:rPr>
-        <w:t xml:space="preserve"> por las </w:t>
-      </w:r>
-      <w:r>
-        <w:rPr>
-          <w:rFonts w:ascii="Arial" w:hAnsi="Arial" w:cs="Arial"/>
-          <w:color w:val="000000" w:themeColor="text1"/>
-          <w:spacing w:val="-3"/>
-        </w:rPr>
-        <w:lastRenderedPageBreak/>
-        <w:t xml:space="preserve">partes. Para su ejecución se requiere el Registro Presupuestal, la asignación del Supervisor y la firma del Acta de </w:t>
+        <w:t xml:space="preserve"> por las partes. Para su ejecución se requiere el Registro Presupuestal, la asignación del Supervisor y la firma del Acta de </w:t>
       </w:r>
       <w:r>
         <w:rPr>
@@ -5449,6 +4959,7 @@
       <w:pPr>
         <w:suppressAutoHyphens/>
         <w:spacing w:before="240" w:after="240"/>
+        <w:ind w:right="-425"/>
         <w:jc w:val="both"/>
         <w:rPr>
           <w:rFonts w:ascii="Arial" w:eastAsia="Arial" w:hAnsi="Arial" w:cs="Arial"/>
@@ -5485,6 +4996,7 @@
       <w:pPr>
         <w:suppressAutoHyphens/>
         <w:spacing w:before="240" w:after="240"/>
+        <w:ind w:right="-425"/>
         <w:jc w:val="both"/>
         <w:rPr>
           <w:rFonts w:ascii="Arial" w:eastAsia="Arial" w:hAnsi="Arial" w:cs="Arial"/>
@@ -5521,6 +5033,7 @@
       <w:pPr>
         <w:suppressAutoHyphens/>
         <w:spacing w:before="240" w:after="240"/>
+        <w:ind w:right="-425"/>
         <w:jc w:val="both"/>
         <w:rPr>
           <w:rStyle w:val="normaltextrun"/>
@@ -5537,6 +5050,7 @@
           <w:bCs/>
           <w:color w:val="000000" w:themeColor="text1"/>
         </w:rPr>
+        <w:lastRenderedPageBreak/>
         <w:t xml:space="preserve">VIGÉSIMA </w:t>
       </w:r>
       <w:r>
@@ -5574,7 +5088,7 @@
             <w:rStyle w:val="Hipervnculo"/>
             <w:rFonts w:ascii="Arial" w:hAnsi="Arial" w:cs="Arial"/>
           </w:rPr>
-          <w:t xml:space="preserve">{email_contratista}</w:t>
+          <w:t>{email_contratista}</w:t>
         </w:r>
       </w:hyperlink>
     </w:p>
@@ -5623,84 +5137,7 @@
           <w:rFonts w:ascii="Arial" w:hAnsi="Arial" w:cs="Arial"/>
           <w:color w:val="000000" w:themeColor="text1"/>
         </w:rPr>
-        <w:t xml:space="preserve">{fecha_firma_letras}</w:t>
-      </w:r>
-      <w:r>
-        <w:rPr>
-          <w:rFonts w:ascii="Arial" w:hAnsi="Arial" w:cs="Arial"/>
-          <w:color w:val="000000" w:themeColor="text1"/>
-        </w:rPr>
-        <w:t xml:space="preserve"/>
-      </w:r>
-      <w:r>
-        <w:rPr>
-          <w:rFonts w:ascii="Arial" w:hAnsi="Arial" w:cs="Arial"/>
-          <w:color w:val="000000" w:themeColor="text1"/>
-        </w:rPr>
-        <w:t/>
-      </w:r>
-      <w:r>
-        <w:rPr>
-          <w:rFonts w:ascii="Arial" w:hAnsi="Arial" w:cs="Arial"/>
-          <w:color w:val="000000" w:themeColor="text1"/>
-        </w:rPr>
-        <w:t/>
-      </w:r>
-      <w:r>
-        <w:rPr>
-          <w:rFonts w:ascii="Arial" w:hAnsi="Arial" w:cs="Arial"/>
-          <w:color w:val="000000" w:themeColor="text1"/>
-        </w:rPr>
-        <w:t/>
-      </w:r>
-      <w:r>
-        <w:rPr>
-          <w:rFonts w:ascii="Arial" w:hAnsi="Arial" w:cs="Arial"/>
-          <w:color w:val="000000" w:themeColor="text1"/>
-        </w:rPr>
-        <w:t/>
-      </w:r>
-      <w:r>
-        <w:rPr>
-          <w:rFonts w:ascii="Arial" w:hAnsi="Arial" w:cs="Arial"/>
-          <w:color w:val="000000" w:themeColor="text1"/>
-        </w:rPr>
-        <w:t xml:space="preserve"/>
-      </w:r>
-      <w:r>
-        <w:rPr>
-          <w:rFonts w:ascii="Arial" w:hAnsi="Arial" w:cs="Arial"/>
-          <w:color w:val="000000" w:themeColor="text1"/>
-        </w:rPr>
-        <w:t xml:space="preserve"/>
-      </w:r>
-      <w:r>
-        <w:rPr>
-          <w:rFonts w:ascii="Arial" w:hAnsi="Arial" w:cs="Arial"/>
-          <w:color w:val="000000" w:themeColor="text1"/>
-        </w:rPr>
-        <w:t/>
-      </w:r>
-      <w:r>
-        <w:rPr>
-          <w:rFonts w:ascii="Arial" w:hAnsi="Arial" w:cs="Arial"/>
-          <w:color w:val="000000" w:themeColor="text1"/>
-        </w:rPr>
-        <w:t xml:space="preserve"/>
-      </w:r>
-      <w:r>
-        <w:rPr>
-          <w:rFonts w:ascii="Arial" w:hAnsi="Arial" w:cs="Arial"/>
-          <w:color w:val="000000" w:themeColor="text1"/>
-        </w:rPr>
-        <w:t/>
-      </w:r>
-      <w:r>
-        <w:rPr>
-          <w:rFonts w:ascii="Arial" w:hAnsi="Arial" w:cs="Arial"/>
-          <w:color w:val="000000" w:themeColor="text1"/>
-        </w:rPr>
-        <w:t/>
+        <w:t>{fecha_firma_letras}</w:t>
       </w:r>
     </w:p>
     <w:p>
@@ -5908,16 +5345,22 @@
           <w:bCs/>
           <w:lang w:val="pt-BR"/>
         </w:rPr>
-        <w:t xml:space="preserve">{nombre_contratista}</w:t>
-      </w:r>
-      <w:r>
+        <w:t>{nombre_contratista}</w:t>
+      </w:r>
+    </w:p>
+    <w:p>
+      <w:pPr>
+        <w:ind w:right="-425"/>
+        <w:jc w:val="both"/>
         <w:rPr>
           <w:rFonts w:ascii="Arial" w:eastAsia="Calibri" w:hAnsi="Arial" w:cs="Arial"/>
-          <w:b/>
-          <w:bCs/>
-          <w:lang w:val="pt-BR"/>
-        </w:rPr>
-        <w:t xml:space="preserve"/>
+        </w:rPr>
+      </w:pPr>
+      <w:r>
+        <w:rPr>
+          <w:rFonts w:ascii="Arial" w:eastAsia="Calibri" w:hAnsi="Arial" w:cs="Arial"/>
+        </w:rPr>
+        <w:t xml:space="preserve">CONTRATISTA </w:t>
       </w:r>
     </w:p>
     <w:p>
@@ -5928,37 +5371,518 @@
           <w:rFonts w:ascii="Arial" w:eastAsia="Calibri" w:hAnsi="Arial" w:cs="Arial"/>
         </w:rPr>
       </w:pPr>
-      <w:r>
+    </w:p>
+    <w:p>
+      <w:pPr>
+        <w:ind w:right="-425"/>
+        <w:jc w:val="both"/>
         <w:rPr>
           <w:rFonts w:ascii="Arial" w:eastAsia="Calibri" w:hAnsi="Arial" w:cs="Arial"/>
         </w:rPr>
-        <w:t xml:space="preserve">CONTRATISTA </w:t>
-      </w:r>
-    </w:p>
+      </w:pPr>
+    </w:p>
+    <w:tbl>
+      <w:tblPr>
+        <w:tblW w:w="0" w:type="auto"/>
+        <w:tblLook w:val="04A0" w:firstRow="1" w:lastRow="0" w:firstColumn="1" w:lastColumn="0" w:noHBand="0" w:noVBand="1"/>
+      </w:tblPr>
+      <w:tblGrid>
+        <w:gridCol w:w="1550"/>
+        <w:gridCol w:w="4058"/>
+        <w:gridCol w:w="3161"/>
+      </w:tblGrid>
+      <w:tr>
+        <w:trPr>
+          <w:trHeight w:val="195"/>
+        </w:trPr>
+        <w:tc>
+          <w:tcPr>
+            <w:tcW w:w="1550" w:type="dxa"/>
+            <w:tcBorders>
+              <w:top w:val="single" w:sz="8" w:space="0" w:color="auto"/>
+              <w:left w:val="single" w:sz="8" w:space="0" w:color="auto"/>
+              <w:bottom w:val="single" w:sz="8" w:space="0" w:color="auto"/>
+              <w:right w:val="single" w:sz="8" w:space="0" w:color="auto"/>
+            </w:tcBorders>
+          </w:tcPr>
+          <w:p>
+            <w:pPr>
+              <w:ind w:right="-425"/>
+              <w:jc w:val="both"/>
+              <w:rPr>
+                <w:rFonts w:ascii="Arial" w:eastAsia="Calibri" w:hAnsi="Arial" w:cs="Arial"/>
+                <w:sz w:val="16"/>
+                <w:szCs w:val="16"/>
+              </w:rPr>
+            </w:pPr>
+          </w:p>
+        </w:tc>
+        <w:tc>
+          <w:tcPr>
+            <w:tcW w:w="4058" w:type="dxa"/>
+            <w:tcBorders>
+              <w:top w:val="single" w:sz="8" w:space="0" w:color="auto"/>
+              <w:left w:val="single" w:sz="8" w:space="0" w:color="auto"/>
+              <w:bottom w:val="single" w:sz="8" w:space="0" w:color="auto"/>
+              <w:right w:val="single" w:sz="8" w:space="0" w:color="auto"/>
+            </w:tcBorders>
+            <w:hideMark/>
+          </w:tcPr>
+          <w:p>
+            <w:pPr>
+              <w:ind w:right="-425"/>
+              <w:jc w:val="both"/>
+              <w:rPr>
+                <w:rFonts w:ascii="Arial" w:eastAsia="Calibri" w:hAnsi="Arial" w:cs="Arial"/>
+                <w:sz w:val="16"/>
+                <w:szCs w:val="16"/>
+              </w:rPr>
+            </w:pPr>
+            <w:r>
+              <w:rPr>
+                <w:rFonts w:ascii="Arial" w:eastAsia="Calibri" w:hAnsi="Arial" w:cs="Arial"/>
+                <w:sz w:val="16"/>
+                <w:szCs w:val="16"/>
+              </w:rPr>
+              <w:t>NOMBRE</w:t>
+            </w:r>
+          </w:p>
+        </w:tc>
+        <w:tc>
+          <w:tcPr>
+            <w:tcW w:w="3161" w:type="dxa"/>
+            <w:tcBorders>
+              <w:top w:val="single" w:sz="8" w:space="0" w:color="auto"/>
+              <w:left w:val="single" w:sz="8" w:space="0" w:color="auto"/>
+              <w:bottom w:val="single" w:sz="8" w:space="0" w:color="auto"/>
+              <w:right w:val="single" w:sz="8" w:space="0" w:color="auto"/>
+            </w:tcBorders>
+            <w:hideMark/>
+          </w:tcPr>
+          <w:p>
+            <w:pPr>
+              <w:ind w:right="-425"/>
+              <w:jc w:val="both"/>
+              <w:rPr>
+                <w:rFonts w:ascii="Arial" w:eastAsia="Calibri" w:hAnsi="Arial" w:cs="Arial"/>
+                <w:sz w:val="16"/>
+                <w:szCs w:val="16"/>
+              </w:rPr>
+            </w:pPr>
+            <w:r>
+              <w:rPr>
+                <w:rFonts w:ascii="Arial" w:eastAsia="Calibri" w:hAnsi="Arial" w:cs="Arial"/>
+                <w:sz w:val="16"/>
+                <w:szCs w:val="16"/>
+              </w:rPr>
+              <w:t>FIRMA</w:t>
+            </w:r>
+          </w:p>
+        </w:tc>
+      </w:tr>
+      <w:tr>
+        <w:trPr>
+          <w:trHeight w:val="210"/>
+        </w:trPr>
+        <w:tc>
+          <w:tcPr>
+            <w:tcW w:w="1550" w:type="dxa"/>
+            <w:tcBorders>
+              <w:top w:val="single" w:sz="8" w:space="0" w:color="auto"/>
+              <w:left w:val="single" w:sz="8" w:space="0" w:color="auto"/>
+              <w:bottom w:val="single" w:sz="8" w:space="0" w:color="auto"/>
+              <w:right w:val="single" w:sz="8" w:space="0" w:color="auto"/>
+            </w:tcBorders>
+            <w:hideMark/>
+          </w:tcPr>
+          <w:p>
+            <w:pPr>
+              <w:ind w:right="-425"/>
+              <w:jc w:val="both"/>
+              <w:rPr>
+                <w:rFonts w:ascii="Arial" w:eastAsia="Calibri" w:hAnsi="Arial" w:cs="Arial"/>
+                <w:sz w:val="16"/>
+                <w:szCs w:val="16"/>
+              </w:rPr>
+            </w:pPr>
+            <w:r>
+              <w:rPr>
+                <w:rFonts w:ascii="Arial" w:eastAsia="Calibri" w:hAnsi="Arial" w:cs="Arial"/>
+                <w:sz w:val="16"/>
+                <w:szCs w:val="16"/>
+              </w:rPr>
+              <w:t>Proyectó:</w:t>
+            </w:r>
+          </w:p>
+        </w:tc>
+        <w:tc>
+          <w:tcPr>
+            <w:tcW w:w="4058" w:type="dxa"/>
+            <w:tcBorders>
+              <w:top w:val="single" w:sz="8" w:space="0" w:color="auto"/>
+              <w:left w:val="single" w:sz="8" w:space="0" w:color="auto"/>
+              <w:bottom w:val="single" w:sz="8" w:space="0" w:color="auto"/>
+              <w:right w:val="single" w:sz="8" w:space="0" w:color="auto"/>
+            </w:tcBorders>
+          </w:tcPr>
+          <w:p>
+            <w:pPr>
+              <w:ind w:right="-425"/>
+              <w:jc w:val="both"/>
+              <w:rPr>
+                <w:rFonts w:ascii="Arial" w:eastAsia="Calibri" w:hAnsi="Arial" w:cs="Arial"/>
+                <w:sz w:val="16"/>
+                <w:szCs w:val="16"/>
+              </w:rPr>
+            </w:pPr>
+            <w:r>
+              <w:rPr>
+                <w:rFonts w:ascii="Arial" w:eastAsia="Calibri" w:hAnsi="Arial" w:cs="Arial"/>
+                <w:sz w:val="16"/>
+                <w:szCs w:val="16"/>
+              </w:rPr>
+              <w:t xml:space="preserve">{proyecto}</w:t>
+            </w:r>
+          </w:p>
+        </w:tc>
+        <w:tc>
+          <w:tcPr>
+            <w:tcW w:w="3161" w:type="dxa"/>
+            <w:tcBorders>
+              <w:top w:val="single" w:sz="8" w:space="0" w:color="auto"/>
+              <w:left w:val="single" w:sz="8" w:space="0" w:color="auto"/>
+              <w:bottom w:val="single" w:sz="8" w:space="0" w:color="auto"/>
+              <w:right w:val="single" w:sz="8" w:space="0" w:color="auto"/>
+            </w:tcBorders>
+            <w:hideMark/>
+          </w:tcPr>
+          <w:p>
+            <w:pPr>
+              <w:ind w:right="-425"/>
+              <w:jc w:val="both"/>
+              <w:rPr>
+                <w:rFonts w:ascii="Arial" w:eastAsia="Calibri" w:hAnsi="Arial" w:cs="Arial"/>
+                <w:sz w:val="16"/>
+                <w:szCs w:val="16"/>
+              </w:rPr>
+            </w:pPr>
+            <w:r>
+              <w:rPr>
+                <w:rFonts w:ascii="Arial" w:eastAsia="Calibri" w:hAnsi="Arial" w:cs="Arial"/>
+                <w:sz w:val="16"/>
+                <w:szCs w:val="16"/>
+              </w:rPr>
+              <w:t xml:space="preserve"> </w:t>
+            </w:r>
+          </w:p>
+        </w:tc>
+      </w:tr>
+      <w:tr>
+        <w:trPr>
+          <w:trHeight w:val="150"/>
+        </w:trPr>
+        <w:tc>
+          <w:tcPr>
+            <w:tcW w:w="1550" w:type="dxa"/>
+            <w:tcBorders>
+              <w:top w:val="single" w:sz="8" w:space="0" w:color="auto"/>
+              <w:left w:val="single" w:sz="8" w:space="0" w:color="auto"/>
+              <w:bottom w:val="single" w:sz="8" w:space="0" w:color="auto"/>
+              <w:right w:val="single" w:sz="8" w:space="0" w:color="auto"/>
+            </w:tcBorders>
+            <w:hideMark/>
+          </w:tcPr>
+          <w:p>
+            <w:pPr>
+              <w:ind w:right="-425"/>
+              <w:jc w:val="both"/>
+              <w:rPr>
+                <w:rFonts w:ascii="Arial" w:eastAsia="Calibri" w:hAnsi="Arial" w:cs="Arial"/>
+                <w:sz w:val="16"/>
+                <w:szCs w:val="16"/>
+              </w:rPr>
+            </w:pPr>
+            <w:r>
+              <w:rPr>
+                <w:rFonts w:ascii="Arial" w:eastAsia="Calibri" w:hAnsi="Arial" w:cs="Arial"/>
+                <w:sz w:val="16"/>
+                <w:szCs w:val="16"/>
+              </w:rPr>
+              <w:t>Revis</w:t>
+            </w:r>
+            <w:r>
+              <w:rPr>
+                <w:rFonts w:ascii="Arial" w:eastAsia="Calibri" w:hAnsi="Arial" w:cs="Arial"/>
+                <w:sz w:val="16"/>
+                <w:szCs w:val="16"/>
+              </w:rPr>
+              <w:t>ión jurídica</w:t>
+            </w:r>
+          </w:p>
+        </w:tc>
+        <w:tc>
+          <w:tcPr>
+            <w:tcW w:w="4058" w:type="dxa"/>
+            <w:tcBorders>
+              <w:top w:val="single" w:sz="8" w:space="0" w:color="auto"/>
+              <w:left w:val="single" w:sz="8" w:space="0" w:color="auto"/>
+              <w:bottom w:val="single" w:sz="8" w:space="0" w:color="auto"/>
+              <w:right w:val="single" w:sz="8" w:space="0" w:color="auto"/>
+            </w:tcBorders>
+          </w:tcPr>
+          <w:p>
+            <w:pPr>
+              <w:ind w:right="-425"/>
+              <w:jc w:val="both"/>
+              <w:rPr>
+                <w:rFonts w:ascii="Arial" w:eastAsia="Calibri" w:hAnsi="Arial" w:cs="Arial"/>
+                <w:sz w:val="16"/>
+                <w:szCs w:val="16"/>
+              </w:rPr>
+            </w:pPr>
+            <w:r>
+              <w:rPr>
+                <w:rFonts w:ascii="Arial" w:eastAsia="Calibri" w:hAnsi="Arial" w:cs="Arial"/>
+                <w:sz w:val="16"/>
+                <w:szCs w:val="16"/>
+              </w:rPr>
+              <w:t xml:space="preserve">{revision_juridica}</w:t>
+            </w:r>
+          </w:p>
+        </w:tc>
+        <w:tc>
+          <w:tcPr>
+            <w:tcW w:w="3161" w:type="dxa"/>
+            <w:tcBorders>
+              <w:top w:val="single" w:sz="8" w:space="0" w:color="auto"/>
+              <w:left w:val="single" w:sz="8" w:space="0" w:color="auto"/>
+              <w:bottom w:val="single" w:sz="8" w:space="0" w:color="auto"/>
+              <w:right w:val="single" w:sz="8" w:space="0" w:color="auto"/>
+            </w:tcBorders>
+            <w:hideMark/>
+          </w:tcPr>
+          <w:p>
+            <w:pPr>
+              <w:ind w:right="-425"/>
+              <w:jc w:val="both"/>
+              <w:rPr>
+                <w:rFonts w:ascii="Arial" w:eastAsia="Calibri" w:hAnsi="Arial" w:cs="Arial"/>
+                <w:sz w:val="16"/>
+                <w:szCs w:val="16"/>
+              </w:rPr>
+            </w:pPr>
+            <w:r>
+              <w:rPr>
+                <w:rFonts w:ascii="Arial" w:eastAsia="Calibri" w:hAnsi="Arial" w:cs="Arial"/>
+                <w:sz w:val="16"/>
+                <w:szCs w:val="16"/>
+              </w:rPr>
+              <w:t xml:space="preserve"> </w:t>
+            </w:r>
+          </w:p>
+        </w:tc>
+      </w:tr>
+      <w:tr>
+        <w:trPr>
+          <w:trHeight w:val="150"/>
+        </w:trPr>
+        <w:tc>
+          <w:tcPr>
+            <w:tcW w:w="1550" w:type="dxa"/>
+            <w:tcBorders>
+              <w:top w:val="single" w:sz="8" w:space="0" w:color="auto"/>
+              <w:left w:val="single" w:sz="8" w:space="0" w:color="auto"/>
+              <w:bottom w:val="single" w:sz="8" w:space="0" w:color="auto"/>
+              <w:right w:val="single" w:sz="8" w:space="0" w:color="auto"/>
+            </w:tcBorders>
+            <w:hideMark/>
+          </w:tcPr>
+          <w:p>
+            <w:pPr>
+              <w:ind w:right="-425"/>
+              <w:jc w:val="both"/>
+              <w:rPr>
+                <w:rFonts w:ascii="Arial" w:eastAsia="Calibri" w:hAnsi="Arial" w:cs="Arial"/>
+                <w:sz w:val="16"/>
+                <w:szCs w:val="16"/>
+              </w:rPr>
+            </w:pPr>
+            <w:r>
+              <w:rPr>
+                <w:rFonts w:ascii="Arial" w:eastAsia="Calibri" w:hAnsi="Arial" w:cs="Arial"/>
+                <w:sz w:val="16"/>
+                <w:szCs w:val="16"/>
+              </w:rPr>
+              <w:t>Revis</w:t>
+            </w:r>
+            <w:r>
+              <w:rPr>
+                <w:rFonts w:ascii="Arial" w:eastAsia="Calibri" w:hAnsi="Arial" w:cs="Arial"/>
+                <w:sz w:val="16"/>
+                <w:szCs w:val="16"/>
+              </w:rPr>
+              <w:t>ión financiera</w:t>
+            </w:r>
+          </w:p>
+        </w:tc>
+        <w:tc>
+          <w:tcPr>
+            <w:tcW w:w="4058" w:type="dxa"/>
+            <w:tcBorders>
+              <w:top w:val="single" w:sz="8" w:space="0" w:color="auto"/>
+              <w:left w:val="single" w:sz="8" w:space="0" w:color="auto"/>
+              <w:bottom w:val="single" w:sz="8" w:space="0" w:color="auto"/>
+              <w:right w:val="single" w:sz="8" w:space="0" w:color="auto"/>
+            </w:tcBorders>
+          </w:tcPr>
+          <w:p>
+            <w:pPr>
+              <w:ind w:right="-425"/>
+              <w:jc w:val="both"/>
+              <w:rPr>
+                <w:rFonts w:ascii="Arial" w:eastAsia="Calibri" w:hAnsi="Arial" w:cs="Arial"/>
+                <w:sz w:val="16"/>
+                <w:szCs w:val="16"/>
+              </w:rPr>
+            </w:pPr>
+            <w:r>
+              <w:rPr>
+                <w:rFonts w:ascii="Arial" w:eastAsia="Calibri" w:hAnsi="Arial" w:cs="Arial"/>
+                <w:sz w:val="16"/>
+                <w:szCs w:val="16"/>
+              </w:rPr>
+              <w:t xml:space="preserve">{revision_financiera}</w:t>
+            </w:r>
+          </w:p>
+        </w:tc>
+        <w:tc>
+          <w:tcPr>
+            <w:tcW w:w="3161" w:type="dxa"/>
+            <w:tcBorders>
+              <w:top w:val="single" w:sz="8" w:space="0" w:color="auto"/>
+              <w:left w:val="single" w:sz="8" w:space="0" w:color="auto"/>
+              <w:bottom w:val="single" w:sz="8" w:space="0" w:color="auto"/>
+              <w:right w:val="single" w:sz="8" w:space="0" w:color="auto"/>
+            </w:tcBorders>
+            <w:hideMark/>
+          </w:tcPr>
+          <w:p>
+            <w:pPr>
+              <w:ind w:right="-425"/>
+              <w:jc w:val="both"/>
+              <w:rPr>
+                <w:rFonts w:ascii="Arial" w:eastAsia="Calibri" w:hAnsi="Arial" w:cs="Arial"/>
+                <w:sz w:val="16"/>
+                <w:szCs w:val="16"/>
+              </w:rPr>
+            </w:pPr>
+            <w:r>
+              <w:rPr>
+                <w:rFonts w:ascii="Arial" w:eastAsia="Calibri" w:hAnsi="Arial" w:cs="Arial"/>
+                <w:sz w:val="16"/>
+                <w:szCs w:val="16"/>
+              </w:rPr>
+              <w:t xml:space="preserve"> </w:t>
+            </w:r>
+          </w:p>
+        </w:tc>
+      </w:tr>
+      <w:tr>
+        <w:trPr>
+          <w:trHeight w:val="255"/>
+        </w:trPr>
+        <w:tc>
+          <w:tcPr>
+            <w:tcW w:w="1550" w:type="dxa"/>
+            <w:tcBorders>
+              <w:top w:val="single" w:sz="8" w:space="0" w:color="auto"/>
+              <w:left w:val="single" w:sz="8" w:space="0" w:color="auto"/>
+              <w:bottom w:val="single" w:sz="8" w:space="0" w:color="auto"/>
+              <w:right w:val="single" w:sz="8" w:space="0" w:color="auto"/>
+            </w:tcBorders>
+            <w:hideMark/>
+          </w:tcPr>
+          <w:p>
+            <w:pPr>
+              <w:ind w:right="-425"/>
+              <w:jc w:val="both"/>
+              <w:rPr>
+                <w:rFonts w:ascii="Arial" w:eastAsia="Calibri" w:hAnsi="Arial" w:cs="Arial"/>
+                <w:sz w:val="16"/>
+                <w:szCs w:val="16"/>
+              </w:rPr>
+            </w:pPr>
+            <w:r>
+              <w:rPr>
+                <w:rFonts w:ascii="Arial" w:eastAsia="Calibri" w:hAnsi="Arial" w:cs="Arial"/>
+                <w:sz w:val="16"/>
+                <w:szCs w:val="16"/>
+              </w:rPr>
+              <w:t xml:space="preserve">Aprobó: </w:t>
+            </w:r>
+          </w:p>
+        </w:tc>
+        <w:tc>
+          <w:tcPr>
+            <w:tcW w:w="4058" w:type="dxa"/>
+            <w:tcBorders>
+              <w:top w:val="single" w:sz="8" w:space="0" w:color="auto"/>
+              <w:left w:val="single" w:sz="8" w:space="0" w:color="auto"/>
+              <w:bottom w:val="single" w:sz="8" w:space="0" w:color="auto"/>
+              <w:right w:val="single" w:sz="8" w:space="0" w:color="auto"/>
+            </w:tcBorders>
+          </w:tcPr>
+          <w:p>
+            <w:pPr>
+              <w:ind w:right="-425"/>
+              <w:jc w:val="both"/>
+              <w:rPr>
+                <w:rFonts w:ascii="Arial" w:eastAsia="Calibri" w:hAnsi="Arial" w:cs="Arial"/>
+                <w:sz w:val="16"/>
+                <w:szCs w:val="16"/>
+              </w:rPr>
+            </w:pPr>
+            <w:r>
+              <w:rPr>
+                <w:rFonts w:ascii="Arial" w:eastAsia="Calibri" w:hAnsi="Arial" w:cs="Arial"/>
+                <w:sz w:val="16"/>
+                <w:szCs w:val="16"/>
+              </w:rPr>
+              <w:t xml:space="preserve">{aprobo}</w:t>
+            </w:r>
+          </w:p>
+        </w:tc>
+        <w:tc>
+          <w:tcPr>
+            <w:tcW w:w="3161" w:type="dxa"/>
+            <w:tcBorders>
+              <w:top w:val="single" w:sz="8" w:space="0" w:color="auto"/>
+              <w:left w:val="single" w:sz="8" w:space="0" w:color="auto"/>
+              <w:bottom w:val="single" w:sz="8" w:space="0" w:color="auto"/>
+              <w:right w:val="single" w:sz="8" w:space="0" w:color="auto"/>
+            </w:tcBorders>
+          </w:tcPr>
+          <w:p>
+            <w:pPr>
+              <w:ind w:right="-425"/>
+              <w:jc w:val="both"/>
+              <w:rPr>
+                <w:rFonts w:ascii="Arial" w:eastAsia="Calibri" w:hAnsi="Arial" w:cs="Arial"/>
+                <w:sz w:val="16"/>
+                <w:szCs w:val="16"/>
+              </w:rPr>
+            </w:pPr>
+          </w:p>
+        </w:tc>
+      </w:tr>
+    </w:tbl>
     <w:p>
       <w:pPr>
         <w:ind w:right="-425"/>
         <w:jc w:val="both"/>
         <w:rPr>
           <w:rFonts w:ascii="Arial" w:eastAsia="Calibri" w:hAnsi="Arial" w:cs="Arial"/>
-        </w:rPr>
-      </w:pPr>
-    </w:p>
-    <w:p>
-      <w:pPr>
-        <w:ind w:right="-425"/>
-        <w:jc w:val="both"/>
-        <w:rPr>
-          <w:rFonts w:ascii="Arial" w:eastAsia="Calibri" w:hAnsi="Arial" w:cs="Arial"/>
-        </w:rPr>
-      </w:pPr>
-    </w:p>
-    <w:p>
-      <w:pPr>
-        <w:ind w:right="-425"/>
-        <w:jc w:val="both"/>
-        <w:rPr>
-          <w:rFonts w:ascii="Arial" w:eastAsia="Calibri" w:hAnsi="Arial" w:cs="Arial"/>
+          <w:lang w:val="es-CO"/>
         </w:rPr>
       </w:pPr>
     </w:p>
@@ -7811,7 +7735,6 @@
   <w:style w:type="character" w:default="1" w:styleId="Fuentedeprrafopredeter">
     <w:name w:val="Default Paragraph Font"/>
     <w:uiPriority w:val="1"/>
-    <w:semiHidden/>
     <w:unhideWhenUsed/>
   </w:style>
   <w:style w:type="table" w:default="1" w:styleId="Tablanormal">
@@ -9948,17 +9871,6 @@
 </file>
 
 <file path=customXml/item1.xml><?xml version="1.0" encoding="utf-8"?>
-<p:properties xmlns:p="http://schemas.microsoft.com/office/2006/metadata/properties" xmlns:xsi="http://www.w3.org/2001/XMLSchema-instance" xmlns:pc="http://schemas.microsoft.com/office/infopath/2007/PartnerControls">
-  <documentManagement>
-    <TaxCatchAll xmlns="e817aef0-ee18-43df-8fb6-a8e286a8ac2b" xsi:nil="true"/>
-    <lcf76f155ced4ddcb4097134ff3c332f xmlns="0492cccb-6647-486e-854d-ea79f74918b5">
-      <Terms xmlns="http://schemas.microsoft.com/office/infopath/2007/PartnerControls"/>
-    </lcf76f155ced4ddcb4097134ff3c332f>
-  </documentManagement>
-</p:properties>
-</file>
-
-<file path=customXml/item2.xml><?xml version="1.0" encoding="utf-8"?>
 <ct:contentTypeSchema xmlns:ct="http://schemas.microsoft.com/office/2006/metadata/contentType" xmlns:ma="http://schemas.microsoft.com/office/2006/metadata/properties/metaAttributes" ct:_="" ma:_="" ma:contentTypeName="Documento" ma:contentTypeID="0x01010009D7B0C64E77F64B88D164F77CD540CE" ma:contentTypeVersion="20" ma:contentTypeDescription="Crear nuevo documento." ma:contentTypeScope="" ma:versionID="d8051832bc294fed6848679ea26f6dc1">
   <xsd:schema xmlns:xsd="http://www.w3.org/2001/XMLSchema" xmlns:xs="http://www.w3.org/2001/XMLSchema" xmlns:p="http://schemas.microsoft.com/office/2006/metadata/properties" xmlns:ns2="e817aef0-ee18-43df-8fb6-a8e286a8ac2b" xmlns:ns3="0492cccb-6647-486e-854d-ea79f74918b5" targetNamespace="http://schemas.microsoft.com/office/2006/metadata/properties" ma:root="true" ma:fieldsID="75340f7370c80217d15047bf2bf01844" ns2:_="" ns3:_="">
     <xsd:import namespace="e817aef0-ee18-43df-8fb6-a8e286a8ac2b"/>
@@ -10219,6 +10131,17 @@
 </ct:contentTypeSchema>
 </file>
 
+<file path=customXml/item2.xml><?xml version="1.0" encoding="utf-8"?>
+<p:properties xmlns:p="http://schemas.microsoft.com/office/2006/metadata/properties" xmlns:xsi="http://www.w3.org/2001/XMLSchema-instance" xmlns:pc="http://schemas.microsoft.com/office/infopath/2007/PartnerControls">
+  <documentManagement>
+    <TaxCatchAll xmlns="e817aef0-ee18-43df-8fb6-a8e286a8ac2b" xsi:nil="true"/>
+    <lcf76f155ced4ddcb4097134ff3c332f xmlns="0492cccb-6647-486e-854d-ea79f74918b5">
+      <Terms xmlns="http://schemas.microsoft.com/office/infopath/2007/PartnerControls"/>
+    </lcf76f155ced4ddcb4097134ff3c332f>
+  </documentManagement>
+</p:properties>
+</file>
+
 <file path=customXml/item3.xml><?xml version="1.0" encoding="utf-8"?>
 <?mso-contentType ?>
 <FormTemplates xmlns="http://schemas.microsoft.com/sharepoint/v3/contenttype/forms">
@@ -10229,17 +10152,6 @@
 </file>
 
 <file path=customXml/itemProps1.xml><?xml version="1.0" encoding="utf-8"?>
-<ds:datastoreItem xmlns:ds="http://schemas.openxmlformats.org/officeDocument/2006/customXml" ds:itemID="{450D9E2E-3E33-4BC6-ADC7-18A7ACCB1B1D}">
-  <ds:schemaRefs>
-    <ds:schemaRef ds:uri="http://schemas.microsoft.com/office/2006/metadata/properties"/>
-    <ds:schemaRef ds:uri="http://schemas.microsoft.com/office/infopath/2007/PartnerControls"/>
-    <ds:schemaRef ds:uri="e817aef0-ee18-43df-8fb6-a8e286a8ac2b"/>
-    <ds:schemaRef ds:uri="0492cccb-6647-486e-854d-ea79f74918b5"/>
-  </ds:schemaRefs>
-</ds:datastoreItem>
-</file>
-
-<file path=customXml/itemProps2.xml><?xml version="1.0" encoding="utf-8"?>
 <ds:datastoreItem xmlns:ds="http://schemas.openxmlformats.org/officeDocument/2006/customXml" ds:itemID="{F4E5EB90-5BAF-4863-892F-E288E4160F4D}">
   <ds:schemaRefs>
     <ds:schemaRef ds:uri="http://schemas.microsoft.com/office/2006/metadata/contentType"/>
@@ -10258,6 +10170,17 @@
 </ds:datastoreItem>
 </file>
 
+<file path=customXml/itemProps2.xml><?xml version="1.0" encoding="utf-8"?>
+<ds:datastoreItem xmlns:ds="http://schemas.openxmlformats.org/officeDocument/2006/customXml" ds:itemID="{450D9E2E-3E33-4BC6-ADC7-18A7ACCB1B1D}">
+  <ds:schemaRefs>
+    <ds:schemaRef ds:uri="http://schemas.microsoft.com/office/2006/metadata/properties"/>
+    <ds:schemaRef ds:uri="http://schemas.microsoft.com/office/infopath/2007/PartnerControls"/>
+    <ds:schemaRef ds:uri="e817aef0-ee18-43df-8fb6-a8e286a8ac2b"/>
+    <ds:schemaRef ds:uri="0492cccb-6647-486e-854d-ea79f74918b5"/>
+  </ds:schemaRefs>
+</ds:datastoreItem>
+</file>
+
 <file path=customXml/itemProps3.xml><?xml version="1.0" encoding="utf-8"?>
 <ds:datastoreItem xmlns:ds="http://schemas.openxmlformats.org/officeDocument/2006/customXml" ds:itemID="{14603871-D6DD-49BB-A886-8F65CE0FA38A}">
   <ds:schemaRefs>

</xml_diff>

<commit_message>
Reemplazar plantilla_contrato.docx por la nueva versión
La plantilla nueva conserva los mismos 19 marcadores, por lo que es
compatible con el formulario y datosPlantilla actuales. Verificado con
render real (docxtemplater): los 19 marcadores se rellenan y ninguno
queda sin resolver.

Co-Authored-By: Claude Opus 4.8 <noreply@anthropic.com>
Claude-Session: https://claude.ai/code/session_01RbqmWfif1ErCa4oEtLm5Ho
</commit_message>
<xml_diff>
--- a/plantilla_contrato.docx
+++ b/plantilla_contrato.docx
@@ -576,15 +576,17 @@
           <w:color w:val="000000" w:themeColor="text1"/>
           <w:spacing w:val="-3"/>
         </w:rPr>
-        <w:t xml:space="preserve">Entre los suscritos a </w:t>
+        <w:t xml:space="preserve">Entre los suscritos a saber: </w:t>
       </w:r>
       <w:r>
         <w:rPr>
           <w:rFonts w:ascii="Arial" w:eastAsia="Arial" w:hAnsi="Arial" w:cs="Arial"/>
-          <w:color w:val="000000" w:themeColor="text1"/>
-          <w:spacing w:val="-3"/>
-        </w:rPr>
-        <w:t xml:space="preserve">saber: </w:t>
+          <w:b/>
+          <w:bCs/>
+          <w:color w:val="000000" w:themeColor="text1"/>
+          <w:spacing w:val="-3"/>
+        </w:rPr>
+        <w:t xml:space="preserve">SANTIAGO </w:t>
       </w:r>
       <w:r>
         <w:rPr>
@@ -594,7 +596,7 @@
           <w:color w:val="000000" w:themeColor="text1"/>
           <w:spacing w:val="-3"/>
         </w:rPr>
-        <w:t xml:space="preserve">SANTIAGO </w:t>
+        <w:t>AT</w:t>
       </w:r>
       <w:r>
         <w:rPr>
@@ -604,7 +606,7 @@
           <w:color w:val="000000" w:themeColor="text1"/>
           <w:spacing w:val="-3"/>
         </w:rPr>
-        <w:t>AT</w:t>
+        <w:t>EH</w:t>
       </w:r>
       <w:r>
         <w:rPr>
@@ -614,7 +616,7 @@
           <w:color w:val="000000" w:themeColor="text1"/>
           <w:spacing w:val="-3"/>
         </w:rPr>
-        <w:t>EH</w:t>
+        <w:t>O</w:t>
       </w:r>
       <w:r>
         <w:rPr>
@@ -624,17 +626,15 @@
           <w:color w:val="000000" w:themeColor="text1"/>
           <w:spacing w:val="-3"/>
         </w:rPr>
-        <w:t>O</w:t>
+        <w:t>RTÚA SIERRA</w:t>
       </w:r>
       <w:r>
         <w:rPr>
           <w:rFonts w:ascii="Arial" w:eastAsia="Arial" w:hAnsi="Arial" w:cs="Arial"/>
-          <w:b/>
-          <w:bCs/>
-          <w:color w:val="000000" w:themeColor="text1"/>
-          <w:spacing w:val="-3"/>
-        </w:rPr>
-        <w:t>RTÚA SIERRA</w:t>
+          <w:color w:val="000000" w:themeColor="text1"/>
+          <w:spacing w:val="-3"/>
+        </w:rPr>
+        <w:t xml:space="preserve">, mayor de edad, portador de la cédula de ciudadanía N° </w:t>
       </w:r>
       <w:r>
         <w:rPr>
@@ -642,7 +642,7 @@
           <w:color w:val="000000" w:themeColor="text1"/>
           <w:spacing w:val="-3"/>
         </w:rPr>
-        <w:t xml:space="preserve">, mayor de edad, portador de la cédula de ciudadanía N° </w:t>
+        <w:t>71.555.983</w:t>
       </w:r>
       <w:r>
         <w:rPr>
@@ -650,7 +650,7 @@
           <w:color w:val="000000" w:themeColor="text1"/>
           <w:spacing w:val="-3"/>
         </w:rPr>
-        <w:t>71.555.983</w:t>
+        <w:t>, nombrad</w:t>
       </w:r>
       <w:r>
         <w:rPr>
@@ -658,280 +658,240 @@
           <w:color w:val="000000" w:themeColor="text1"/>
           <w:spacing w:val="-3"/>
         </w:rPr>
+        <w:t>o</w:t>
+      </w:r>
+      <w:r>
+        <w:rPr>
+          <w:rFonts w:ascii="Arial" w:eastAsia="Arial" w:hAnsi="Arial" w:cs="Arial"/>
+          <w:color w:val="000000" w:themeColor="text1"/>
+          <w:spacing w:val="-3"/>
+        </w:rPr>
+        <w:t xml:space="preserve"> mediante el Decreto Departamental </w:t>
+      </w:r>
+      <w:r>
+        <w:rPr>
+          <w:rFonts w:ascii="Arial" w:eastAsia="Arial" w:hAnsi="Arial" w:cs="Arial"/>
+          <w:color w:val="000000" w:themeColor="text1"/>
+          <w:spacing w:val="-3"/>
+        </w:rPr>
+        <w:t>No</w:t>
+      </w:r>
+      <w:r>
+        <w:rPr>
+          <w:rFonts w:ascii="Arial" w:eastAsia="Arial" w:hAnsi="Arial" w:cs="Arial"/>
+          <w:color w:val="000000" w:themeColor="text1"/>
+          <w:spacing w:val="-3"/>
+        </w:rPr>
+        <w:t xml:space="preserve"> </w:t>
+      </w:r>
+      <w:r>
+        <w:rPr>
+          <w:rFonts w:ascii="Arial" w:eastAsia="Arial" w:hAnsi="Arial" w:cs="Arial"/>
+          <w:color w:val="000000" w:themeColor="text1"/>
+          <w:spacing w:val="-3"/>
+        </w:rPr>
+        <w:t>202</w:t>
+      </w:r>
+      <w:r>
+        <w:rPr>
+          <w:rFonts w:ascii="Arial" w:eastAsia="Arial" w:hAnsi="Arial" w:cs="Arial"/>
+          <w:color w:val="000000" w:themeColor="text1"/>
+          <w:spacing w:val="-3"/>
+        </w:rPr>
+        <w:t>5</w:t>
+      </w:r>
+      <w:r>
+        <w:rPr>
+          <w:rFonts w:ascii="Arial" w:eastAsia="Arial" w:hAnsi="Arial" w:cs="Arial"/>
+          <w:color w:val="000000" w:themeColor="text1"/>
+          <w:spacing w:val="-3"/>
+        </w:rPr>
+        <w:t>070000649</w:t>
+      </w:r>
+      <w:r>
+        <w:rPr>
+          <w:rFonts w:ascii="Arial" w:eastAsia="Arial" w:hAnsi="Arial" w:cs="Arial"/>
+          <w:color w:val="000000" w:themeColor="text1"/>
+          <w:spacing w:val="-3"/>
+        </w:rPr>
+        <w:t xml:space="preserve"> del </w:t>
+      </w:r>
+      <w:r>
+        <w:rPr>
+          <w:rFonts w:ascii="Arial" w:eastAsia="Arial" w:hAnsi="Arial" w:cs="Arial"/>
+          <w:color w:val="000000" w:themeColor="text1"/>
+          <w:spacing w:val="-3"/>
+        </w:rPr>
+        <w:t>20</w:t>
+      </w:r>
+      <w:r>
+        <w:rPr>
+          <w:rFonts w:ascii="Arial" w:eastAsia="Arial" w:hAnsi="Arial" w:cs="Arial"/>
+          <w:color w:val="000000" w:themeColor="text1"/>
+          <w:spacing w:val="-3"/>
+        </w:rPr>
+        <w:t xml:space="preserve"> de </w:t>
+      </w:r>
+      <w:r>
+        <w:rPr>
+          <w:rFonts w:ascii="Arial" w:eastAsia="Arial" w:hAnsi="Arial" w:cs="Arial"/>
+          <w:color w:val="000000" w:themeColor="text1"/>
+          <w:spacing w:val="-3"/>
+        </w:rPr>
+        <w:t>febrero</w:t>
+      </w:r>
+      <w:r>
+        <w:rPr>
+          <w:rFonts w:ascii="Arial" w:eastAsia="Arial" w:hAnsi="Arial" w:cs="Arial"/>
+          <w:color w:val="000000" w:themeColor="text1"/>
+          <w:spacing w:val="-3"/>
+        </w:rPr>
+        <w:t xml:space="preserve"> de 202</w:t>
+      </w:r>
+      <w:r>
+        <w:rPr>
+          <w:rFonts w:ascii="Arial" w:eastAsia="Arial" w:hAnsi="Arial" w:cs="Arial"/>
+          <w:color w:val="000000" w:themeColor="text1"/>
+          <w:spacing w:val="-3"/>
+        </w:rPr>
+        <w:t>5</w:t>
+      </w:r>
+      <w:r>
+        <w:rPr>
+          <w:rFonts w:ascii="Arial" w:eastAsia="Arial" w:hAnsi="Arial" w:cs="Arial"/>
+          <w:color w:val="000000" w:themeColor="text1"/>
+          <w:spacing w:val="-3"/>
+        </w:rPr>
+        <w:t>, como Gerente General</w:t>
+      </w:r>
+      <w:r>
+        <w:rPr>
+          <w:rFonts w:ascii="Arial" w:eastAsia="Arial" w:hAnsi="Arial" w:cs="Arial"/>
+          <w:color w:val="000000" w:themeColor="text1"/>
+          <w:spacing w:val="-3"/>
+        </w:rPr>
+        <w:t xml:space="preserve"> </w:t>
+      </w:r>
+      <w:r>
+        <w:rPr>
+          <w:rFonts w:ascii="Arial" w:eastAsia="Arial" w:hAnsi="Arial" w:cs="Arial"/>
+          <w:color w:val="000000" w:themeColor="text1"/>
+          <w:spacing w:val="-3"/>
+        </w:rPr>
+        <w:t xml:space="preserve">de la </w:t>
+      </w:r>
+      <w:r>
+        <w:rPr>
+          <w:rFonts w:ascii="Arial" w:eastAsia="Arial" w:hAnsi="Arial" w:cs="Arial"/>
+          <w:b/>
+          <w:bCs/>
+          <w:color w:val="000000" w:themeColor="text1"/>
+          <w:spacing w:val="-3"/>
+        </w:rPr>
+        <w:t>EMPRESA DE PARQUES Y EVENTOS DE ANTIOQUIA – ACTIVA</w:t>
+      </w:r>
+      <w:r>
+        <w:rPr>
+          <w:rFonts w:ascii="Arial" w:eastAsia="Arial" w:hAnsi="Arial" w:cs="Arial"/>
+          <w:b/>
+          <w:bCs/>
+          <w:color w:val="000000" w:themeColor="text1"/>
+        </w:rPr>
         <w:t>,</w:t>
       </w:r>
       <w:r>
         <w:rPr>
           <w:rFonts w:ascii="Arial" w:eastAsia="Arial" w:hAnsi="Arial" w:cs="Arial"/>
           <w:color w:val="000000" w:themeColor="text1"/>
-          <w:spacing w:val="-3"/>
-        </w:rPr>
-        <w:t xml:space="preserve"> nombrad</w:t>
+        </w:rPr>
+        <w:t xml:space="preserve"> entidad pública organizada como Empresa Industrial y Comercial del Estado, </w:t>
       </w:r>
       <w:r>
         <w:rPr>
           <w:rFonts w:ascii="Arial" w:eastAsia="Arial" w:hAnsi="Arial" w:cs="Arial"/>
           <w:color w:val="000000" w:themeColor="text1"/>
-          <w:spacing w:val="-3"/>
-        </w:rPr>
-        <w:t>o</w:t>
+        </w:rPr>
+        <w:t>d</w:t>
       </w:r>
       <w:r>
         <w:rPr>
           <w:rFonts w:ascii="Arial" w:eastAsia="Arial" w:hAnsi="Arial" w:cs="Arial"/>
           <w:color w:val="000000" w:themeColor="text1"/>
-          <w:spacing w:val="-3"/>
-        </w:rPr>
-        <w:t xml:space="preserve"> mediante el Decreto </w:t>
+        </w:rPr>
+        <w:t>escentralizada perteneciente al orden Departamental, identificada con NIT 901</w:t>
       </w:r>
       <w:r>
         <w:rPr>
           <w:rFonts w:ascii="Arial" w:eastAsia="Arial" w:hAnsi="Arial" w:cs="Arial"/>
           <w:color w:val="000000" w:themeColor="text1"/>
-          <w:spacing w:val="-3"/>
-        </w:rPr>
-        <w:t xml:space="preserve">Departamental </w:t>
+        </w:rPr>
+        <w:t>.</w:t>
       </w:r>
       <w:r>
         <w:rPr>
           <w:rFonts w:ascii="Arial" w:eastAsia="Arial" w:hAnsi="Arial" w:cs="Arial"/>
           <w:color w:val="000000" w:themeColor="text1"/>
-          <w:spacing w:val="-3"/>
-        </w:rPr>
-        <w:t>No</w:t>
+        </w:rPr>
+        <w:t>437</w:t>
       </w:r>
       <w:r>
         <w:rPr>
           <w:rFonts w:ascii="Arial" w:eastAsia="Arial" w:hAnsi="Arial" w:cs="Arial"/>
           <w:color w:val="000000" w:themeColor="text1"/>
-          <w:spacing w:val="-3"/>
+        </w:rPr>
+        <w:t>.</w:t>
+      </w:r>
+      <w:r>
+        <w:rPr>
+          <w:rFonts w:ascii="Arial" w:eastAsia="Arial" w:hAnsi="Arial" w:cs="Arial"/>
+          <w:color w:val="000000" w:themeColor="text1"/>
+        </w:rPr>
+        <w:t>957-8, quien para los efectos de este contrato se denominará</w:t>
+      </w:r>
+      <w:r>
+        <w:rPr>
+          <w:rFonts w:ascii="Arial" w:eastAsia="Arial" w:hAnsi="Arial" w:cs="Arial"/>
+          <w:b/>
+          <w:bCs/>
+          <w:color w:val="000000" w:themeColor="text1"/>
+        </w:rPr>
+        <w:t xml:space="preserve"> EL CONTRATANTE,</w:t>
+      </w:r>
+      <w:r>
+        <w:rPr>
+          <w:rFonts w:ascii="Arial" w:eastAsia="Arial" w:hAnsi="Arial" w:cs="Arial"/>
+          <w:color w:val="000000" w:themeColor="text1"/>
         </w:rPr>
         <w:t xml:space="preserve"> </w:t>
       </w:r>
       <w:r>
         <w:rPr>
           <w:rFonts w:ascii="Arial" w:eastAsia="Arial" w:hAnsi="Arial" w:cs="Arial"/>
-          <w:color w:val="000000" w:themeColor="text1"/>
-          <w:spacing w:val="-3"/>
-        </w:rPr>
-        <w:t>202</w:t>
+        </w:rPr>
+        <w:t xml:space="preserve">por una parte, </w:t>
       </w:r>
       <w:r>
         <w:rPr>
           <w:rFonts w:ascii="Arial" w:eastAsia="Arial" w:hAnsi="Arial" w:cs="Arial"/>
           <w:color w:val="000000" w:themeColor="text1"/>
-          <w:spacing w:val="-3"/>
-        </w:rPr>
-        <w:t>5</w:t>
+        </w:rPr>
+        <w:t>y de la otra,</w:t>
       </w:r>
       <w:r>
         <w:rPr>
           <w:rFonts w:ascii="Arial" w:eastAsia="Arial" w:hAnsi="Arial" w:cs="Arial"/>
           <w:color w:val="000000" w:themeColor="text1"/>
-          <w:spacing w:val="-3"/>
-        </w:rPr>
-        <w:t>070000649</w:t>
+        </w:rPr>
+        <w:t xml:space="preserve"> </w:t>
       </w:r>
       <w:r>
         <w:rPr>
           <w:rFonts w:ascii="Arial" w:eastAsia="Arial" w:hAnsi="Arial" w:cs="Arial"/>
-          <w:color w:val="000000" w:themeColor="text1"/>
-          <w:spacing w:val="-3"/>
-        </w:rPr>
-        <w:t xml:space="preserve"> del </w:t>
-      </w:r>
-      <w:r>
-        <w:rPr>
-          <w:rFonts w:ascii="Arial" w:eastAsia="Arial" w:hAnsi="Arial" w:cs="Arial"/>
-          <w:color w:val="000000" w:themeColor="text1"/>
-          <w:spacing w:val="-3"/>
-        </w:rPr>
-        <w:t>20</w:t>
-      </w:r>
-      <w:r>
-        <w:rPr>
-          <w:rFonts w:ascii="Arial" w:eastAsia="Arial" w:hAnsi="Arial" w:cs="Arial"/>
-          <w:color w:val="000000" w:themeColor="text1"/>
-          <w:spacing w:val="-3"/>
-        </w:rPr>
-        <w:t xml:space="preserve"> de </w:t>
-      </w:r>
-      <w:r>
-        <w:rPr>
-          <w:rFonts w:ascii="Arial" w:eastAsia="Arial" w:hAnsi="Arial" w:cs="Arial"/>
-          <w:color w:val="000000" w:themeColor="text1"/>
-          <w:spacing w:val="-3"/>
-        </w:rPr>
-        <w:t>febrero</w:t>
-      </w:r>
-      <w:r>
-        <w:rPr>
-          <w:rFonts w:ascii="Arial" w:eastAsia="Arial" w:hAnsi="Arial" w:cs="Arial"/>
-          <w:color w:val="000000" w:themeColor="text1"/>
-          <w:spacing w:val="-3"/>
-        </w:rPr>
-        <w:t xml:space="preserve"> de 202</w:t>
-      </w:r>
-      <w:r>
-        <w:rPr>
-          <w:rFonts w:ascii="Arial" w:eastAsia="Arial" w:hAnsi="Arial" w:cs="Arial"/>
-          <w:color w:val="000000" w:themeColor="text1"/>
-          <w:spacing w:val="-3"/>
-        </w:rPr>
-        <w:t>5</w:t>
-      </w:r>
-      <w:r>
-        <w:rPr>
-          <w:rFonts w:ascii="Arial" w:eastAsia="Arial" w:hAnsi="Arial" w:cs="Arial"/>
-          <w:color w:val="000000" w:themeColor="text1"/>
-          <w:spacing w:val="-3"/>
-        </w:rPr>
-        <w:t>, como Gerente General</w:t>
-      </w:r>
-      <w:r>
-        <w:rPr>
-          <w:rFonts w:ascii="Arial" w:eastAsia="Arial" w:hAnsi="Arial" w:cs="Arial"/>
-          <w:color w:val="000000" w:themeColor="text1"/>
-          <w:spacing w:val="-3"/>
-        </w:rPr>
-        <w:t xml:space="preserve"> </w:t>
-      </w:r>
-      <w:r>
-        <w:rPr>
-          <w:rFonts w:ascii="Arial" w:eastAsia="Arial" w:hAnsi="Arial" w:cs="Arial"/>
-          <w:color w:val="000000" w:themeColor="text1"/>
-          <w:spacing w:val="-3"/>
-        </w:rPr>
-        <w:t xml:space="preserve">de la </w:t>
-      </w:r>
-      <w:r>
-        <w:rPr>
-          <w:rFonts w:ascii="Arial" w:eastAsia="Arial" w:hAnsi="Arial" w:cs="Arial"/>
-          <w:b/>
-          <w:bCs/>
-          <w:color w:val="000000" w:themeColor="text1"/>
-          <w:spacing w:val="-3"/>
-        </w:rPr>
-        <w:t>EMPRESA DE PARQUES Y EVENTOS DE ANTIOQUIA – ACTIVA</w:t>
-      </w:r>
-      <w:r>
-        <w:rPr>
-          <w:rFonts w:ascii="Arial" w:eastAsia="Arial" w:hAnsi="Arial" w:cs="Arial"/>
-          <w:b/>
-          <w:bCs/>
-          <w:color w:val="000000" w:themeColor="text1"/>
-        </w:rPr>
-        <w:t>,</w:t>
-      </w:r>
-      <w:r>
-        <w:rPr>
-          <w:rFonts w:ascii="Arial" w:eastAsia="Arial" w:hAnsi="Arial" w:cs="Arial"/>
-          <w:color w:val="000000" w:themeColor="text1"/>
-        </w:rPr>
-        <w:t xml:space="preserve"> entidad pública organizada como Empresa Industrial y Comercial del Estado, </w:t>
-      </w:r>
-      <w:r>
-        <w:rPr>
-          <w:rFonts w:ascii="Arial" w:eastAsia="Arial" w:hAnsi="Arial" w:cs="Arial"/>
-          <w:color w:val="000000" w:themeColor="text1"/>
-        </w:rPr>
-        <w:t>d</w:t>
-      </w:r>
-      <w:r>
-        <w:rPr>
-          <w:rFonts w:ascii="Arial" w:eastAsia="Arial" w:hAnsi="Arial" w:cs="Arial"/>
-          <w:color w:val="000000" w:themeColor="text1"/>
-        </w:rPr>
-        <w:t>escentralizada perteneciente al orden Departamental, identificada con NIT 901</w:t>
-      </w:r>
-      <w:r>
-        <w:rPr>
-          <w:rFonts w:ascii="Arial" w:eastAsia="Arial" w:hAnsi="Arial" w:cs="Arial"/>
-          <w:color w:val="000000" w:themeColor="text1"/>
-        </w:rPr>
-        <w:t>.</w:t>
-      </w:r>
-      <w:r>
-        <w:rPr>
-          <w:rFonts w:ascii="Arial" w:eastAsia="Arial" w:hAnsi="Arial" w:cs="Arial"/>
-          <w:color w:val="000000" w:themeColor="text1"/>
-        </w:rPr>
-        <w:t>437</w:t>
-      </w:r>
-      <w:r>
-        <w:rPr>
-          <w:rFonts w:ascii="Arial" w:eastAsia="Arial" w:hAnsi="Arial" w:cs="Arial"/>
-          <w:color w:val="000000" w:themeColor="text1"/>
-        </w:rPr>
-        <w:t>.</w:t>
-      </w:r>
-      <w:r>
-        <w:rPr>
-          <w:rFonts w:ascii="Arial" w:eastAsia="Arial" w:hAnsi="Arial" w:cs="Arial"/>
-          <w:color w:val="000000" w:themeColor="text1"/>
-        </w:rPr>
-        <w:t>957-8, quien</w:t>
-      </w:r>
-      <w:r>
-        <w:rPr>
-          <w:rFonts w:ascii="Arial" w:eastAsia="Arial" w:hAnsi="Arial" w:cs="Arial"/>
-          <w:color w:val="000000" w:themeColor="text1"/>
-        </w:rPr>
-        <w:t xml:space="preserve"> para los efectos de este contrato se denominará</w:t>
-      </w:r>
-      <w:r>
-        <w:rPr>
-          <w:rFonts w:ascii="Arial" w:eastAsia="Arial" w:hAnsi="Arial" w:cs="Arial"/>
-          <w:b/>
-          <w:bCs/>
-          <w:color w:val="000000" w:themeColor="text1"/>
-        </w:rPr>
-        <w:t xml:space="preserve"> EL CONTRATANTE,</w:t>
-      </w:r>
-      <w:r>
-        <w:rPr>
-          <w:rFonts w:ascii="Arial" w:eastAsia="Arial" w:hAnsi="Arial" w:cs="Arial"/>
-          <w:color w:val="000000" w:themeColor="text1"/>
-        </w:rPr>
-        <w:t xml:space="preserve"> </w:t>
-      </w:r>
-      <w:r>
-        <w:rPr>
-          <w:rFonts w:ascii="Arial" w:eastAsia="Arial" w:hAnsi="Arial" w:cs="Arial"/>
-        </w:rPr>
-        <w:t xml:space="preserve">por una parte, </w:t>
-      </w:r>
-      <w:r>
-        <w:rPr>
-          <w:rFonts w:ascii="Arial" w:eastAsia="Arial" w:hAnsi="Arial" w:cs="Arial"/>
-          <w:color w:val="000000" w:themeColor="text1"/>
-        </w:rPr>
-        <w:t>y de la otra,</w:t>
-      </w:r>
-      <w:r>
-        <w:rPr>
-          <w:rFonts w:ascii="Arial" w:eastAsia="Arial" w:hAnsi="Arial" w:cs="Arial"/>
-          <w:color w:val="000000" w:themeColor="text1"/>
-        </w:rPr>
-        <w:t xml:space="preserve"> </w:t>
-      </w:r>
-      <w:r>
-        <w:rPr>
-          <w:rFonts w:ascii="Arial" w:eastAsia="Arial" w:hAnsi="Arial" w:cs="Arial"/>
           <w:b/>
           <w:bCs/>
           <w:color w:val="000000"/>
         </w:rPr>
-        <w:t>{nombre_contratista}</w:t>
-      </w:r>
-      <w:r>
-        <w:rPr>
-          <w:rFonts w:ascii="Arial" w:eastAsia="Arial" w:hAnsi="Arial" w:cs="Arial"/>
-          <w:b/>
-          <w:bCs/>
-          <w:color w:val="000000"/>
-        </w:rPr>
-        <w:t xml:space="preserve"> </w:t>
+        <w:t xml:space="preserve">{nombre_contratista} </w:t>
       </w:r>
       <w:r>
         <w:rPr>
@@ -1078,16 +1038,7 @@
           <w:bCs/>
           <w:color w:val="000000" w:themeColor="text1"/>
         </w:rPr>
-        <w:t>PRIMERA. OBJETO:</w:t>
-      </w:r>
-      <w:r>
-        <w:rPr>
-          <w:rFonts w:ascii="Arial" w:hAnsi="Arial" w:cs="Arial"/>
-          <w:b/>
-          <w:bCs/>
-          <w:color w:val="000000" w:themeColor="text1"/>
-        </w:rPr>
-        <w:t xml:space="preserve"> </w:t>
+        <w:t xml:space="preserve">PRIMERA. OBJETO: </w:t>
       </w:r>
       <w:r>
         <w:rPr>
@@ -1282,29 +1233,7 @@
           <w:szCs w:val="22"/>
           <w:shd w:val="clear" w:color="auto" w:fill="FFFFFF"/>
         </w:rPr>
-        <w:t xml:space="preserve">Desde la suscripción del acta de inicio, hasta el </w:t>
-      </w:r>
-      <w:r>
-        <w:rPr>
-          <w:rStyle w:val="normaltextrun"/>
-          <w:rFonts w:cs="Arial"/>
-          <w:color w:val="000000"/>
-          <w:sz w:val="22"/>
-          <w:szCs w:val="22"/>
-          <w:shd w:val="clear" w:color="auto" w:fill="FFFFFF"/>
-        </w:rPr>
-        <w:t>{fecha_terminacion_texto}</w:t>
-      </w:r>
-      <w:r>
-        <w:rPr>
-          <w:rStyle w:val="normaltextrun"/>
-          <w:rFonts w:cs="Arial"/>
-          <w:color w:val="000000"/>
-          <w:sz w:val="22"/>
-          <w:szCs w:val="22"/>
-          <w:shd w:val="clear" w:color="auto" w:fill="FFFFFF"/>
-        </w:rPr>
-        <w:t>.</w:t>
+        <w:t>Desde la suscripción del acta de inicio, hasta el {fecha_terminacion_texto}.</w:t>
       </w:r>
     </w:p>
     <w:p>
@@ -1545,7 +1474,7 @@
         <w:jc w:val="both"/>
         <w:rPr>
           <w:rFonts w:ascii="Arial" w:eastAsia="Times New Roman" w:hAnsi="Arial" w:cs="Arial"/>
-          <w:color w:val="0D0D0D" w:themeColor="text1" w:themeTint="F2"/>
+          <w:color w:val="000000" w:themeColor="text1"/>
           <w:lang w:val="es-CO" w:eastAsia="es-ES"/>
         </w:rPr>
       </w:pPr>
@@ -1569,26 +1498,26 @@
           <w:lang w:val="es-CO" w:eastAsia="es-ES"/>
         </w:rPr>
       </w:pPr>
-      <w:r>
+    </w:p>
+    <w:p>
+      <w:pPr>
+        <w:suppressAutoHyphens/>
+        <w:ind w:right="-425"/>
+        <w:jc w:val="both"/>
         <w:rPr>
           <w:rFonts w:ascii="Arial" w:eastAsia="Times New Roman" w:hAnsi="Arial" w:cs="Arial"/>
           <w:color w:val="0D0D0D" w:themeColor="text1" w:themeTint="F2"/>
           <w:lang w:val="es-CO" w:eastAsia="es-ES"/>
         </w:rPr>
-        <w:t>Así mismo, para proceder al pago, la EMPRESA DE PARQUES Y EVENTOS DE ANTIOQUIA – ACTIVA, verificará que el contratista se encuentre al día en el pago de sus obligaciones parafiscales y aquellas relacionadas con los sistemas de seguridad social integral.</w:t>
-      </w:r>
-    </w:p>
-    <w:p>
-      <w:pPr>
-        <w:suppressAutoHyphens/>
-        <w:ind w:right="-425"/>
-        <w:jc w:val="both"/>
+      </w:pPr>
+      <w:r>
         <w:rPr>
           <w:rFonts w:ascii="Arial" w:eastAsia="Times New Roman" w:hAnsi="Arial" w:cs="Arial"/>
           <w:color w:val="0D0D0D" w:themeColor="text1" w:themeTint="F2"/>
           <w:lang w:val="es-CO" w:eastAsia="es-ES"/>
         </w:rPr>
-      </w:pPr>
+        <w:t>Así mismo, para proceder al pago, la EMPRESA DE PARQUES Y EVENTOS DE ANTIOQUIA – ACTIVA, verificará que el contratista se encuentre al día en el pago de sus obligaciones parafiscales y aquellas relacionadas con los sistemas de seguridad social integral.</w:t>
+      </w:r>
     </w:p>
     <w:p>
       <w:pPr>
@@ -1601,26 +1530,26 @@
           <w:lang w:val="es-CO" w:eastAsia="es-ES"/>
         </w:rPr>
       </w:pPr>
-      <w:r>
+    </w:p>
+    <w:p>
+      <w:pPr>
+        <w:suppressAutoHyphens/>
+        <w:ind w:right="-425"/>
+        <w:jc w:val="both"/>
         <w:rPr>
           <w:rFonts w:ascii="Arial" w:eastAsia="Times New Roman" w:hAnsi="Arial" w:cs="Arial"/>
           <w:color w:val="0D0D0D" w:themeColor="text1" w:themeTint="F2"/>
           <w:lang w:val="es-CO" w:eastAsia="es-ES"/>
         </w:rPr>
-        <w:t>El contratista deberá aportar las certificaciones y documentación de los dependientes económicos en caso de tenerlos, para ACTIVA realizar los respectivos análisis y depuraciones fiscales en los abonos en cuenta o pagos derivados de este contrato.</w:t>
-      </w:r>
-    </w:p>
-    <w:p>
-      <w:pPr>
-        <w:suppressAutoHyphens/>
-        <w:ind w:right="-425"/>
-        <w:jc w:val="both"/>
+      </w:pPr>
+      <w:r>
         <w:rPr>
           <w:rFonts w:ascii="Arial" w:eastAsia="Times New Roman" w:hAnsi="Arial" w:cs="Arial"/>
           <w:color w:val="0D0D0D" w:themeColor="text1" w:themeTint="F2"/>
           <w:lang w:val="es-CO" w:eastAsia="es-ES"/>
         </w:rPr>
-      </w:pPr>
+        <w:t>El contratista deberá aportar las certificaciones y documentación de los dependientes económicos en caso de tenerlos, para ACTIVA realizar los respectivos análisis y depuraciones fiscales en los abonos en cuenta o pagos derivados de este contrato.</w:t>
+      </w:r>
     </w:p>
     <w:p>
       <w:pPr>
@@ -1633,26 +1562,26 @@
           <w:lang w:val="es-CO" w:eastAsia="es-ES"/>
         </w:rPr>
       </w:pPr>
-      <w:r>
+    </w:p>
+    <w:p>
+      <w:pPr>
+        <w:suppressAutoHyphens/>
+        <w:ind w:right="-425"/>
+        <w:jc w:val="both"/>
         <w:rPr>
           <w:rFonts w:ascii="Arial" w:eastAsia="Times New Roman" w:hAnsi="Arial" w:cs="Arial"/>
           <w:color w:val="0D0D0D" w:themeColor="text1" w:themeTint="F2"/>
           <w:lang w:val="es-CO" w:eastAsia="es-ES"/>
         </w:rPr>
-        <w:t>El recurso no ejecutado será liberado por parte de ACTIVA una vez terminado el contrato.</w:t>
-      </w:r>
-    </w:p>
-    <w:p>
-      <w:pPr>
-        <w:suppressAutoHyphens/>
-        <w:ind w:right="-425"/>
-        <w:jc w:val="both"/>
+      </w:pPr>
+      <w:r>
         <w:rPr>
           <w:rFonts w:ascii="Arial" w:eastAsia="Times New Roman" w:hAnsi="Arial" w:cs="Arial"/>
           <w:color w:val="0D0D0D" w:themeColor="text1" w:themeTint="F2"/>
           <w:lang w:val="es-CO" w:eastAsia="es-ES"/>
         </w:rPr>
-      </w:pPr>
+        <w:t>El recurso no ejecutado será liberado por parte de ACTIVA una vez terminado el contrato.</w:t>
+      </w:r>
     </w:p>
     <w:p>
       <w:pPr>
@@ -1665,36 +1594,36 @@
           <w:lang w:val="es-CO" w:eastAsia="es-ES"/>
         </w:rPr>
       </w:pPr>
-      <w:r>
-        <w:rPr>
-          <w:rFonts w:ascii="Arial" w:eastAsia="Times New Roman" w:hAnsi="Arial" w:cs="Arial"/>
-          <w:b/>
-          <w:bCs/>
-          <w:color w:val="0D0D0D" w:themeColor="text1" w:themeTint="F2"/>
-          <w:lang w:val="es-CO" w:eastAsia="es-ES"/>
-        </w:rPr>
-        <w:t xml:space="preserve">Nota: </w:t>
-      </w:r>
-      <w:r>
+    </w:p>
+    <w:p>
+      <w:pPr>
+        <w:suppressAutoHyphens/>
+        <w:ind w:right="-425"/>
+        <w:jc w:val="both"/>
         <w:rPr>
           <w:rFonts w:ascii="Arial" w:eastAsia="Times New Roman" w:hAnsi="Arial" w:cs="Arial"/>
           <w:color w:val="0D0D0D" w:themeColor="text1" w:themeTint="F2"/>
           <w:lang w:val="es-CO" w:eastAsia="es-ES"/>
         </w:rPr>
-        <w:t>los impuestos, estampillas y retenciones que apliquen estarán a cargo del contratista.</w:t>
-      </w:r>
-    </w:p>
-    <w:p>
-      <w:pPr>
-        <w:suppressAutoHyphens/>
-        <w:ind w:right="-425"/>
-        <w:jc w:val="both"/>
+      </w:pPr>
+      <w:r>
+        <w:rPr>
+          <w:rFonts w:ascii="Arial" w:eastAsia="Times New Roman" w:hAnsi="Arial" w:cs="Arial"/>
+          <w:b/>
+          <w:bCs/>
+          <w:color w:val="0D0D0D" w:themeColor="text1" w:themeTint="F2"/>
+          <w:lang w:val="es-CO" w:eastAsia="es-ES"/>
+        </w:rPr>
+        <w:t xml:space="preserve">Nota: </w:t>
+      </w:r>
+      <w:r>
         <w:rPr>
           <w:rFonts w:ascii="Arial" w:eastAsia="Times New Roman" w:hAnsi="Arial" w:cs="Arial"/>
           <w:color w:val="0D0D0D" w:themeColor="text1" w:themeTint="F2"/>
           <w:lang w:val="es-CO" w:eastAsia="es-ES"/>
         </w:rPr>
-      </w:pPr>
+        <w:t>los impuestos, estampillas y retenciones que apliquen estarán a cargo del contratista.</w:t>
+      </w:r>
     </w:p>
     <w:p>
       <w:pPr>
@@ -1702,6 +1631,18 @@
         <w:ind w:right="-425"/>
         <w:jc w:val="both"/>
         <w:rPr>
+          <w:rFonts w:ascii="Arial" w:eastAsia="Times New Roman" w:hAnsi="Arial" w:cs="Arial"/>
+          <w:color w:val="0D0D0D" w:themeColor="text1" w:themeTint="F2"/>
+          <w:lang w:val="es-CO" w:eastAsia="es-ES"/>
+        </w:rPr>
+      </w:pPr>
+    </w:p>
+    <w:p>
+      <w:pPr>
+        <w:suppressAutoHyphens/>
+        <w:ind w:right="-425"/>
+        <w:jc w:val="both"/>
+        <w:rPr>
           <w:rFonts w:ascii="Arial" w:hAnsi="Arial" w:cs="Arial"/>
           <w:color w:val="000000" w:themeColor="text1"/>
         </w:rPr>
@@ -1743,14 +1684,7 @@
           <w:rFonts w:ascii="Arial" w:hAnsi="Arial" w:cs="Arial"/>
           <w:color w:val="000000" w:themeColor="text1"/>
         </w:rPr>
-        <w:t xml:space="preserve">l </w:t>
-      </w:r>
-      <w:r>
-        <w:rPr>
-          <w:rFonts w:ascii="Arial" w:hAnsi="Arial" w:cs="Arial"/>
-          <w:color w:val="000000" w:themeColor="text1"/>
-        </w:rPr>
-        <w:t>{presupuesto_texto}</w:t>
+        <w:t>l {presupuesto_texto}</w:t>
       </w:r>
     </w:p>
     <w:p>
@@ -2951,14 +2885,7 @@
           <w:rFonts w:ascii="Arial" w:eastAsia="Arial" w:hAnsi="Arial" w:cs="Arial"/>
           <w:bdr w:val="none" w:sz="0" w:space="0" w:color="auto" w:frame="1"/>
         </w:rPr>
-        <w:t xml:space="preserve"> </w:t>
-      </w:r>
-      <w:r>
-        <w:rPr>
-          <w:rFonts w:ascii="Arial" w:eastAsia="Arial" w:hAnsi="Arial" w:cs="Arial"/>
-          <w:bdr w:val="none" w:sz="0" w:space="0" w:color="auto" w:frame="1"/>
-        </w:rPr>
-        <w:t>{supervisor_nombre}</w:t>
+        <w:t xml:space="preserve"> {supervisor_nombre}</w:t>
       </w:r>
       <w:r>
         <w:rPr>
@@ -3528,10 +3455,13 @@
         <w:spacing w:line="300" w:lineRule="auto"/>
         <w:ind w:right="-283"/>
         <w:jc w:val="both"/>
-      </w:pPr>
-      <w:r>
-        <w:rPr>
-          <w:rFonts w:ascii="Segoe UI" w:eastAsia="Segoe UI" w:hAnsi="Segoe UI" w:cs="Segoe UI"/>
+        <w:rPr>
+          <w:rFonts w:ascii="Arial" w:hAnsi="Arial" w:cs="Arial"/>
+        </w:rPr>
+      </w:pPr>
+      <w:r>
+        <w:rPr>
+          <w:rFonts w:ascii="Arial" w:eastAsia="Segoe UI" w:hAnsi="Arial" w:cs="Arial"/>
           <w:sz w:val="21"/>
           <w:szCs w:val="21"/>
           <w:lang w:val="es-MX"/>
@@ -3540,7 +3470,7 @@
       </w:r>
       <w:r>
         <w:rPr>
-          <w:rFonts w:eastAsiaTheme="minorEastAsia"/>
+          <w:rFonts w:ascii="Arial" w:eastAsiaTheme="minorEastAsia" w:hAnsi="Arial" w:cs="Arial"/>
           <w:color w:val="000000" w:themeColor="text1"/>
           <w:lang w:val="es-MX"/>
         </w:rPr>
@@ -3548,7 +3478,7 @@
       </w:r>
       <w:r>
         <w:rPr>
-          <w:rFonts w:eastAsiaTheme="minorEastAsia"/>
+          <w:rFonts w:ascii="Arial" w:eastAsiaTheme="minorEastAsia" w:hAnsi="Arial" w:cs="Arial"/>
           <w:color w:val="000000" w:themeColor="text1"/>
           <w:lang w:val="es-MX"/>
         </w:rPr>
@@ -3556,7 +3486,7 @@
       </w:r>
       <w:r>
         <w:rPr>
-          <w:rFonts w:eastAsiaTheme="minorEastAsia"/>
+          <w:rFonts w:ascii="Arial" w:eastAsiaTheme="minorEastAsia" w:hAnsi="Arial" w:cs="Arial"/>
           <w:color w:val="000000" w:themeColor="text1"/>
           <w:lang w:val="es-MX"/>
         </w:rPr>
@@ -3669,7 +3599,7 @@
       </w:r>
       <w:r>
         <w:rPr>
-          <w:rFonts w:ascii="Segoe UI" w:eastAsia="Segoe UI" w:hAnsi="Segoe UI" w:cs="Segoe UI"/>
+          <w:rFonts w:ascii="Arial" w:eastAsia="Segoe UI" w:hAnsi="Arial" w:cs="Arial"/>
           <w:b/>
           <w:bCs/>
           <w:sz w:val="21"/>
@@ -3679,50 +3609,50 @@
       </w:r>
       <w:r>
         <w:rPr>
-          <w:rFonts w:eastAsiaTheme="minorEastAsia"/>
+          <w:rFonts w:ascii="Arial" w:eastAsiaTheme="minorEastAsia" w:hAnsi="Arial" w:cs="Arial"/>
           <w:color w:val="000000" w:themeColor="text1"/>
         </w:rPr>
         <w:t>En el presente contrato, cuy</w:t>
       </w:r>
       <w:r>
         <w:rPr>
-          <w:rFonts w:eastAsiaTheme="minorEastAsia"/>
+          <w:rFonts w:ascii="Arial" w:eastAsiaTheme="minorEastAsia" w:hAnsi="Arial" w:cs="Arial"/>
           <w:color w:val="000000" w:themeColor="text1"/>
         </w:rPr>
         <w:t>a</w:t>
       </w:r>
       <w:r>
         <w:rPr>
-          <w:rFonts w:eastAsiaTheme="minorEastAsia"/>
+          <w:rFonts w:ascii="Arial" w:eastAsiaTheme="minorEastAsia" w:hAnsi="Arial" w:cs="Arial"/>
           <w:color w:val="000000" w:themeColor="text1"/>
         </w:rPr>
         <w:t xml:space="preserve"> </w:t>
       </w:r>
       <w:r>
         <w:rPr>
-          <w:rFonts w:eastAsiaTheme="minorEastAsia"/>
+          <w:rFonts w:ascii="Arial" w:eastAsiaTheme="minorEastAsia" w:hAnsi="Arial" w:cs="Arial"/>
           <w:color w:val="000000" w:themeColor="text1"/>
         </w:rPr>
         <w:t>cuantía</w:t>
       </w:r>
       <w:r>
         <w:rPr>
-          <w:rFonts w:eastAsiaTheme="minorEastAsia"/>
-          <w:color w:val="000000" w:themeColor="text1"/>
-        </w:rPr>
-        <w:t xml:space="preserve"> es inferior a veinte (20) salarios mínimos legales mensuales vigentes (SMMLV), no se exigirá la constitución de garantías, atendiendo la naturaleza del objeto, la modalidad de contratación y la justificación contenida en los estudios previos, </w:t>
-      </w:r>
-      <w:r>
-        <w:rPr>
-          <w:rFonts w:eastAsiaTheme="minorEastAsia"/>
+          <w:rFonts w:ascii="Arial" w:eastAsiaTheme="minorEastAsia" w:hAnsi="Arial" w:cs="Arial"/>
+          <w:color w:val="000000" w:themeColor="text1"/>
+        </w:rPr>
+        <w:t xml:space="preserve"> es inferior a veinte (20) salarios mínimos legales mensuales vigentes (SMMLV), no se exigirá la constitución de garantías, atendiendo la naturaleza del objeto, la modalidad de contratación y la justificación </w:t>
+      </w:r>
+      <w:r>
+        <w:rPr>
+          <w:rFonts w:ascii="Arial" w:eastAsiaTheme="minorEastAsia" w:hAnsi="Arial" w:cs="Arial"/>
           <w:color w:val="000000" w:themeColor="text1"/>
         </w:rPr>
         <w:lastRenderedPageBreak/>
-        <w:t>conforme a la normativa vigente y al Manual de Contratación de la EMPRESA DE PARQUES Y EVENTOS DE ANTIOQUIA – ACTIVA. No obstante, la entidad podrá exigir garantías cuando lo considere necesario para proteger los intereses públicos, dejando constancia de la motivación en los documentos del proceso</w:t>
-      </w:r>
-      <w:r>
-        <w:rPr>
-          <w:rFonts w:ascii="Segoe UI" w:eastAsia="Segoe UI" w:hAnsi="Segoe UI" w:cs="Segoe UI"/>
+        <w:t>contenida en los estudios previos, conforme a la normativa vigente y al Manual de Contratación de la EMPRESA DE PARQUES Y EVENTOS DE ANTIOQUIA – ACTIVA. No obstante, la entidad podrá exigir garantías cuando lo considere necesario para proteger los intereses públicos, dejando constancia de la motivación en los documentos del proceso</w:t>
+      </w:r>
+      <w:r>
+        <w:rPr>
+          <w:rFonts w:ascii="Arial" w:eastAsia="Segoe UI" w:hAnsi="Arial" w:cs="Arial"/>
           <w:sz w:val="21"/>
           <w:szCs w:val="21"/>
         </w:rPr>
@@ -3997,25 +3927,7 @@
           <w:color w:val="000000" w:themeColor="text1"/>
           <w:spacing w:val="-3"/>
         </w:rPr>
-        <w:t xml:space="preserve"> </w:t>
-      </w:r>
-      <w:proofErr w:type="gramStart"/>
-      <w:r>
-        <w:rPr>
-          <w:rFonts w:ascii="Arial" w:hAnsi="Arial" w:cs="Arial"/>
-          <w:color w:val="000000" w:themeColor="text1"/>
-          <w:spacing w:val="-3"/>
-        </w:rPr>
-        <w:t>Director</w:t>
-      </w:r>
-      <w:proofErr w:type="gramEnd"/>
-      <w:r>
-        <w:rPr>
-          <w:rFonts w:ascii="Arial" w:hAnsi="Arial" w:cs="Arial"/>
-          <w:color w:val="000000" w:themeColor="text1"/>
-          <w:spacing w:val="-3"/>
-        </w:rPr>
-        <w:t xml:space="preserve"> Jurídic</w:t>
+        <w:t xml:space="preserve"> Director Jurídic</w:t>
       </w:r>
       <w:r>
         <w:rPr>
@@ -4325,7 +4237,29 @@
           <w:color w:val="000000" w:themeColor="text1"/>
           <w:lang w:val="es-CO"/>
         </w:rPr>
-        <w:t>El acta de liquidación deberá ser suscrita por las partes del contrato y por el supervisor quien será el responsable de la suscripción de la misma. El término de la liquidación será de conformidad a lo estipulado en el artículo 11 de la ley 1150 de 2007.</w:t>
+        <w:t xml:space="preserve">El acta de liquidación deberá ser suscrita por las partes del contrato y por el supervisor quien será el responsable de la suscripción de </w:t>
+      </w:r>
+      <w:proofErr w:type="gramStart"/>
+      <w:r>
+        <w:rPr>
+          <w:rFonts w:ascii="Arial" w:hAnsi="Arial" w:cs="Arial"/>
+          <w:i/>
+          <w:iCs/>
+          <w:color w:val="000000" w:themeColor="text1"/>
+          <w:lang w:val="es-CO"/>
+        </w:rPr>
+        <w:t>la misma</w:t>
+      </w:r>
+      <w:proofErr w:type="gramEnd"/>
+      <w:r>
+        <w:rPr>
+          <w:rFonts w:ascii="Arial" w:hAnsi="Arial" w:cs="Arial"/>
+          <w:i/>
+          <w:iCs/>
+          <w:color w:val="000000" w:themeColor="text1"/>
+          <w:lang w:val="es-CO"/>
+        </w:rPr>
+        <w:t>. El término de la liquidación será de conformidad a lo estipulado en el artículo 11 de la ley 1150 de 2007.</w:t>
       </w:r>
     </w:p>
     <w:p>
@@ -5181,6 +5115,72 @@
     </w:p>
     <w:p>
       <w:pPr>
+        <w:ind w:right="-425"/>
+        <w:jc w:val="both"/>
+        <w:rPr>
+          <w:rFonts w:ascii="Arial" w:eastAsia="Calibri" w:hAnsi="Arial" w:cs="Arial"/>
+          <w:lang w:val="pt-BR"/>
+        </w:rPr>
+      </w:pPr>
+    </w:p>
+    <w:p>
+      <w:pPr>
+        <w:ind w:right="-425"/>
+        <w:jc w:val="both"/>
+        <w:rPr>
+          <w:rFonts w:ascii="Arial" w:eastAsia="Calibri" w:hAnsi="Arial" w:cs="Arial"/>
+          <w:b/>
+          <w:bCs/>
+          <w:lang w:val="pt-BR"/>
+        </w:rPr>
+      </w:pPr>
+      <w:r>
+        <w:rPr>
+          <w:rFonts w:ascii="Arial" w:eastAsia="Calibri" w:hAnsi="Arial" w:cs="Arial"/>
+          <w:b/>
+          <w:bCs/>
+          <w:lang w:val="pt-BR"/>
+        </w:rPr>
+        <w:t>{</w:t>
+      </w:r>
+      <w:proofErr w:type="spellStart"/>
+      <w:r>
+        <w:rPr>
+          <w:rFonts w:ascii="Arial" w:eastAsia="Calibri" w:hAnsi="Arial" w:cs="Arial"/>
+          <w:b/>
+          <w:bCs/>
+          <w:lang w:val="pt-BR"/>
+        </w:rPr>
+        <w:t>nombre_contratista</w:t>
+      </w:r>
+      <w:proofErr w:type="spellEnd"/>
+      <w:r>
+        <w:rPr>
+          <w:rFonts w:ascii="Arial" w:eastAsia="Calibri" w:hAnsi="Arial" w:cs="Arial"/>
+          <w:b/>
+          <w:bCs/>
+          <w:lang w:val="pt-BR"/>
+        </w:rPr>
+        <w:t>}</w:t>
+      </w:r>
+    </w:p>
+    <w:p>
+      <w:pPr>
+        <w:ind w:right="-425"/>
+        <w:jc w:val="both"/>
+        <w:rPr>
+          <w:rFonts w:ascii="Arial" w:eastAsia="Calibri" w:hAnsi="Arial" w:cs="Arial"/>
+        </w:rPr>
+      </w:pPr>
+      <w:r>
+        <w:rPr>
+          <w:rFonts w:ascii="Arial" w:eastAsia="Calibri" w:hAnsi="Arial" w:cs="Arial"/>
+        </w:rPr>
+        <w:t xml:space="preserve">CONTRATISTA </w:t>
+      </w:r>
+    </w:p>
+    <w:p>
+      <w:pPr>
         <w:tabs>
           <w:tab w:val="left" w:pos="2277"/>
         </w:tabs>
@@ -5207,6 +5207,32 @@
     </w:p>
     <w:p>
       <w:pPr>
+        <w:tabs>
+          <w:tab w:val="left" w:pos="2277"/>
+        </w:tabs>
+        <w:ind w:right="-425"/>
+        <w:jc w:val="both"/>
+        <w:rPr>
+          <w:rFonts w:ascii="Arial" w:hAnsi="Arial" w:cs="Arial"/>
+          <w:color w:val="000000" w:themeColor="text1"/>
+        </w:rPr>
+      </w:pPr>
+    </w:p>
+    <w:p>
+      <w:pPr>
+        <w:tabs>
+          <w:tab w:val="left" w:pos="2277"/>
+        </w:tabs>
+        <w:ind w:right="-425"/>
+        <w:jc w:val="both"/>
+        <w:rPr>
+          <w:rFonts w:ascii="Arial" w:hAnsi="Arial" w:cs="Arial"/>
+          <w:color w:val="000000" w:themeColor="text1"/>
+        </w:rPr>
+      </w:pPr>
+    </w:p>
+    <w:p>
+      <w:pPr>
         <w:ind w:right="-425"/>
         <w:jc w:val="both"/>
         <w:rPr>
@@ -5316,52 +5342,6 @@
           <w:lang w:val="pt-BR"/>
         </w:rPr>
       </w:pPr>
-    </w:p>
-    <w:p>
-      <w:pPr>
-        <w:ind w:right="-425"/>
-        <w:jc w:val="both"/>
-        <w:rPr>
-          <w:rFonts w:ascii="Arial" w:eastAsia="Calibri" w:hAnsi="Arial" w:cs="Arial"/>
-          <w:lang w:val="pt-BR"/>
-        </w:rPr>
-      </w:pPr>
-    </w:p>
-    <w:p>
-      <w:pPr>
-        <w:ind w:right="-425"/>
-        <w:jc w:val="both"/>
-        <w:rPr>
-          <w:rFonts w:ascii="Arial" w:eastAsia="Calibri" w:hAnsi="Arial" w:cs="Arial"/>
-          <w:b/>
-          <w:bCs/>
-          <w:lang w:val="pt-BR"/>
-        </w:rPr>
-      </w:pPr>
-      <w:r>
-        <w:rPr>
-          <w:rFonts w:ascii="Arial" w:eastAsia="Calibri" w:hAnsi="Arial" w:cs="Arial"/>
-          <w:b/>
-          <w:bCs/>
-          <w:lang w:val="pt-BR"/>
-        </w:rPr>
-        <w:t>{nombre_contratista}</w:t>
-      </w:r>
-    </w:p>
-    <w:p>
-      <w:pPr>
-        <w:ind w:right="-425"/>
-        <w:jc w:val="both"/>
-        <w:rPr>
-          <w:rFonts w:ascii="Arial" w:eastAsia="Calibri" w:hAnsi="Arial" w:cs="Arial"/>
-        </w:rPr>
-      </w:pPr>
-      <w:r>
-        <w:rPr>
-          <w:rFonts w:ascii="Arial" w:eastAsia="Calibri" w:hAnsi="Arial" w:cs="Arial"/>
-        </w:rPr>
-        <w:t xml:space="preserve">CONTRATISTA </w:t>
-      </w:r>
     </w:p>
     <w:p>
       <w:pPr>
@@ -5541,7 +5521,7 @@
                 <w:sz w:val="16"/>
                 <w:szCs w:val="16"/>
               </w:rPr>
-              <w:t xml:space="preserve">{proyecto}</w:t>
+              <w:t>{proyecto}</w:t>
             </w:r>
           </w:p>
         </w:tc>
@@ -5608,15 +5588,7 @@
                 <w:sz w:val="16"/>
                 <w:szCs w:val="16"/>
               </w:rPr>
-              <w:t>Revis</w:t>
-            </w:r>
-            <w:r>
-              <w:rPr>
-                <w:rFonts w:ascii="Arial" w:eastAsia="Calibri" w:hAnsi="Arial" w:cs="Arial"/>
-                <w:sz w:val="16"/>
-                <w:szCs w:val="16"/>
-              </w:rPr>
-              <w:t>ión jurídica</w:t>
+              <w:t>Revisión jurídica</w:t>
             </w:r>
           </w:p>
         </w:tc>
@@ -5646,7 +5618,7 @@
                 <w:sz w:val="16"/>
                 <w:szCs w:val="16"/>
               </w:rPr>
-              <w:t xml:space="preserve">{revision_juridica}</w:t>
+              <w:t>{revision_juridica}</w:t>
             </w:r>
           </w:p>
         </w:tc>
@@ -5713,15 +5685,7 @@
                 <w:sz w:val="16"/>
                 <w:szCs w:val="16"/>
               </w:rPr>
-              <w:t>Revis</w:t>
-            </w:r>
-            <w:r>
-              <w:rPr>
-                <w:rFonts w:ascii="Arial" w:eastAsia="Calibri" w:hAnsi="Arial" w:cs="Arial"/>
-                <w:sz w:val="16"/>
-                <w:szCs w:val="16"/>
-              </w:rPr>
-              <w:t>ión financiera</w:t>
+              <w:t>Revisión financiera</w:t>
             </w:r>
           </w:p>
         </w:tc>
@@ -5751,7 +5715,7 @@
                 <w:sz w:val="16"/>
                 <w:szCs w:val="16"/>
               </w:rPr>
-              <w:t xml:space="preserve">{revision_financiera}</w:t>
+              <w:t>{revision_financiera}</w:t>
             </w:r>
           </w:p>
         </w:tc>
@@ -5848,7 +5812,7 @@
                 <w:sz w:val="16"/>
                 <w:szCs w:val="16"/>
               </w:rPr>
-              <w:t xml:space="preserve">{aprobo}</w:t>
+              <w:t>{aprobo}</w:t>
             </w:r>
           </w:p>
         </w:tc>
@@ -7735,6 +7699,7 @@
   <w:style w:type="character" w:default="1" w:styleId="Fuentedeprrafopredeter">
     <w:name w:val="Default Paragraph Font"/>
     <w:uiPriority w:val="1"/>
+    <w:semiHidden/>
     <w:unhideWhenUsed/>
   </w:style>
   <w:style w:type="table" w:default="1" w:styleId="Tablanormal">
@@ -9871,6 +9836,26 @@
 </file>
 
 <file path=customXml/item1.xml><?xml version="1.0" encoding="utf-8"?>
+<p:properties xmlns:p="http://schemas.microsoft.com/office/2006/metadata/properties" xmlns:xsi="http://www.w3.org/2001/XMLSchema-instance" xmlns:pc="http://schemas.microsoft.com/office/infopath/2007/PartnerControls">
+  <documentManagement>
+    <TaxCatchAll xmlns="e817aef0-ee18-43df-8fb6-a8e286a8ac2b" xsi:nil="true"/>
+    <lcf76f155ced4ddcb4097134ff3c332f xmlns="0492cccb-6647-486e-854d-ea79f74918b5">
+      <Terms xmlns="http://schemas.microsoft.com/office/infopath/2007/PartnerControls"/>
+    </lcf76f155ced4ddcb4097134ff3c332f>
+  </documentManagement>
+</p:properties>
+</file>
+
+<file path=customXml/item2.xml><?xml version="1.0" encoding="utf-8"?>
+<?mso-contentType ?>
+<FormTemplates xmlns="http://schemas.microsoft.com/sharepoint/v3/contenttype/forms">
+  <Display>DocumentLibraryForm</Display>
+  <Edit>DocumentLibraryForm</Edit>
+  <New>DocumentLibraryForm</New>
+</FormTemplates>
+</file>
+
+<file path=customXml/item3.xml><?xml version="1.0" encoding="utf-8"?>
 <ct:contentTypeSchema xmlns:ct="http://schemas.microsoft.com/office/2006/metadata/contentType" xmlns:ma="http://schemas.microsoft.com/office/2006/metadata/properties/metaAttributes" ct:_="" ma:_="" ma:contentTypeName="Documento" ma:contentTypeID="0x01010009D7B0C64E77F64B88D164F77CD540CE" ma:contentTypeVersion="20" ma:contentTypeDescription="Crear nuevo documento." ma:contentTypeScope="" ma:versionID="d8051832bc294fed6848679ea26f6dc1">
   <xsd:schema xmlns:xsd="http://www.w3.org/2001/XMLSchema" xmlns:xs="http://www.w3.org/2001/XMLSchema" xmlns:p="http://schemas.microsoft.com/office/2006/metadata/properties" xmlns:ns2="e817aef0-ee18-43df-8fb6-a8e286a8ac2b" xmlns:ns3="0492cccb-6647-486e-854d-ea79f74918b5" targetNamespace="http://schemas.microsoft.com/office/2006/metadata/properties" ma:root="true" ma:fieldsID="75340f7370c80217d15047bf2bf01844" ns2:_="" ns3:_="">
     <xsd:import namespace="e817aef0-ee18-43df-8fb6-a8e286a8ac2b"/>
@@ -10131,27 +10116,26 @@
 </ct:contentTypeSchema>
 </file>
 
-<file path=customXml/item2.xml><?xml version="1.0" encoding="utf-8"?>
-<p:properties xmlns:p="http://schemas.microsoft.com/office/2006/metadata/properties" xmlns:xsi="http://www.w3.org/2001/XMLSchema-instance" xmlns:pc="http://schemas.microsoft.com/office/infopath/2007/PartnerControls">
-  <documentManagement>
-    <TaxCatchAll xmlns="e817aef0-ee18-43df-8fb6-a8e286a8ac2b" xsi:nil="true"/>
-    <lcf76f155ced4ddcb4097134ff3c332f xmlns="0492cccb-6647-486e-854d-ea79f74918b5">
-      <Terms xmlns="http://schemas.microsoft.com/office/infopath/2007/PartnerControls"/>
-    </lcf76f155ced4ddcb4097134ff3c332f>
-  </documentManagement>
-</p:properties>
+<file path=customXml/itemProps1.xml><?xml version="1.0" encoding="utf-8"?>
+<ds:datastoreItem xmlns:ds="http://schemas.openxmlformats.org/officeDocument/2006/customXml" ds:itemID="{450D9E2E-3E33-4BC6-ADC7-18A7ACCB1B1D}">
+  <ds:schemaRefs>
+    <ds:schemaRef ds:uri="http://schemas.microsoft.com/office/2006/metadata/properties"/>
+    <ds:schemaRef ds:uri="http://schemas.microsoft.com/office/infopath/2007/PartnerControls"/>
+    <ds:schemaRef ds:uri="e817aef0-ee18-43df-8fb6-a8e286a8ac2b"/>
+    <ds:schemaRef ds:uri="0492cccb-6647-486e-854d-ea79f74918b5"/>
+  </ds:schemaRefs>
+</ds:datastoreItem>
 </file>
 
-<file path=customXml/item3.xml><?xml version="1.0" encoding="utf-8"?>
-<?mso-contentType ?>
-<FormTemplates xmlns="http://schemas.microsoft.com/sharepoint/v3/contenttype/forms">
-  <Display>DocumentLibraryForm</Display>
-  <Edit>DocumentLibraryForm</Edit>
-  <New>DocumentLibraryForm</New>
-</FormTemplates>
+<file path=customXml/itemProps2.xml><?xml version="1.0" encoding="utf-8"?>
+<ds:datastoreItem xmlns:ds="http://schemas.openxmlformats.org/officeDocument/2006/customXml" ds:itemID="{14603871-D6DD-49BB-A886-8F65CE0FA38A}">
+  <ds:schemaRefs>
+    <ds:schemaRef ds:uri="http://schemas.microsoft.com/sharepoint/v3/contenttype/forms"/>
+  </ds:schemaRefs>
+</ds:datastoreItem>
 </file>
 
-<file path=customXml/itemProps1.xml><?xml version="1.0" encoding="utf-8"?>
+<file path=customXml/itemProps3.xml><?xml version="1.0" encoding="utf-8"?>
 <ds:datastoreItem xmlns:ds="http://schemas.openxmlformats.org/officeDocument/2006/customXml" ds:itemID="{F4E5EB90-5BAF-4863-892F-E288E4160F4D}">
   <ds:schemaRefs>
     <ds:schemaRef ds:uri="http://schemas.microsoft.com/office/2006/metadata/contentType"/>
@@ -10168,23 +10152,4 @@
     <ds:schemaRef ds:uri="http://schemas.microsoft.com/internal/obd"/>
   </ds:schemaRefs>
 </ds:datastoreItem>
-</file>
-
-<file path=customXml/itemProps2.xml><?xml version="1.0" encoding="utf-8"?>
-<ds:datastoreItem xmlns:ds="http://schemas.openxmlformats.org/officeDocument/2006/customXml" ds:itemID="{450D9E2E-3E33-4BC6-ADC7-18A7ACCB1B1D}">
-  <ds:schemaRefs>
-    <ds:schemaRef ds:uri="http://schemas.microsoft.com/office/2006/metadata/properties"/>
-    <ds:schemaRef ds:uri="http://schemas.microsoft.com/office/infopath/2007/PartnerControls"/>
-    <ds:schemaRef ds:uri="e817aef0-ee18-43df-8fb6-a8e286a8ac2b"/>
-    <ds:schemaRef ds:uri="0492cccb-6647-486e-854d-ea79f74918b5"/>
-  </ds:schemaRefs>
-</ds:datastoreItem>
-</file>
-
-<file path=customXml/itemProps3.xml><?xml version="1.0" encoding="utf-8"?>
-<ds:datastoreItem xmlns:ds="http://schemas.openxmlformats.org/officeDocument/2006/customXml" ds:itemID="{14603871-D6DD-49BB-A886-8F65CE0FA38A}">
-  <ds:schemaRefs>
-    <ds:schemaRef ds:uri="http://schemas.microsoft.com/sharepoint/v3/contenttype/forms"/>
-  </ds:schemaRefs>
-</ds:datastoreItem>
 </file>
</xml_diff>

<commit_message>
Reemplazar plantilla_contrato.docx por la nueva versión (#10)
La plantilla nueva conserva los mismos 19 marcadores, por lo que es
compatible con el formulario y datosPlantilla actuales. Verificado con
render real (docxtemplater): los 19 marcadores se rellenan y ninguno
queda sin resolver.


Claude-Session: https://claude.ai/code/session_01RbqmWfif1ErCa4oEtLm5Ho

Co-authored-by: Claude <noreply@anthropic.com>
</commit_message>
<xml_diff>
--- a/plantilla_contrato.docx
+++ b/plantilla_contrato.docx
@@ -576,15 +576,17 @@
           <w:color w:val="000000" w:themeColor="text1"/>
           <w:spacing w:val="-3"/>
         </w:rPr>
-        <w:t xml:space="preserve">Entre los suscritos a </w:t>
+        <w:t xml:space="preserve">Entre los suscritos a saber: </w:t>
       </w:r>
       <w:r>
         <w:rPr>
           <w:rFonts w:ascii="Arial" w:eastAsia="Arial" w:hAnsi="Arial" w:cs="Arial"/>
-          <w:color w:val="000000" w:themeColor="text1"/>
-          <w:spacing w:val="-3"/>
-        </w:rPr>
-        <w:t xml:space="preserve">saber: </w:t>
+          <w:b/>
+          <w:bCs/>
+          <w:color w:val="000000" w:themeColor="text1"/>
+          <w:spacing w:val="-3"/>
+        </w:rPr>
+        <w:t xml:space="preserve">SANTIAGO </w:t>
       </w:r>
       <w:r>
         <w:rPr>
@@ -594,7 +596,7 @@
           <w:color w:val="000000" w:themeColor="text1"/>
           <w:spacing w:val="-3"/>
         </w:rPr>
-        <w:t xml:space="preserve">SANTIAGO </w:t>
+        <w:t>AT</w:t>
       </w:r>
       <w:r>
         <w:rPr>
@@ -604,7 +606,7 @@
           <w:color w:val="000000" w:themeColor="text1"/>
           <w:spacing w:val="-3"/>
         </w:rPr>
-        <w:t>AT</w:t>
+        <w:t>EH</w:t>
       </w:r>
       <w:r>
         <w:rPr>
@@ -614,7 +616,7 @@
           <w:color w:val="000000" w:themeColor="text1"/>
           <w:spacing w:val="-3"/>
         </w:rPr>
-        <w:t>EH</w:t>
+        <w:t>O</w:t>
       </w:r>
       <w:r>
         <w:rPr>
@@ -624,17 +626,15 @@
           <w:color w:val="000000" w:themeColor="text1"/>
           <w:spacing w:val="-3"/>
         </w:rPr>
-        <w:t>O</w:t>
+        <w:t>RTÚA SIERRA</w:t>
       </w:r>
       <w:r>
         <w:rPr>
           <w:rFonts w:ascii="Arial" w:eastAsia="Arial" w:hAnsi="Arial" w:cs="Arial"/>
-          <w:b/>
-          <w:bCs/>
-          <w:color w:val="000000" w:themeColor="text1"/>
-          <w:spacing w:val="-3"/>
-        </w:rPr>
-        <w:t>RTÚA SIERRA</w:t>
+          <w:color w:val="000000" w:themeColor="text1"/>
+          <w:spacing w:val="-3"/>
+        </w:rPr>
+        <w:t xml:space="preserve">, mayor de edad, portador de la cédula de ciudadanía N° </w:t>
       </w:r>
       <w:r>
         <w:rPr>
@@ -642,7 +642,7 @@
           <w:color w:val="000000" w:themeColor="text1"/>
           <w:spacing w:val="-3"/>
         </w:rPr>
-        <w:t xml:space="preserve">, mayor de edad, portador de la cédula de ciudadanía N° </w:t>
+        <w:t>71.555.983</w:t>
       </w:r>
       <w:r>
         <w:rPr>
@@ -650,7 +650,7 @@
           <w:color w:val="000000" w:themeColor="text1"/>
           <w:spacing w:val="-3"/>
         </w:rPr>
-        <w:t>71.555.983</w:t>
+        <w:t>, nombrad</w:t>
       </w:r>
       <w:r>
         <w:rPr>
@@ -658,280 +658,240 @@
           <w:color w:val="000000" w:themeColor="text1"/>
           <w:spacing w:val="-3"/>
         </w:rPr>
+        <w:t>o</w:t>
+      </w:r>
+      <w:r>
+        <w:rPr>
+          <w:rFonts w:ascii="Arial" w:eastAsia="Arial" w:hAnsi="Arial" w:cs="Arial"/>
+          <w:color w:val="000000" w:themeColor="text1"/>
+          <w:spacing w:val="-3"/>
+        </w:rPr>
+        <w:t xml:space="preserve"> mediante el Decreto Departamental </w:t>
+      </w:r>
+      <w:r>
+        <w:rPr>
+          <w:rFonts w:ascii="Arial" w:eastAsia="Arial" w:hAnsi="Arial" w:cs="Arial"/>
+          <w:color w:val="000000" w:themeColor="text1"/>
+          <w:spacing w:val="-3"/>
+        </w:rPr>
+        <w:t>No</w:t>
+      </w:r>
+      <w:r>
+        <w:rPr>
+          <w:rFonts w:ascii="Arial" w:eastAsia="Arial" w:hAnsi="Arial" w:cs="Arial"/>
+          <w:color w:val="000000" w:themeColor="text1"/>
+          <w:spacing w:val="-3"/>
+        </w:rPr>
+        <w:t xml:space="preserve"> </w:t>
+      </w:r>
+      <w:r>
+        <w:rPr>
+          <w:rFonts w:ascii="Arial" w:eastAsia="Arial" w:hAnsi="Arial" w:cs="Arial"/>
+          <w:color w:val="000000" w:themeColor="text1"/>
+          <w:spacing w:val="-3"/>
+        </w:rPr>
+        <w:t>202</w:t>
+      </w:r>
+      <w:r>
+        <w:rPr>
+          <w:rFonts w:ascii="Arial" w:eastAsia="Arial" w:hAnsi="Arial" w:cs="Arial"/>
+          <w:color w:val="000000" w:themeColor="text1"/>
+          <w:spacing w:val="-3"/>
+        </w:rPr>
+        <w:t>5</w:t>
+      </w:r>
+      <w:r>
+        <w:rPr>
+          <w:rFonts w:ascii="Arial" w:eastAsia="Arial" w:hAnsi="Arial" w:cs="Arial"/>
+          <w:color w:val="000000" w:themeColor="text1"/>
+          <w:spacing w:val="-3"/>
+        </w:rPr>
+        <w:t>070000649</w:t>
+      </w:r>
+      <w:r>
+        <w:rPr>
+          <w:rFonts w:ascii="Arial" w:eastAsia="Arial" w:hAnsi="Arial" w:cs="Arial"/>
+          <w:color w:val="000000" w:themeColor="text1"/>
+          <w:spacing w:val="-3"/>
+        </w:rPr>
+        <w:t xml:space="preserve"> del </w:t>
+      </w:r>
+      <w:r>
+        <w:rPr>
+          <w:rFonts w:ascii="Arial" w:eastAsia="Arial" w:hAnsi="Arial" w:cs="Arial"/>
+          <w:color w:val="000000" w:themeColor="text1"/>
+          <w:spacing w:val="-3"/>
+        </w:rPr>
+        <w:t>20</w:t>
+      </w:r>
+      <w:r>
+        <w:rPr>
+          <w:rFonts w:ascii="Arial" w:eastAsia="Arial" w:hAnsi="Arial" w:cs="Arial"/>
+          <w:color w:val="000000" w:themeColor="text1"/>
+          <w:spacing w:val="-3"/>
+        </w:rPr>
+        <w:t xml:space="preserve"> de </w:t>
+      </w:r>
+      <w:r>
+        <w:rPr>
+          <w:rFonts w:ascii="Arial" w:eastAsia="Arial" w:hAnsi="Arial" w:cs="Arial"/>
+          <w:color w:val="000000" w:themeColor="text1"/>
+          <w:spacing w:val="-3"/>
+        </w:rPr>
+        <w:t>febrero</w:t>
+      </w:r>
+      <w:r>
+        <w:rPr>
+          <w:rFonts w:ascii="Arial" w:eastAsia="Arial" w:hAnsi="Arial" w:cs="Arial"/>
+          <w:color w:val="000000" w:themeColor="text1"/>
+          <w:spacing w:val="-3"/>
+        </w:rPr>
+        <w:t xml:space="preserve"> de 202</w:t>
+      </w:r>
+      <w:r>
+        <w:rPr>
+          <w:rFonts w:ascii="Arial" w:eastAsia="Arial" w:hAnsi="Arial" w:cs="Arial"/>
+          <w:color w:val="000000" w:themeColor="text1"/>
+          <w:spacing w:val="-3"/>
+        </w:rPr>
+        <w:t>5</w:t>
+      </w:r>
+      <w:r>
+        <w:rPr>
+          <w:rFonts w:ascii="Arial" w:eastAsia="Arial" w:hAnsi="Arial" w:cs="Arial"/>
+          <w:color w:val="000000" w:themeColor="text1"/>
+          <w:spacing w:val="-3"/>
+        </w:rPr>
+        <w:t>, como Gerente General</w:t>
+      </w:r>
+      <w:r>
+        <w:rPr>
+          <w:rFonts w:ascii="Arial" w:eastAsia="Arial" w:hAnsi="Arial" w:cs="Arial"/>
+          <w:color w:val="000000" w:themeColor="text1"/>
+          <w:spacing w:val="-3"/>
+        </w:rPr>
+        <w:t xml:space="preserve"> </w:t>
+      </w:r>
+      <w:r>
+        <w:rPr>
+          <w:rFonts w:ascii="Arial" w:eastAsia="Arial" w:hAnsi="Arial" w:cs="Arial"/>
+          <w:color w:val="000000" w:themeColor="text1"/>
+          <w:spacing w:val="-3"/>
+        </w:rPr>
+        <w:t xml:space="preserve">de la </w:t>
+      </w:r>
+      <w:r>
+        <w:rPr>
+          <w:rFonts w:ascii="Arial" w:eastAsia="Arial" w:hAnsi="Arial" w:cs="Arial"/>
+          <w:b/>
+          <w:bCs/>
+          <w:color w:val="000000" w:themeColor="text1"/>
+          <w:spacing w:val="-3"/>
+        </w:rPr>
+        <w:t>EMPRESA DE PARQUES Y EVENTOS DE ANTIOQUIA – ACTIVA</w:t>
+      </w:r>
+      <w:r>
+        <w:rPr>
+          <w:rFonts w:ascii="Arial" w:eastAsia="Arial" w:hAnsi="Arial" w:cs="Arial"/>
+          <w:b/>
+          <w:bCs/>
+          <w:color w:val="000000" w:themeColor="text1"/>
+        </w:rPr>
         <w:t>,</w:t>
       </w:r>
       <w:r>
         <w:rPr>
           <w:rFonts w:ascii="Arial" w:eastAsia="Arial" w:hAnsi="Arial" w:cs="Arial"/>
           <w:color w:val="000000" w:themeColor="text1"/>
-          <w:spacing w:val="-3"/>
-        </w:rPr>
-        <w:t xml:space="preserve"> nombrad</w:t>
+        </w:rPr>
+        <w:t xml:space="preserve"> entidad pública organizada como Empresa Industrial y Comercial del Estado, </w:t>
       </w:r>
       <w:r>
         <w:rPr>
           <w:rFonts w:ascii="Arial" w:eastAsia="Arial" w:hAnsi="Arial" w:cs="Arial"/>
           <w:color w:val="000000" w:themeColor="text1"/>
-          <w:spacing w:val="-3"/>
-        </w:rPr>
-        <w:t>o</w:t>
+        </w:rPr>
+        <w:t>d</w:t>
       </w:r>
       <w:r>
         <w:rPr>
           <w:rFonts w:ascii="Arial" w:eastAsia="Arial" w:hAnsi="Arial" w:cs="Arial"/>
           <w:color w:val="000000" w:themeColor="text1"/>
-          <w:spacing w:val="-3"/>
-        </w:rPr>
-        <w:t xml:space="preserve"> mediante el Decreto </w:t>
+        </w:rPr>
+        <w:t>escentralizada perteneciente al orden Departamental, identificada con NIT 901</w:t>
       </w:r>
       <w:r>
         <w:rPr>
           <w:rFonts w:ascii="Arial" w:eastAsia="Arial" w:hAnsi="Arial" w:cs="Arial"/>
           <w:color w:val="000000" w:themeColor="text1"/>
-          <w:spacing w:val="-3"/>
-        </w:rPr>
-        <w:t xml:space="preserve">Departamental </w:t>
+        </w:rPr>
+        <w:t>.</w:t>
       </w:r>
       <w:r>
         <w:rPr>
           <w:rFonts w:ascii="Arial" w:eastAsia="Arial" w:hAnsi="Arial" w:cs="Arial"/>
           <w:color w:val="000000" w:themeColor="text1"/>
-          <w:spacing w:val="-3"/>
-        </w:rPr>
-        <w:t>No</w:t>
+        </w:rPr>
+        <w:t>437</w:t>
       </w:r>
       <w:r>
         <w:rPr>
           <w:rFonts w:ascii="Arial" w:eastAsia="Arial" w:hAnsi="Arial" w:cs="Arial"/>
           <w:color w:val="000000" w:themeColor="text1"/>
-          <w:spacing w:val="-3"/>
+        </w:rPr>
+        <w:t>.</w:t>
+      </w:r>
+      <w:r>
+        <w:rPr>
+          <w:rFonts w:ascii="Arial" w:eastAsia="Arial" w:hAnsi="Arial" w:cs="Arial"/>
+          <w:color w:val="000000" w:themeColor="text1"/>
+        </w:rPr>
+        <w:t>957-8, quien para los efectos de este contrato se denominará</w:t>
+      </w:r>
+      <w:r>
+        <w:rPr>
+          <w:rFonts w:ascii="Arial" w:eastAsia="Arial" w:hAnsi="Arial" w:cs="Arial"/>
+          <w:b/>
+          <w:bCs/>
+          <w:color w:val="000000" w:themeColor="text1"/>
+        </w:rPr>
+        <w:t xml:space="preserve"> EL CONTRATANTE,</w:t>
+      </w:r>
+      <w:r>
+        <w:rPr>
+          <w:rFonts w:ascii="Arial" w:eastAsia="Arial" w:hAnsi="Arial" w:cs="Arial"/>
+          <w:color w:val="000000" w:themeColor="text1"/>
         </w:rPr>
         <w:t xml:space="preserve"> </w:t>
       </w:r>
       <w:r>
         <w:rPr>
           <w:rFonts w:ascii="Arial" w:eastAsia="Arial" w:hAnsi="Arial" w:cs="Arial"/>
-          <w:color w:val="000000" w:themeColor="text1"/>
-          <w:spacing w:val="-3"/>
-        </w:rPr>
-        <w:t>202</w:t>
+        </w:rPr>
+        <w:t xml:space="preserve">por una parte, </w:t>
       </w:r>
       <w:r>
         <w:rPr>
           <w:rFonts w:ascii="Arial" w:eastAsia="Arial" w:hAnsi="Arial" w:cs="Arial"/>
           <w:color w:val="000000" w:themeColor="text1"/>
-          <w:spacing w:val="-3"/>
-        </w:rPr>
-        <w:t>5</w:t>
+        </w:rPr>
+        <w:t>y de la otra,</w:t>
       </w:r>
       <w:r>
         <w:rPr>
           <w:rFonts w:ascii="Arial" w:eastAsia="Arial" w:hAnsi="Arial" w:cs="Arial"/>
           <w:color w:val="000000" w:themeColor="text1"/>
-          <w:spacing w:val="-3"/>
-        </w:rPr>
-        <w:t>070000649</w:t>
+        </w:rPr>
+        <w:t xml:space="preserve"> </w:t>
       </w:r>
       <w:r>
         <w:rPr>
           <w:rFonts w:ascii="Arial" w:eastAsia="Arial" w:hAnsi="Arial" w:cs="Arial"/>
-          <w:color w:val="000000" w:themeColor="text1"/>
-          <w:spacing w:val="-3"/>
-        </w:rPr>
-        <w:t xml:space="preserve"> del </w:t>
-      </w:r>
-      <w:r>
-        <w:rPr>
-          <w:rFonts w:ascii="Arial" w:eastAsia="Arial" w:hAnsi="Arial" w:cs="Arial"/>
-          <w:color w:val="000000" w:themeColor="text1"/>
-          <w:spacing w:val="-3"/>
-        </w:rPr>
-        <w:t>20</w:t>
-      </w:r>
-      <w:r>
-        <w:rPr>
-          <w:rFonts w:ascii="Arial" w:eastAsia="Arial" w:hAnsi="Arial" w:cs="Arial"/>
-          <w:color w:val="000000" w:themeColor="text1"/>
-          <w:spacing w:val="-3"/>
-        </w:rPr>
-        <w:t xml:space="preserve"> de </w:t>
-      </w:r>
-      <w:r>
-        <w:rPr>
-          <w:rFonts w:ascii="Arial" w:eastAsia="Arial" w:hAnsi="Arial" w:cs="Arial"/>
-          <w:color w:val="000000" w:themeColor="text1"/>
-          <w:spacing w:val="-3"/>
-        </w:rPr>
-        <w:t>febrero</w:t>
-      </w:r>
-      <w:r>
-        <w:rPr>
-          <w:rFonts w:ascii="Arial" w:eastAsia="Arial" w:hAnsi="Arial" w:cs="Arial"/>
-          <w:color w:val="000000" w:themeColor="text1"/>
-          <w:spacing w:val="-3"/>
-        </w:rPr>
-        <w:t xml:space="preserve"> de 202</w:t>
-      </w:r>
-      <w:r>
-        <w:rPr>
-          <w:rFonts w:ascii="Arial" w:eastAsia="Arial" w:hAnsi="Arial" w:cs="Arial"/>
-          <w:color w:val="000000" w:themeColor="text1"/>
-          <w:spacing w:val="-3"/>
-        </w:rPr>
-        <w:t>5</w:t>
-      </w:r>
-      <w:r>
-        <w:rPr>
-          <w:rFonts w:ascii="Arial" w:eastAsia="Arial" w:hAnsi="Arial" w:cs="Arial"/>
-          <w:color w:val="000000" w:themeColor="text1"/>
-          <w:spacing w:val="-3"/>
-        </w:rPr>
-        <w:t>, como Gerente General</w:t>
-      </w:r>
-      <w:r>
-        <w:rPr>
-          <w:rFonts w:ascii="Arial" w:eastAsia="Arial" w:hAnsi="Arial" w:cs="Arial"/>
-          <w:color w:val="000000" w:themeColor="text1"/>
-          <w:spacing w:val="-3"/>
-        </w:rPr>
-        <w:t xml:space="preserve"> </w:t>
-      </w:r>
-      <w:r>
-        <w:rPr>
-          <w:rFonts w:ascii="Arial" w:eastAsia="Arial" w:hAnsi="Arial" w:cs="Arial"/>
-          <w:color w:val="000000" w:themeColor="text1"/>
-          <w:spacing w:val="-3"/>
-        </w:rPr>
-        <w:t xml:space="preserve">de la </w:t>
-      </w:r>
-      <w:r>
-        <w:rPr>
-          <w:rFonts w:ascii="Arial" w:eastAsia="Arial" w:hAnsi="Arial" w:cs="Arial"/>
-          <w:b/>
-          <w:bCs/>
-          <w:color w:val="000000" w:themeColor="text1"/>
-          <w:spacing w:val="-3"/>
-        </w:rPr>
-        <w:t>EMPRESA DE PARQUES Y EVENTOS DE ANTIOQUIA – ACTIVA</w:t>
-      </w:r>
-      <w:r>
-        <w:rPr>
-          <w:rFonts w:ascii="Arial" w:eastAsia="Arial" w:hAnsi="Arial" w:cs="Arial"/>
-          <w:b/>
-          <w:bCs/>
-          <w:color w:val="000000" w:themeColor="text1"/>
-        </w:rPr>
-        <w:t>,</w:t>
-      </w:r>
-      <w:r>
-        <w:rPr>
-          <w:rFonts w:ascii="Arial" w:eastAsia="Arial" w:hAnsi="Arial" w:cs="Arial"/>
-          <w:color w:val="000000" w:themeColor="text1"/>
-        </w:rPr>
-        <w:t xml:space="preserve"> entidad pública organizada como Empresa Industrial y Comercial del Estado, </w:t>
-      </w:r>
-      <w:r>
-        <w:rPr>
-          <w:rFonts w:ascii="Arial" w:eastAsia="Arial" w:hAnsi="Arial" w:cs="Arial"/>
-          <w:color w:val="000000" w:themeColor="text1"/>
-        </w:rPr>
-        <w:t>d</w:t>
-      </w:r>
-      <w:r>
-        <w:rPr>
-          <w:rFonts w:ascii="Arial" w:eastAsia="Arial" w:hAnsi="Arial" w:cs="Arial"/>
-          <w:color w:val="000000" w:themeColor="text1"/>
-        </w:rPr>
-        <w:t>escentralizada perteneciente al orden Departamental, identificada con NIT 901</w:t>
-      </w:r>
-      <w:r>
-        <w:rPr>
-          <w:rFonts w:ascii="Arial" w:eastAsia="Arial" w:hAnsi="Arial" w:cs="Arial"/>
-          <w:color w:val="000000" w:themeColor="text1"/>
-        </w:rPr>
-        <w:t>.</w:t>
-      </w:r>
-      <w:r>
-        <w:rPr>
-          <w:rFonts w:ascii="Arial" w:eastAsia="Arial" w:hAnsi="Arial" w:cs="Arial"/>
-          <w:color w:val="000000" w:themeColor="text1"/>
-        </w:rPr>
-        <w:t>437</w:t>
-      </w:r>
-      <w:r>
-        <w:rPr>
-          <w:rFonts w:ascii="Arial" w:eastAsia="Arial" w:hAnsi="Arial" w:cs="Arial"/>
-          <w:color w:val="000000" w:themeColor="text1"/>
-        </w:rPr>
-        <w:t>.</w:t>
-      </w:r>
-      <w:r>
-        <w:rPr>
-          <w:rFonts w:ascii="Arial" w:eastAsia="Arial" w:hAnsi="Arial" w:cs="Arial"/>
-          <w:color w:val="000000" w:themeColor="text1"/>
-        </w:rPr>
-        <w:t>957-8, quien</w:t>
-      </w:r>
-      <w:r>
-        <w:rPr>
-          <w:rFonts w:ascii="Arial" w:eastAsia="Arial" w:hAnsi="Arial" w:cs="Arial"/>
-          <w:color w:val="000000" w:themeColor="text1"/>
-        </w:rPr>
-        <w:t xml:space="preserve"> para los efectos de este contrato se denominará</w:t>
-      </w:r>
-      <w:r>
-        <w:rPr>
-          <w:rFonts w:ascii="Arial" w:eastAsia="Arial" w:hAnsi="Arial" w:cs="Arial"/>
-          <w:b/>
-          <w:bCs/>
-          <w:color w:val="000000" w:themeColor="text1"/>
-        </w:rPr>
-        <w:t xml:space="preserve"> EL CONTRATANTE,</w:t>
-      </w:r>
-      <w:r>
-        <w:rPr>
-          <w:rFonts w:ascii="Arial" w:eastAsia="Arial" w:hAnsi="Arial" w:cs="Arial"/>
-          <w:color w:val="000000" w:themeColor="text1"/>
-        </w:rPr>
-        <w:t xml:space="preserve"> </w:t>
-      </w:r>
-      <w:r>
-        <w:rPr>
-          <w:rFonts w:ascii="Arial" w:eastAsia="Arial" w:hAnsi="Arial" w:cs="Arial"/>
-        </w:rPr>
-        <w:t xml:space="preserve">por una parte, </w:t>
-      </w:r>
-      <w:r>
-        <w:rPr>
-          <w:rFonts w:ascii="Arial" w:eastAsia="Arial" w:hAnsi="Arial" w:cs="Arial"/>
-          <w:color w:val="000000" w:themeColor="text1"/>
-        </w:rPr>
-        <w:t>y de la otra,</w:t>
-      </w:r>
-      <w:r>
-        <w:rPr>
-          <w:rFonts w:ascii="Arial" w:eastAsia="Arial" w:hAnsi="Arial" w:cs="Arial"/>
-          <w:color w:val="000000" w:themeColor="text1"/>
-        </w:rPr>
-        <w:t xml:space="preserve"> </w:t>
-      </w:r>
-      <w:r>
-        <w:rPr>
-          <w:rFonts w:ascii="Arial" w:eastAsia="Arial" w:hAnsi="Arial" w:cs="Arial"/>
           <w:b/>
           <w:bCs/>
           <w:color w:val="000000"/>
         </w:rPr>
-        <w:t>{nombre_contratista}</w:t>
-      </w:r>
-      <w:r>
-        <w:rPr>
-          <w:rFonts w:ascii="Arial" w:eastAsia="Arial" w:hAnsi="Arial" w:cs="Arial"/>
-          <w:b/>
-          <w:bCs/>
-          <w:color w:val="000000"/>
-        </w:rPr>
-        <w:t xml:space="preserve"> </w:t>
+        <w:t xml:space="preserve">{nombre_contratista} </w:t>
       </w:r>
       <w:r>
         <w:rPr>
@@ -1078,16 +1038,7 @@
           <w:bCs/>
           <w:color w:val="000000" w:themeColor="text1"/>
         </w:rPr>
-        <w:t>PRIMERA. OBJETO:</w:t>
-      </w:r>
-      <w:r>
-        <w:rPr>
-          <w:rFonts w:ascii="Arial" w:hAnsi="Arial" w:cs="Arial"/>
-          <w:b/>
-          <w:bCs/>
-          <w:color w:val="000000" w:themeColor="text1"/>
-        </w:rPr>
-        <w:t xml:space="preserve"> </w:t>
+        <w:t xml:space="preserve">PRIMERA. OBJETO: </w:t>
       </w:r>
       <w:r>
         <w:rPr>
@@ -1282,29 +1233,7 @@
           <w:szCs w:val="22"/>
           <w:shd w:val="clear" w:color="auto" w:fill="FFFFFF"/>
         </w:rPr>
-        <w:t xml:space="preserve">Desde la suscripción del acta de inicio, hasta el </w:t>
-      </w:r>
-      <w:r>
-        <w:rPr>
-          <w:rStyle w:val="normaltextrun"/>
-          <w:rFonts w:cs="Arial"/>
-          <w:color w:val="000000"/>
-          <w:sz w:val="22"/>
-          <w:szCs w:val="22"/>
-          <w:shd w:val="clear" w:color="auto" w:fill="FFFFFF"/>
-        </w:rPr>
-        <w:t>{fecha_terminacion_texto}</w:t>
-      </w:r>
-      <w:r>
-        <w:rPr>
-          <w:rStyle w:val="normaltextrun"/>
-          <w:rFonts w:cs="Arial"/>
-          <w:color w:val="000000"/>
-          <w:sz w:val="22"/>
-          <w:szCs w:val="22"/>
-          <w:shd w:val="clear" w:color="auto" w:fill="FFFFFF"/>
-        </w:rPr>
-        <w:t>.</w:t>
+        <w:t>Desde la suscripción del acta de inicio, hasta el {fecha_terminacion_texto}.</w:t>
       </w:r>
     </w:p>
     <w:p>
@@ -1545,7 +1474,7 @@
         <w:jc w:val="both"/>
         <w:rPr>
           <w:rFonts w:ascii="Arial" w:eastAsia="Times New Roman" w:hAnsi="Arial" w:cs="Arial"/>
-          <w:color w:val="0D0D0D" w:themeColor="text1" w:themeTint="F2"/>
+          <w:color w:val="000000" w:themeColor="text1"/>
           <w:lang w:val="es-CO" w:eastAsia="es-ES"/>
         </w:rPr>
       </w:pPr>
@@ -1569,26 +1498,26 @@
           <w:lang w:val="es-CO" w:eastAsia="es-ES"/>
         </w:rPr>
       </w:pPr>
-      <w:r>
+    </w:p>
+    <w:p>
+      <w:pPr>
+        <w:suppressAutoHyphens/>
+        <w:ind w:right="-425"/>
+        <w:jc w:val="both"/>
         <w:rPr>
           <w:rFonts w:ascii="Arial" w:eastAsia="Times New Roman" w:hAnsi="Arial" w:cs="Arial"/>
           <w:color w:val="0D0D0D" w:themeColor="text1" w:themeTint="F2"/>
           <w:lang w:val="es-CO" w:eastAsia="es-ES"/>
         </w:rPr>
-        <w:t>Así mismo, para proceder al pago, la EMPRESA DE PARQUES Y EVENTOS DE ANTIOQUIA – ACTIVA, verificará que el contratista se encuentre al día en el pago de sus obligaciones parafiscales y aquellas relacionadas con los sistemas de seguridad social integral.</w:t>
-      </w:r>
-    </w:p>
-    <w:p>
-      <w:pPr>
-        <w:suppressAutoHyphens/>
-        <w:ind w:right="-425"/>
-        <w:jc w:val="both"/>
+      </w:pPr>
+      <w:r>
         <w:rPr>
           <w:rFonts w:ascii="Arial" w:eastAsia="Times New Roman" w:hAnsi="Arial" w:cs="Arial"/>
           <w:color w:val="0D0D0D" w:themeColor="text1" w:themeTint="F2"/>
           <w:lang w:val="es-CO" w:eastAsia="es-ES"/>
         </w:rPr>
-      </w:pPr>
+        <w:t>Así mismo, para proceder al pago, la EMPRESA DE PARQUES Y EVENTOS DE ANTIOQUIA – ACTIVA, verificará que el contratista se encuentre al día en el pago de sus obligaciones parafiscales y aquellas relacionadas con los sistemas de seguridad social integral.</w:t>
+      </w:r>
     </w:p>
     <w:p>
       <w:pPr>
@@ -1601,26 +1530,26 @@
           <w:lang w:val="es-CO" w:eastAsia="es-ES"/>
         </w:rPr>
       </w:pPr>
-      <w:r>
+    </w:p>
+    <w:p>
+      <w:pPr>
+        <w:suppressAutoHyphens/>
+        <w:ind w:right="-425"/>
+        <w:jc w:val="both"/>
         <w:rPr>
           <w:rFonts w:ascii="Arial" w:eastAsia="Times New Roman" w:hAnsi="Arial" w:cs="Arial"/>
           <w:color w:val="0D0D0D" w:themeColor="text1" w:themeTint="F2"/>
           <w:lang w:val="es-CO" w:eastAsia="es-ES"/>
         </w:rPr>
-        <w:t>El contratista deberá aportar las certificaciones y documentación de los dependientes económicos en caso de tenerlos, para ACTIVA realizar los respectivos análisis y depuraciones fiscales en los abonos en cuenta o pagos derivados de este contrato.</w:t>
-      </w:r>
-    </w:p>
-    <w:p>
-      <w:pPr>
-        <w:suppressAutoHyphens/>
-        <w:ind w:right="-425"/>
-        <w:jc w:val="both"/>
+      </w:pPr>
+      <w:r>
         <w:rPr>
           <w:rFonts w:ascii="Arial" w:eastAsia="Times New Roman" w:hAnsi="Arial" w:cs="Arial"/>
           <w:color w:val="0D0D0D" w:themeColor="text1" w:themeTint="F2"/>
           <w:lang w:val="es-CO" w:eastAsia="es-ES"/>
         </w:rPr>
-      </w:pPr>
+        <w:t>El contratista deberá aportar las certificaciones y documentación de los dependientes económicos en caso de tenerlos, para ACTIVA realizar los respectivos análisis y depuraciones fiscales en los abonos en cuenta o pagos derivados de este contrato.</w:t>
+      </w:r>
     </w:p>
     <w:p>
       <w:pPr>
@@ -1633,26 +1562,26 @@
           <w:lang w:val="es-CO" w:eastAsia="es-ES"/>
         </w:rPr>
       </w:pPr>
-      <w:r>
+    </w:p>
+    <w:p>
+      <w:pPr>
+        <w:suppressAutoHyphens/>
+        <w:ind w:right="-425"/>
+        <w:jc w:val="both"/>
         <w:rPr>
           <w:rFonts w:ascii="Arial" w:eastAsia="Times New Roman" w:hAnsi="Arial" w:cs="Arial"/>
           <w:color w:val="0D0D0D" w:themeColor="text1" w:themeTint="F2"/>
           <w:lang w:val="es-CO" w:eastAsia="es-ES"/>
         </w:rPr>
-        <w:t>El recurso no ejecutado será liberado por parte de ACTIVA una vez terminado el contrato.</w:t>
-      </w:r>
-    </w:p>
-    <w:p>
-      <w:pPr>
-        <w:suppressAutoHyphens/>
-        <w:ind w:right="-425"/>
-        <w:jc w:val="both"/>
+      </w:pPr>
+      <w:r>
         <w:rPr>
           <w:rFonts w:ascii="Arial" w:eastAsia="Times New Roman" w:hAnsi="Arial" w:cs="Arial"/>
           <w:color w:val="0D0D0D" w:themeColor="text1" w:themeTint="F2"/>
           <w:lang w:val="es-CO" w:eastAsia="es-ES"/>
         </w:rPr>
-      </w:pPr>
+        <w:t>El recurso no ejecutado será liberado por parte de ACTIVA una vez terminado el contrato.</w:t>
+      </w:r>
     </w:p>
     <w:p>
       <w:pPr>
@@ -1665,36 +1594,36 @@
           <w:lang w:val="es-CO" w:eastAsia="es-ES"/>
         </w:rPr>
       </w:pPr>
-      <w:r>
-        <w:rPr>
-          <w:rFonts w:ascii="Arial" w:eastAsia="Times New Roman" w:hAnsi="Arial" w:cs="Arial"/>
-          <w:b/>
-          <w:bCs/>
-          <w:color w:val="0D0D0D" w:themeColor="text1" w:themeTint="F2"/>
-          <w:lang w:val="es-CO" w:eastAsia="es-ES"/>
-        </w:rPr>
-        <w:t xml:space="preserve">Nota: </w:t>
-      </w:r>
-      <w:r>
+    </w:p>
+    <w:p>
+      <w:pPr>
+        <w:suppressAutoHyphens/>
+        <w:ind w:right="-425"/>
+        <w:jc w:val="both"/>
         <w:rPr>
           <w:rFonts w:ascii="Arial" w:eastAsia="Times New Roman" w:hAnsi="Arial" w:cs="Arial"/>
           <w:color w:val="0D0D0D" w:themeColor="text1" w:themeTint="F2"/>
           <w:lang w:val="es-CO" w:eastAsia="es-ES"/>
         </w:rPr>
-        <w:t>los impuestos, estampillas y retenciones que apliquen estarán a cargo del contratista.</w:t>
-      </w:r>
-    </w:p>
-    <w:p>
-      <w:pPr>
-        <w:suppressAutoHyphens/>
-        <w:ind w:right="-425"/>
-        <w:jc w:val="both"/>
+      </w:pPr>
+      <w:r>
+        <w:rPr>
+          <w:rFonts w:ascii="Arial" w:eastAsia="Times New Roman" w:hAnsi="Arial" w:cs="Arial"/>
+          <w:b/>
+          <w:bCs/>
+          <w:color w:val="0D0D0D" w:themeColor="text1" w:themeTint="F2"/>
+          <w:lang w:val="es-CO" w:eastAsia="es-ES"/>
+        </w:rPr>
+        <w:t xml:space="preserve">Nota: </w:t>
+      </w:r>
+      <w:r>
         <w:rPr>
           <w:rFonts w:ascii="Arial" w:eastAsia="Times New Roman" w:hAnsi="Arial" w:cs="Arial"/>
           <w:color w:val="0D0D0D" w:themeColor="text1" w:themeTint="F2"/>
           <w:lang w:val="es-CO" w:eastAsia="es-ES"/>
         </w:rPr>
-      </w:pPr>
+        <w:t>los impuestos, estampillas y retenciones que apliquen estarán a cargo del contratista.</w:t>
+      </w:r>
     </w:p>
     <w:p>
       <w:pPr>
@@ -1702,6 +1631,18 @@
         <w:ind w:right="-425"/>
         <w:jc w:val="both"/>
         <w:rPr>
+          <w:rFonts w:ascii="Arial" w:eastAsia="Times New Roman" w:hAnsi="Arial" w:cs="Arial"/>
+          <w:color w:val="0D0D0D" w:themeColor="text1" w:themeTint="F2"/>
+          <w:lang w:val="es-CO" w:eastAsia="es-ES"/>
+        </w:rPr>
+      </w:pPr>
+    </w:p>
+    <w:p>
+      <w:pPr>
+        <w:suppressAutoHyphens/>
+        <w:ind w:right="-425"/>
+        <w:jc w:val="both"/>
+        <w:rPr>
           <w:rFonts w:ascii="Arial" w:hAnsi="Arial" w:cs="Arial"/>
           <w:color w:val="000000" w:themeColor="text1"/>
         </w:rPr>
@@ -1743,14 +1684,7 @@
           <w:rFonts w:ascii="Arial" w:hAnsi="Arial" w:cs="Arial"/>
           <w:color w:val="000000" w:themeColor="text1"/>
         </w:rPr>
-        <w:t xml:space="preserve">l </w:t>
-      </w:r>
-      <w:r>
-        <w:rPr>
-          <w:rFonts w:ascii="Arial" w:hAnsi="Arial" w:cs="Arial"/>
-          <w:color w:val="000000" w:themeColor="text1"/>
-        </w:rPr>
-        <w:t>{presupuesto_texto}</w:t>
+        <w:t>l {presupuesto_texto}</w:t>
       </w:r>
     </w:p>
     <w:p>
@@ -2951,14 +2885,7 @@
           <w:rFonts w:ascii="Arial" w:eastAsia="Arial" w:hAnsi="Arial" w:cs="Arial"/>
           <w:bdr w:val="none" w:sz="0" w:space="0" w:color="auto" w:frame="1"/>
         </w:rPr>
-        <w:t xml:space="preserve"> </w:t>
-      </w:r>
-      <w:r>
-        <w:rPr>
-          <w:rFonts w:ascii="Arial" w:eastAsia="Arial" w:hAnsi="Arial" w:cs="Arial"/>
-          <w:bdr w:val="none" w:sz="0" w:space="0" w:color="auto" w:frame="1"/>
-        </w:rPr>
-        <w:t>{supervisor_nombre}</w:t>
+        <w:t xml:space="preserve"> {supervisor_nombre}</w:t>
       </w:r>
       <w:r>
         <w:rPr>
@@ -3528,10 +3455,13 @@
         <w:spacing w:line="300" w:lineRule="auto"/>
         <w:ind w:right="-283"/>
         <w:jc w:val="both"/>
-      </w:pPr>
-      <w:r>
-        <w:rPr>
-          <w:rFonts w:ascii="Segoe UI" w:eastAsia="Segoe UI" w:hAnsi="Segoe UI" w:cs="Segoe UI"/>
+        <w:rPr>
+          <w:rFonts w:ascii="Arial" w:hAnsi="Arial" w:cs="Arial"/>
+        </w:rPr>
+      </w:pPr>
+      <w:r>
+        <w:rPr>
+          <w:rFonts w:ascii="Arial" w:eastAsia="Segoe UI" w:hAnsi="Arial" w:cs="Arial"/>
           <w:sz w:val="21"/>
           <w:szCs w:val="21"/>
           <w:lang w:val="es-MX"/>
@@ -3540,7 +3470,7 @@
       </w:r>
       <w:r>
         <w:rPr>
-          <w:rFonts w:eastAsiaTheme="minorEastAsia"/>
+          <w:rFonts w:ascii="Arial" w:eastAsiaTheme="minorEastAsia" w:hAnsi="Arial" w:cs="Arial"/>
           <w:color w:val="000000" w:themeColor="text1"/>
           <w:lang w:val="es-MX"/>
         </w:rPr>
@@ -3548,7 +3478,7 @@
       </w:r>
       <w:r>
         <w:rPr>
-          <w:rFonts w:eastAsiaTheme="minorEastAsia"/>
+          <w:rFonts w:ascii="Arial" w:eastAsiaTheme="minorEastAsia" w:hAnsi="Arial" w:cs="Arial"/>
           <w:color w:val="000000" w:themeColor="text1"/>
           <w:lang w:val="es-MX"/>
         </w:rPr>
@@ -3556,7 +3486,7 @@
       </w:r>
       <w:r>
         <w:rPr>
-          <w:rFonts w:eastAsiaTheme="minorEastAsia"/>
+          <w:rFonts w:ascii="Arial" w:eastAsiaTheme="minorEastAsia" w:hAnsi="Arial" w:cs="Arial"/>
           <w:color w:val="000000" w:themeColor="text1"/>
           <w:lang w:val="es-MX"/>
         </w:rPr>
@@ -3669,7 +3599,7 @@
       </w:r>
       <w:r>
         <w:rPr>
-          <w:rFonts w:ascii="Segoe UI" w:eastAsia="Segoe UI" w:hAnsi="Segoe UI" w:cs="Segoe UI"/>
+          <w:rFonts w:ascii="Arial" w:eastAsia="Segoe UI" w:hAnsi="Arial" w:cs="Arial"/>
           <w:b/>
           <w:bCs/>
           <w:sz w:val="21"/>
@@ -3679,50 +3609,50 @@
       </w:r>
       <w:r>
         <w:rPr>
-          <w:rFonts w:eastAsiaTheme="minorEastAsia"/>
+          <w:rFonts w:ascii="Arial" w:eastAsiaTheme="minorEastAsia" w:hAnsi="Arial" w:cs="Arial"/>
           <w:color w:val="000000" w:themeColor="text1"/>
         </w:rPr>
         <w:t>En el presente contrato, cuy</w:t>
       </w:r>
       <w:r>
         <w:rPr>
-          <w:rFonts w:eastAsiaTheme="minorEastAsia"/>
+          <w:rFonts w:ascii="Arial" w:eastAsiaTheme="minorEastAsia" w:hAnsi="Arial" w:cs="Arial"/>
           <w:color w:val="000000" w:themeColor="text1"/>
         </w:rPr>
         <w:t>a</w:t>
       </w:r>
       <w:r>
         <w:rPr>
-          <w:rFonts w:eastAsiaTheme="minorEastAsia"/>
+          <w:rFonts w:ascii="Arial" w:eastAsiaTheme="minorEastAsia" w:hAnsi="Arial" w:cs="Arial"/>
           <w:color w:val="000000" w:themeColor="text1"/>
         </w:rPr>
         <w:t xml:space="preserve"> </w:t>
       </w:r>
       <w:r>
         <w:rPr>
-          <w:rFonts w:eastAsiaTheme="minorEastAsia"/>
+          <w:rFonts w:ascii="Arial" w:eastAsiaTheme="minorEastAsia" w:hAnsi="Arial" w:cs="Arial"/>
           <w:color w:val="000000" w:themeColor="text1"/>
         </w:rPr>
         <w:t>cuantía</w:t>
       </w:r>
       <w:r>
         <w:rPr>
-          <w:rFonts w:eastAsiaTheme="minorEastAsia"/>
-          <w:color w:val="000000" w:themeColor="text1"/>
-        </w:rPr>
-        <w:t xml:space="preserve"> es inferior a veinte (20) salarios mínimos legales mensuales vigentes (SMMLV), no se exigirá la constitución de garantías, atendiendo la naturaleza del objeto, la modalidad de contratación y la justificación contenida en los estudios previos, </w:t>
-      </w:r>
-      <w:r>
-        <w:rPr>
-          <w:rFonts w:eastAsiaTheme="minorEastAsia"/>
+          <w:rFonts w:ascii="Arial" w:eastAsiaTheme="minorEastAsia" w:hAnsi="Arial" w:cs="Arial"/>
+          <w:color w:val="000000" w:themeColor="text1"/>
+        </w:rPr>
+        <w:t xml:space="preserve"> es inferior a veinte (20) salarios mínimos legales mensuales vigentes (SMMLV), no se exigirá la constitución de garantías, atendiendo la naturaleza del objeto, la modalidad de contratación y la justificación </w:t>
+      </w:r>
+      <w:r>
+        <w:rPr>
+          <w:rFonts w:ascii="Arial" w:eastAsiaTheme="minorEastAsia" w:hAnsi="Arial" w:cs="Arial"/>
           <w:color w:val="000000" w:themeColor="text1"/>
         </w:rPr>
         <w:lastRenderedPageBreak/>
-        <w:t>conforme a la normativa vigente y al Manual de Contratación de la EMPRESA DE PARQUES Y EVENTOS DE ANTIOQUIA – ACTIVA. No obstante, la entidad podrá exigir garantías cuando lo considere necesario para proteger los intereses públicos, dejando constancia de la motivación en los documentos del proceso</w:t>
-      </w:r>
-      <w:r>
-        <w:rPr>
-          <w:rFonts w:ascii="Segoe UI" w:eastAsia="Segoe UI" w:hAnsi="Segoe UI" w:cs="Segoe UI"/>
+        <w:t>contenida en los estudios previos, conforme a la normativa vigente y al Manual de Contratación de la EMPRESA DE PARQUES Y EVENTOS DE ANTIOQUIA – ACTIVA. No obstante, la entidad podrá exigir garantías cuando lo considere necesario para proteger los intereses públicos, dejando constancia de la motivación en los documentos del proceso</w:t>
+      </w:r>
+      <w:r>
+        <w:rPr>
+          <w:rFonts w:ascii="Arial" w:eastAsia="Segoe UI" w:hAnsi="Arial" w:cs="Arial"/>
           <w:sz w:val="21"/>
           <w:szCs w:val="21"/>
         </w:rPr>
@@ -3997,25 +3927,7 @@
           <w:color w:val="000000" w:themeColor="text1"/>
           <w:spacing w:val="-3"/>
         </w:rPr>
-        <w:t xml:space="preserve"> </w:t>
-      </w:r>
-      <w:proofErr w:type="gramStart"/>
-      <w:r>
-        <w:rPr>
-          <w:rFonts w:ascii="Arial" w:hAnsi="Arial" w:cs="Arial"/>
-          <w:color w:val="000000" w:themeColor="text1"/>
-          <w:spacing w:val="-3"/>
-        </w:rPr>
-        <w:t>Director</w:t>
-      </w:r>
-      <w:proofErr w:type="gramEnd"/>
-      <w:r>
-        <w:rPr>
-          <w:rFonts w:ascii="Arial" w:hAnsi="Arial" w:cs="Arial"/>
-          <w:color w:val="000000" w:themeColor="text1"/>
-          <w:spacing w:val="-3"/>
-        </w:rPr>
-        <w:t xml:space="preserve"> Jurídic</w:t>
+        <w:t xml:space="preserve"> Director Jurídic</w:t>
       </w:r>
       <w:r>
         <w:rPr>
@@ -4325,7 +4237,29 @@
           <w:color w:val="000000" w:themeColor="text1"/>
           <w:lang w:val="es-CO"/>
         </w:rPr>
-        <w:t>El acta de liquidación deberá ser suscrita por las partes del contrato y por el supervisor quien será el responsable de la suscripción de la misma. El término de la liquidación será de conformidad a lo estipulado en el artículo 11 de la ley 1150 de 2007.</w:t>
+        <w:t xml:space="preserve">El acta de liquidación deberá ser suscrita por las partes del contrato y por el supervisor quien será el responsable de la suscripción de </w:t>
+      </w:r>
+      <w:proofErr w:type="gramStart"/>
+      <w:r>
+        <w:rPr>
+          <w:rFonts w:ascii="Arial" w:hAnsi="Arial" w:cs="Arial"/>
+          <w:i/>
+          <w:iCs/>
+          <w:color w:val="000000" w:themeColor="text1"/>
+          <w:lang w:val="es-CO"/>
+        </w:rPr>
+        <w:t>la misma</w:t>
+      </w:r>
+      <w:proofErr w:type="gramEnd"/>
+      <w:r>
+        <w:rPr>
+          <w:rFonts w:ascii="Arial" w:hAnsi="Arial" w:cs="Arial"/>
+          <w:i/>
+          <w:iCs/>
+          <w:color w:val="000000" w:themeColor="text1"/>
+          <w:lang w:val="es-CO"/>
+        </w:rPr>
+        <w:t>. El término de la liquidación será de conformidad a lo estipulado en el artículo 11 de la ley 1150 de 2007.</w:t>
       </w:r>
     </w:p>
     <w:p>
@@ -5181,6 +5115,72 @@
     </w:p>
     <w:p>
       <w:pPr>
+        <w:ind w:right="-425"/>
+        <w:jc w:val="both"/>
+        <w:rPr>
+          <w:rFonts w:ascii="Arial" w:eastAsia="Calibri" w:hAnsi="Arial" w:cs="Arial"/>
+          <w:lang w:val="pt-BR"/>
+        </w:rPr>
+      </w:pPr>
+    </w:p>
+    <w:p>
+      <w:pPr>
+        <w:ind w:right="-425"/>
+        <w:jc w:val="both"/>
+        <w:rPr>
+          <w:rFonts w:ascii="Arial" w:eastAsia="Calibri" w:hAnsi="Arial" w:cs="Arial"/>
+          <w:b/>
+          <w:bCs/>
+          <w:lang w:val="pt-BR"/>
+        </w:rPr>
+      </w:pPr>
+      <w:r>
+        <w:rPr>
+          <w:rFonts w:ascii="Arial" w:eastAsia="Calibri" w:hAnsi="Arial" w:cs="Arial"/>
+          <w:b/>
+          <w:bCs/>
+          <w:lang w:val="pt-BR"/>
+        </w:rPr>
+        <w:t>{</w:t>
+      </w:r>
+      <w:proofErr w:type="spellStart"/>
+      <w:r>
+        <w:rPr>
+          <w:rFonts w:ascii="Arial" w:eastAsia="Calibri" w:hAnsi="Arial" w:cs="Arial"/>
+          <w:b/>
+          <w:bCs/>
+          <w:lang w:val="pt-BR"/>
+        </w:rPr>
+        <w:t>nombre_contratista</w:t>
+      </w:r>
+      <w:proofErr w:type="spellEnd"/>
+      <w:r>
+        <w:rPr>
+          <w:rFonts w:ascii="Arial" w:eastAsia="Calibri" w:hAnsi="Arial" w:cs="Arial"/>
+          <w:b/>
+          <w:bCs/>
+          <w:lang w:val="pt-BR"/>
+        </w:rPr>
+        <w:t>}</w:t>
+      </w:r>
+    </w:p>
+    <w:p>
+      <w:pPr>
+        <w:ind w:right="-425"/>
+        <w:jc w:val="both"/>
+        <w:rPr>
+          <w:rFonts w:ascii="Arial" w:eastAsia="Calibri" w:hAnsi="Arial" w:cs="Arial"/>
+        </w:rPr>
+      </w:pPr>
+      <w:r>
+        <w:rPr>
+          <w:rFonts w:ascii="Arial" w:eastAsia="Calibri" w:hAnsi="Arial" w:cs="Arial"/>
+        </w:rPr>
+        <w:t xml:space="preserve">CONTRATISTA </w:t>
+      </w:r>
+    </w:p>
+    <w:p>
+      <w:pPr>
         <w:tabs>
           <w:tab w:val="left" w:pos="2277"/>
         </w:tabs>
@@ -5207,6 +5207,32 @@
     </w:p>
     <w:p>
       <w:pPr>
+        <w:tabs>
+          <w:tab w:val="left" w:pos="2277"/>
+        </w:tabs>
+        <w:ind w:right="-425"/>
+        <w:jc w:val="both"/>
+        <w:rPr>
+          <w:rFonts w:ascii="Arial" w:hAnsi="Arial" w:cs="Arial"/>
+          <w:color w:val="000000" w:themeColor="text1"/>
+        </w:rPr>
+      </w:pPr>
+    </w:p>
+    <w:p>
+      <w:pPr>
+        <w:tabs>
+          <w:tab w:val="left" w:pos="2277"/>
+        </w:tabs>
+        <w:ind w:right="-425"/>
+        <w:jc w:val="both"/>
+        <w:rPr>
+          <w:rFonts w:ascii="Arial" w:hAnsi="Arial" w:cs="Arial"/>
+          <w:color w:val="000000" w:themeColor="text1"/>
+        </w:rPr>
+      </w:pPr>
+    </w:p>
+    <w:p>
+      <w:pPr>
         <w:ind w:right="-425"/>
         <w:jc w:val="both"/>
         <w:rPr>
@@ -5316,52 +5342,6 @@
           <w:lang w:val="pt-BR"/>
         </w:rPr>
       </w:pPr>
-    </w:p>
-    <w:p>
-      <w:pPr>
-        <w:ind w:right="-425"/>
-        <w:jc w:val="both"/>
-        <w:rPr>
-          <w:rFonts w:ascii="Arial" w:eastAsia="Calibri" w:hAnsi="Arial" w:cs="Arial"/>
-          <w:lang w:val="pt-BR"/>
-        </w:rPr>
-      </w:pPr>
-    </w:p>
-    <w:p>
-      <w:pPr>
-        <w:ind w:right="-425"/>
-        <w:jc w:val="both"/>
-        <w:rPr>
-          <w:rFonts w:ascii="Arial" w:eastAsia="Calibri" w:hAnsi="Arial" w:cs="Arial"/>
-          <w:b/>
-          <w:bCs/>
-          <w:lang w:val="pt-BR"/>
-        </w:rPr>
-      </w:pPr>
-      <w:r>
-        <w:rPr>
-          <w:rFonts w:ascii="Arial" w:eastAsia="Calibri" w:hAnsi="Arial" w:cs="Arial"/>
-          <w:b/>
-          <w:bCs/>
-          <w:lang w:val="pt-BR"/>
-        </w:rPr>
-        <w:t>{nombre_contratista}</w:t>
-      </w:r>
-    </w:p>
-    <w:p>
-      <w:pPr>
-        <w:ind w:right="-425"/>
-        <w:jc w:val="both"/>
-        <w:rPr>
-          <w:rFonts w:ascii="Arial" w:eastAsia="Calibri" w:hAnsi="Arial" w:cs="Arial"/>
-        </w:rPr>
-      </w:pPr>
-      <w:r>
-        <w:rPr>
-          <w:rFonts w:ascii="Arial" w:eastAsia="Calibri" w:hAnsi="Arial" w:cs="Arial"/>
-        </w:rPr>
-        <w:t xml:space="preserve">CONTRATISTA </w:t>
-      </w:r>
     </w:p>
     <w:p>
       <w:pPr>
@@ -5541,7 +5521,7 @@
                 <w:sz w:val="16"/>
                 <w:szCs w:val="16"/>
               </w:rPr>
-              <w:t xml:space="preserve">{proyecto}</w:t>
+              <w:t>{proyecto}</w:t>
             </w:r>
           </w:p>
         </w:tc>
@@ -5608,15 +5588,7 @@
                 <w:sz w:val="16"/>
                 <w:szCs w:val="16"/>
               </w:rPr>
-              <w:t>Revis</w:t>
-            </w:r>
-            <w:r>
-              <w:rPr>
-                <w:rFonts w:ascii="Arial" w:eastAsia="Calibri" w:hAnsi="Arial" w:cs="Arial"/>
-                <w:sz w:val="16"/>
-                <w:szCs w:val="16"/>
-              </w:rPr>
-              <w:t>ión jurídica</w:t>
+              <w:t>Revisión jurídica</w:t>
             </w:r>
           </w:p>
         </w:tc>
@@ -5646,7 +5618,7 @@
                 <w:sz w:val="16"/>
                 <w:szCs w:val="16"/>
               </w:rPr>
-              <w:t xml:space="preserve">{revision_juridica}</w:t>
+              <w:t>{revision_juridica}</w:t>
             </w:r>
           </w:p>
         </w:tc>
@@ -5713,15 +5685,7 @@
                 <w:sz w:val="16"/>
                 <w:szCs w:val="16"/>
               </w:rPr>
-              <w:t>Revis</w:t>
-            </w:r>
-            <w:r>
-              <w:rPr>
-                <w:rFonts w:ascii="Arial" w:eastAsia="Calibri" w:hAnsi="Arial" w:cs="Arial"/>
-                <w:sz w:val="16"/>
-                <w:szCs w:val="16"/>
-              </w:rPr>
-              <w:t>ión financiera</w:t>
+              <w:t>Revisión financiera</w:t>
             </w:r>
           </w:p>
         </w:tc>
@@ -5751,7 +5715,7 @@
                 <w:sz w:val="16"/>
                 <w:szCs w:val="16"/>
               </w:rPr>
-              <w:t xml:space="preserve">{revision_financiera}</w:t>
+              <w:t>{revision_financiera}</w:t>
             </w:r>
           </w:p>
         </w:tc>
@@ -5848,7 +5812,7 @@
                 <w:sz w:val="16"/>
                 <w:szCs w:val="16"/>
               </w:rPr>
-              <w:t xml:space="preserve">{aprobo}</w:t>
+              <w:t>{aprobo}</w:t>
             </w:r>
           </w:p>
         </w:tc>
@@ -7735,6 +7699,7 @@
   <w:style w:type="character" w:default="1" w:styleId="Fuentedeprrafopredeter">
     <w:name w:val="Default Paragraph Font"/>
     <w:uiPriority w:val="1"/>
+    <w:semiHidden/>
     <w:unhideWhenUsed/>
   </w:style>
   <w:style w:type="table" w:default="1" w:styleId="Tablanormal">
@@ -9871,6 +9836,26 @@
 </file>
 
 <file path=customXml/item1.xml><?xml version="1.0" encoding="utf-8"?>
+<p:properties xmlns:p="http://schemas.microsoft.com/office/2006/metadata/properties" xmlns:xsi="http://www.w3.org/2001/XMLSchema-instance" xmlns:pc="http://schemas.microsoft.com/office/infopath/2007/PartnerControls">
+  <documentManagement>
+    <TaxCatchAll xmlns="e817aef0-ee18-43df-8fb6-a8e286a8ac2b" xsi:nil="true"/>
+    <lcf76f155ced4ddcb4097134ff3c332f xmlns="0492cccb-6647-486e-854d-ea79f74918b5">
+      <Terms xmlns="http://schemas.microsoft.com/office/infopath/2007/PartnerControls"/>
+    </lcf76f155ced4ddcb4097134ff3c332f>
+  </documentManagement>
+</p:properties>
+</file>
+
+<file path=customXml/item2.xml><?xml version="1.0" encoding="utf-8"?>
+<?mso-contentType ?>
+<FormTemplates xmlns="http://schemas.microsoft.com/sharepoint/v3/contenttype/forms">
+  <Display>DocumentLibraryForm</Display>
+  <Edit>DocumentLibraryForm</Edit>
+  <New>DocumentLibraryForm</New>
+</FormTemplates>
+</file>
+
+<file path=customXml/item3.xml><?xml version="1.0" encoding="utf-8"?>
 <ct:contentTypeSchema xmlns:ct="http://schemas.microsoft.com/office/2006/metadata/contentType" xmlns:ma="http://schemas.microsoft.com/office/2006/metadata/properties/metaAttributes" ct:_="" ma:_="" ma:contentTypeName="Documento" ma:contentTypeID="0x01010009D7B0C64E77F64B88D164F77CD540CE" ma:contentTypeVersion="20" ma:contentTypeDescription="Crear nuevo documento." ma:contentTypeScope="" ma:versionID="d8051832bc294fed6848679ea26f6dc1">
   <xsd:schema xmlns:xsd="http://www.w3.org/2001/XMLSchema" xmlns:xs="http://www.w3.org/2001/XMLSchema" xmlns:p="http://schemas.microsoft.com/office/2006/metadata/properties" xmlns:ns2="e817aef0-ee18-43df-8fb6-a8e286a8ac2b" xmlns:ns3="0492cccb-6647-486e-854d-ea79f74918b5" targetNamespace="http://schemas.microsoft.com/office/2006/metadata/properties" ma:root="true" ma:fieldsID="75340f7370c80217d15047bf2bf01844" ns2:_="" ns3:_="">
     <xsd:import namespace="e817aef0-ee18-43df-8fb6-a8e286a8ac2b"/>
@@ -10131,27 +10116,26 @@
 </ct:contentTypeSchema>
 </file>
 
-<file path=customXml/item2.xml><?xml version="1.0" encoding="utf-8"?>
-<p:properties xmlns:p="http://schemas.microsoft.com/office/2006/metadata/properties" xmlns:xsi="http://www.w3.org/2001/XMLSchema-instance" xmlns:pc="http://schemas.microsoft.com/office/infopath/2007/PartnerControls">
-  <documentManagement>
-    <TaxCatchAll xmlns="e817aef0-ee18-43df-8fb6-a8e286a8ac2b" xsi:nil="true"/>
-    <lcf76f155ced4ddcb4097134ff3c332f xmlns="0492cccb-6647-486e-854d-ea79f74918b5">
-      <Terms xmlns="http://schemas.microsoft.com/office/infopath/2007/PartnerControls"/>
-    </lcf76f155ced4ddcb4097134ff3c332f>
-  </documentManagement>
-</p:properties>
+<file path=customXml/itemProps1.xml><?xml version="1.0" encoding="utf-8"?>
+<ds:datastoreItem xmlns:ds="http://schemas.openxmlformats.org/officeDocument/2006/customXml" ds:itemID="{450D9E2E-3E33-4BC6-ADC7-18A7ACCB1B1D}">
+  <ds:schemaRefs>
+    <ds:schemaRef ds:uri="http://schemas.microsoft.com/office/2006/metadata/properties"/>
+    <ds:schemaRef ds:uri="http://schemas.microsoft.com/office/infopath/2007/PartnerControls"/>
+    <ds:schemaRef ds:uri="e817aef0-ee18-43df-8fb6-a8e286a8ac2b"/>
+    <ds:schemaRef ds:uri="0492cccb-6647-486e-854d-ea79f74918b5"/>
+  </ds:schemaRefs>
+</ds:datastoreItem>
 </file>
 
-<file path=customXml/item3.xml><?xml version="1.0" encoding="utf-8"?>
-<?mso-contentType ?>
-<FormTemplates xmlns="http://schemas.microsoft.com/sharepoint/v3/contenttype/forms">
-  <Display>DocumentLibraryForm</Display>
-  <Edit>DocumentLibraryForm</Edit>
-  <New>DocumentLibraryForm</New>
-</FormTemplates>
+<file path=customXml/itemProps2.xml><?xml version="1.0" encoding="utf-8"?>
+<ds:datastoreItem xmlns:ds="http://schemas.openxmlformats.org/officeDocument/2006/customXml" ds:itemID="{14603871-D6DD-49BB-A886-8F65CE0FA38A}">
+  <ds:schemaRefs>
+    <ds:schemaRef ds:uri="http://schemas.microsoft.com/sharepoint/v3/contenttype/forms"/>
+  </ds:schemaRefs>
+</ds:datastoreItem>
 </file>
 
-<file path=customXml/itemProps1.xml><?xml version="1.0" encoding="utf-8"?>
+<file path=customXml/itemProps3.xml><?xml version="1.0" encoding="utf-8"?>
 <ds:datastoreItem xmlns:ds="http://schemas.openxmlformats.org/officeDocument/2006/customXml" ds:itemID="{F4E5EB90-5BAF-4863-892F-E288E4160F4D}">
   <ds:schemaRefs>
     <ds:schemaRef ds:uri="http://schemas.microsoft.com/office/2006/metadata/contentType"/>
@@ -10168,23 +10152,4 @@
     <ds:schemaRef ds:uri="http://schemas.microsoft.com/internal/obd"/>
   </ds:schemaRefs>
 </ds:datastoreItem>
-</file>
-
-<file path=customXml/itemProps2.xml><?xml version="1.0" encoding="utf-8"?>
-<ds:datastoreItem xmlns:ds="http://schemas.openxmlformats.org/officeDocument/2006/customXml" ds:itemID="{450D9E2E-3E33-4BC6-ADC7-18A7ACCB1B1D}">
-  <ds:schemaRefs>
-    <ds:schemaRef ds:uri="http://schemas.microsoft.com/office/2006/metadata/properties"/>
-    <ds:schemaRef ds:uri="http://schemas.microsoft.com/office/infopath/2007/PartnerControls"/>
-    <ds:schemaRef ds:uri="e817aef0-ee18-43df-8fb6-a8e286a8ac2b"/>
-    <ds:schemaRef ds:uri="0492cccb-6647-486e-854d-ea79f74918b5"/>
-  </ds:schemaRefs>
-</ds:datastoreItem>
-</file>
-
-<file path=customXml/itemProps3.xml><?xml version="1.0" encoding="utf-8"?>
-<ds:datastoreItem xmlns:ds="http://schemas.openxmlformats.org/officeDocument/2006/customXml" ds:itemID="{14603871-D6DD-49BB-A886-8F65CE0FA38A}">
-  <ds:schemaRefs>
-    <ds:schemaRef ds:uri="http://schemas.microsoft.com/sharepoint/v3/contenttype/forms"/>
-  </ds:schemaRefs>
-</ds:datastoreItem>
 </file>
</xml_diff>